<commit_message>
Rilascio DOCUMENTAZIONE MEV_2023-35 2024-09-02
</commit_message>
<xml_diff>
--- a/MEV/SCHEDA_021/Docs/SIUT-SIES-PR-1.6-20221125-Piano_di_Rilascio_021_RegInde_SIES.docx
+++ b/MEV/SCHEDA_021/Docs/SIUT-SIES-PR-1.6-20221125-Piano_di_Rilascio_021_RegInde_SIES.docx
@@ -29,6 +29,7 @@
                 <w:lang w:eastAsia="en-US"/>
               </w:rPr>
             </w:pPr>
+            <w:bookmarkStart w:id="0" w:name="_GoBack"/>
             <w:r>
               <w:rPr>
                 <w:rFonts w:asciiTheme="minorHAnsi" w:hAnsiTheme="minorHAnsi" w:cstheme="minorHAnsi"/>
@@ -182,10 +183,10 @@
         </w:tc>
       </w:tr>
     </w:tbl>
-    <w:bookmarkStart w:id="0" w:name="_Hlk14967838" w:displacedByCustomXml="next"/>
-    <w:bookmarkEnd w:id="0" w:displacedByCustomXml="next"/>
-    <w:bookmarkStart w:id="1" w:name="_Hlk10713674" w:displacedByCustomXml="next"/>
+    <w:bookmarkStart w:id="1" w:name="_Hlk14967838" w:displacedByCustomXml="next"/>
+    <w:bookmarkEnd w:id="1" w:displacedByCustomXml="next"/>
     <w:bookmarkStart w:id="2" w:name="_Hlk15306111" w:displacedByCustomXml="next"/>
+    <w:bookmarkStart w:id="3" w:name="_Hlk10713674" w:displacedByCustomXml="next"/>
     <w:sdt>
       <w:sdtPr>
         <w:rPr>
@@ -581,12 +582,12 @@
           <w:lang w:eastAsia="ja-JP"/>
         </w:rPr>
       </w:pPr>
-      <w:bookmarkStart w:id="3" w:name="_Toc520005733"/>
-      <w:bookmarkStart w:id="4" w:name="_Toc419800866"/>
-      <w:bookmarkStart w:id="5" w:name="_Toc12544354"/>
-      <w:bookmarkStart w:id="6" w:name="_Toc21599121"/>
+      <w:bookmarkStart w:id="4" w:name="_Toc520005733"/>
+      <w:bookmarkStart w:id="5" w:name="_Toc419800866"/>
+      <w:bookmarkStart w:id="6" w:name="_Toc12544354"/>
+      <w:bookmarkStart w:id="7" w:name="_Toc21599121"/>
+      <w:bookmarkEnd w:id="3"/>
       <w:bookmarkEnd w:id="2"/>
-      <w:bookmarkEnd w:id="1"/>
     </w:p>
     <w:p>
       <w:pPr>
@@ -621,6 +622,7 @@
           <w:lang w:eastAsia="ja-JP"/>
         </w:rPr>
       </w:pPr>
+      <w:proofErr w:type="gramStart"/>
       <w:r>
         <w:rPr>
           <w:rFonts w:asciiTheme="minorHAnsi" w:hAnsiTheme="minorHAnsi" w:cstheme="minorHAnsi"/>
@@ -658,9 +660,9 @@
           <w:szCs w:val="40"/>
           <w:lang w:eastAsia="ja-JP"/>
         </w:rPr>
-        <w:t>Sirfin-PA S.r.l. nell’ambito del contratto CIG 73479643B7 per lo “Sviluppo del Sistema Informativo Unitario Telematico, la manutenzione degli attuali sistemi dell’area Penale del Ministero della Giustizia e servizi correlati. Lotto 1”</w:t>
-      </w:r>
-      <w:bookmarkStart w:id="7" w:name="_Hlk24008890"/>
+        <w:t>Sirfin-PA S.r.l. nell’ambito del contratto CIG 73479643B7 per lo “Sviluppo del Sistema Informativo Unitario Telematico, la manutenzione degli attuali sistemi dell’area Penale del Ministero della Giustizia e servizi correlati</w:t>
+      </w:r>
+      <w:proofErr w:type="gramEnd"/>
       <w:r>
         <w:rPr>
           <w:rFonts w:asciiTheme="minorHAnsi" w:hAnsiTheme="minorHAnsi" w:cstheme="minorHAnsi"/>
@@ -672,9 +674,51 @@
           <w:szCs w:val="40"/>
           <w:lang w:eastAsia="ja-JP"/>
         </w:rPr>
+        <w:t xml:space="preserve">. Lotto </w:t>
+      </w:r>
+      <w:proofErr w:type="gramStart"/>
+      <w:r>
+        <w:rPr>
+          <w:rFonts w:asciiTheme="minorHAnsi" w:hAnsiTheme="minorHAnsi" w:cstheme="minorHAnsi"/>
+          <w:b/>
+          <w:i/>
+          <w:color w:val="1F497D" w:themeColor="text2"/>
+          <w:spacing w:val="24"/>
+          <w:sz w:val="32"/>
+          <w:szCs w:val="40"/>
+          <w:lang w:eastAsia="ja-JP"/>
+        </w:rPr>
+        <w:t>1</w:t>
+      </w:r>
+      <w:proofErr w:type="gramEnd"/>
+      <w:r>
+        <w:rPr>
+          <w:rFonts w:asciiTheme="minorHAnsi" w:hAnsiTheme="minorHAnsi" w:cstheme="minorHAnsi"/>
+          <w:b/>
+          <w:i/>
+          <w:color w:val="1F497D" w:themeColor="text2"/>
+          <w:spacing w:val="24"/>
+          <w:sz w:val="32"/>
+          <w:szCs w:val="40"/>
+          <w:lang w:eastAsia="ja-JP"/>
+        </w:rPr>
+        <w:t>”</w:t>
+      </w:r>
+      <w:bookmarkStart w:id="8" w:name="_Hlk24008890"/>
+      <w:r>
+        <w:rPr>
+          <w:rFonts w:asciiTheme="minorHAnsi" w:hAnsiTheme="minorHAnsi" w:cstheme="minorHAnsi"/>
+          <w:b/>
+          <w:i/>
+          <w:color w:val="1F497D" w:themeColor="text2"/>
+          <w:spacing w:val="24"/>
+          <w:sz w:val="32"/>
+          <w:szCs w:val="40"/>
+          <w:lang w:eastAsia="ja-JP"/>
+        </w:rPr>
         <w:t>.</w:t>
       </w:r>
-      <w:bookmarkEnd w:id="7"/>
+      <w:bookmarkEnd w:id="8"/>
     </w:p>
     <w:p>
       <w:pPr>
@@ -804,6 +848,7 @@
                 <w:sz w:val="20"/>
               </w:rPr>
             </w:pPr>
+            <w:proofErr w:type="gramStart"/>
             <w:r>
               <w:rPr>
                 <w:rFonts w:asciiTheme="minorHAnsi" w:hAnsiTheme="minorHAnsi" w:cstheme="minorHAnsi"/>
@@ -814,6 +859,7 @@
               </w:rPr>
               <w:t>Nominativo</w:t>
             </w:r>
+            <w:proofErr w:type="gramEnd"/>
           </w:p>
         </w:tc>
         <w:tc>
@@ -871,8 +917,18 @@
                 <w:bCs/>
                 <w:sz w:val="20"/>
               </w:rPr>
-              <w:t>Elaborato da</w:t>
-            </w:r>
+              <w:t xml:space="preserve">Elaborato </w:t>
+            </w:r>
+            <w:proofErr w:type="gramStart"/>
+            <w:r>
+              <w:rPr>
+                <w:rFonts w:asciiTheme="minorHAnsi" w:hAnsiTheme="minorHAnsi" w:cstheme="minorHAnsi"/>
+                <w:bCs/>
+                <w:sz w:val="20"/>
+              </w:rPr>
+              <w:t>da</w:t>
+            </w:r>
+            <w:proofErr w:type="gramEnd"/>
           </w:p>
         </w:tc>
         <w:tc>
@@ -949,15 +1005,25 @@
                 <w:sz w:val="20"/>
               </w:rPr>
             </w:pPr>
-            <w:bookmarkStart w:id="8" w:name="_Hlk10558887"/>
+            <w:bookmarkStart w:id="9" w:name="_Hlk10558887"/>
             <w:r>
               <w:rPr>
                 <w:rFonts w:asciiTheme="minorHAnsi" w:hAnsiTheme="minorHAnsi" w:cstheme="minorHAnsi"/>
                 <w:bCs/>
                 <w:sz w:val="20"/>
               </w:rPr>
-              <w:t>Verificato da</w:t>
-            </w:r>
+              <w:t xml:space="preserve">Verificato </w:t>
+            </w:r>
+            <w:proofErr w:type="gramStart"/>
+            <w:r>
+              <w:rPr>
+                <w:rFonts w:asciiTheme="minorHAnsi" w:hAnsiTheme="minorHAnsi" w:cstheme="minorHAnsi"/>
+                <w:bCs/>
+                <w:sz w:val="20"/>
+              </w:rPr>
+              <w:t>da</w:t>
+            </w:r>
+            <w:proofErr w:type="gramEnd"/>
           </w:p>
         </w:tc>
         <w:tc>
@@ -1003,6 +1069,7 @@
                 <w:sz w:val="20"/>
               </w:rPr>
             </w:pPr>
+            <w:proofErr w:type="gramStart"/>
             <w:r>
               <w:rPr>
                 <w:rFonts w:asciiTheme="minorHAnsi" w:hAnsiTheme="minorHAnsi" w:cstheme="minorHAnsi"/>
@@ -1010,10 +1077,11 @@
               </w:rPr>
               <w:t>Responsabile Manutenzione Sistemi attuali</w:t>
             </w:r>
+            <w:proofErr w:type="gramEnd"/>
           </w:p>
         </w:tc>
       </w:tr>
-      <w:bookmarkEnd w:id="8"/>
+      <w:bookmarkEnd w:id="9"/>
       <w:tr>
         <w:trPr>
           <w:jc w:val="center"/>
@@ -1039,8 +1107,18 @@
                 <w:bCs/>
                 <w:sz w:val="20"/>
               </w:rPr>
-              <w:t>Approvato da</w:t>
-            </w:r>
+              <w:t xml:space="preserve">Approvato </w:t>
+            </w:r>
+            <w:proofErr w:type="gramStart"/>
+            <w:r>
+              <w:rPr>
+                <w:rFonts w:asciiTheme="minorHAnsi" w:hAnsiTheme="minorHAnsi" w:cstheme="minorHAnsi"/>
+                <w:bCs/>
+                <w:sz w:val="20"/>
+              </w:rPr>
+              <w:t>da</w:t>
+            </w:r>
+            <w:proofErr w:type="gramEnd"/>
           </w:p>
         </w:tc>
         <w:tc>
@@ -1115,7 +1193,7 @@
                 <w:sz w:val="20"/>
               </w:rPr>
             </w:pPr>
-            <w:bookmarkStart w:id="9" w:name="_Hlk10558793"/>
+            <w:bookmarkStart w:id="10" w:name="_Hlk10558793"/>
             <w:r>
               <w:rPr>
                 <w:rFonts w:asciiTheme="minorHAnsi" w:hAnsiTheme="minorHAnsi" w:cstheme="minorHAnsi"/>
@@ -1226,8 +1304,8 @@
                 <w:sz w:val="20"/>
               </w:rPr>
             </w:pPr>
-            <w:bookmarkStart w:id="10" w:name="_Hlk10558777"/>
-            <w:bookmarkEnd w:id="9"/>
+            <w:bookmarkStart w:id="11" w:name="_Hlk10558777"/>
+            <w:bookmarkEnd w:id="10"/>
             <w:r>
               <w:rPr>
                 <w:rFonts w:asciiTheme="minorHAnsi" w:hAnsiTheme="minorHAnsi" w:cstheme="minorHAnsi"/>
@@ -1283,7 +1361,7 @@
           </w:p>
         </w:tc>
       </w:tr>
-      <w:bookmarkEnd w:id="10"/>
+      <w:bookmarkEnd w:id="11"/>
     </w:tbl>
     <w:p>
       <w:pPr>
@@ -1636,12 +1714,21 @@
                 <w:sz w:val="20"/>
               </w:rPr>
             </w:pPr>
-            <w:r>
-              <w:rPr>
-                <w:rFonts w:asciiTheme="minorHAnsi" w:hAnsiTheme="minorHAnsi" w:cstheme="minorHAnsi"/>
-                <w:sz w:val="20"/>
-              </w:rPr>
-              <w:t>Revisione Completa</w:t>
+            <w:proofErr w:type="gramStart"/>
+            <w:r>
+              <w:rPr>
+                <w:rFonts w:asciiTheme="minorHAnsi" w:hAnsiTheme="minorHAnsi" w:cstheme="minorHAnsi"/>
+                <w:sz w:val="20"/>
+              </w:rPr>
+              <w:t>Revisione</w:t>
+            </w:r>
+            <w:proofErr w:type="gramEnd"/>
+            <w:r>
+              <w:rPr>
+                <w:rFonts w:asciiTheme="minorHAnsi" w:hAnsiTheme="minorHAnsi" w:cstheme="minorHAnsi"/>
+                <w:sz w:val="20"/>
+              </w:rPr>
+              <w:t xml:space="preserve"> Completa</w:t>
             </w:r>
           </w:p>
         </w:tc>
@@ -1731,12 +1818,21 @@
                 <w:sz w:val="20"/>
               </w:rPr>
             </w:pPr>
-            <w:r>
-              <w:rPr>
-                <w:rFonts w:asciiTheme="minorHAnsi" w:hAnsiTheme="minorHAnsi" w:cstheme="minorHAnsi"/>
-                <w:sz w:val="20"/>
-              </w:rPr>
-              <w:t>Revisione Completa</w:t>
+            <w:proofErr w:type="gramStart"/>
+            <w:r>
+              <w:rPr>
+                <w:rFonts w:asciiTheme="minorHAnsi" w:hAnsiTheme="minorHAnsi" w:cstheme="minorHAnsi"/>
+                <w:sz w:val="20"/>
+              </w:rPr>
+              <w:t>Revisione</w:t>
+            </w:r>
+            <w:proofErr w:type="gramEnd"/>
+            <w:r>
+              <w:rPr>
+                <w:rFonts w:asciiTheme="minorHAnsi" w:hAnsiTheme="minorHAnsi" w:cstheme="minorHAnsi"/>
+                <w:sz w:val="20"/>
+              </w:rPr>
+              <w:t xml:space="preserve"> Completa</w:t>
             </w:r>
           </w:p>
         </w:tc>
@@ -1826,12 +1922,21 @@
                 <w:sz w:val="20"/>
               </w:rPr>
             </w:pPr>
-            <w:r>
-              <w:rPr>
-                <w:rFonts w:asciiTheme="minorHAnsi" w:hAnsiTheme="minorHAnsi" w:cstheme="minorHAnsi"/>
-                <w:sz w:val="20"/>
-              </w:rPr>
-              <w:t>Revisione Completa</w:t>
+            <w:proofErr w:type="gramStart"/>
+            <w:r>
+              <w:rPr>
+                <w:rFonts w:asciiTheme="minorHAnsi" w:hAnsiTheme="minorHAnsi" w:cstheme="minorHAnsi"/>
+                <w:sz w:val="20"/>
+              </w:rPr>
+              <w:t>Revisione</w:t>
+            </w:r>
+            <w:proofErr w:type="gramEnd"/>
+            <w:r>
+              <w:rPr>
+                <w:rFonts w:asciiTheme="minorHAnsi" w:hAnsiTheme="minorHAnsi" w:cstheme="minorHAnsi"/>
+                <w:sz w:val="20"/>
+              </w:rPr>
+              <w:t xml:space="preserve"> Completa</w:t>
             </w:r>
           </w:p>
         </w:tc>
@@ -1950,7 +2055,23 @@
                 <w:rFonts w:asciiTheme="minorHAnsi" w:hAnsiTheme="minorHAnsi" w:cstheme="minorHAnsi"/>
                 <w:sz w:val="20"/>
               </w:rPr>
-              <w:t xml:space="preserve">Modificati i riferimenti ai documenti di bonifica ed </w:t>
+              <w:t xml:space="preserve">Modificati i riferimenti ai documenti di bonifica </w:t>
+            </w:r>
+            <w:proofErr w:type="gramStart"/>
+            <w:r>
+              <w:rPr>
+                <w:rFonts w:asciiTheme="minorHAnsi" w:hAnsiTheme="minorHAnsi" w:cstheme="minorHAnsi"/>
+                <w:sz w:val="20"/>
+              </w:rPr>
+              <w:t>ed</w:t>
+            </w:r>
+            <w:proofErr w:type="gramEnd"/>
+            <w:r>
+              <w:rPr>
+                <w:rFonts w:asciiTheme="minorHAnsi" w:hAnsiTheme="minorHAnsi" w:cstheme="minorHAnsi"/>
+                <w:sz w:val="20"/>
+              </w:rPr>
+              <w:t xml:space="preserve"> </w:t>
             </w:r>
             <w:r>
               <w:rPr>
@@ -2125,7 +2246,23 @@
                 <w:rFonts w:asciiTheme="minorHAnsi" w:hAnsiTheme="minorHAnsi" w:cstheme="minorHAnsi"/>
                 <w:sz w:val="20"/>
               </w:rPr>
-              <w:t xml:space="preserve"> ed </w:t>
+              <w:t xml:space="preserve"> </w:t>
+            </w:r>
+            <w:proofErr w:type="gramStart"/>
+            <w:r>
+              <w:rPr>
+                <w:rFonts w:asciiTheme="minorHAnsi" w:hAnsiTheme="minorHAnsi" w:cstheme="minorHAnsi"/>
+                <w:sz w:val="20"/>
+              </w:rPr>
+              <w:t>ed</w:t>
+            </w:r>
+            <w:proofErr w:type="gramEnd"/>
+            <w:r>
+              <w:rPr>
+                <w:rFonts w:asciiTheme="minorHAnsi" w:hAnsiTheme="minorHAnsi" w:cstheme="minorHAnsi"/>
+                <w:sz w:val="20"/>
+              </w:rPr>
+              <w:t xml:space="preserve"> </w:t>
             </w:r>
             <w:r>
               <w:rPr>
@@ -2248,8 +2385,17 @@
                 <w:rFonts w:asciiTheme="minorHAnsi" w:hAnsiTheme="minorHAnsi" w:cstheme="minorHAnsi"/>
                 <w:sz w:val="20"/>
               </w:rPr>
-              <w:t>Modificati i riferimenti a pag. 10; corretto elenco pag. 12</w:t>
-            </w:r>
+              <w:t xml:space="preserve">Modificati i riferimenti a pag. 10; corretto elenco pag. </w:t>
+            </w:r>
+            <w:proofErr w:type="gramStart"/>
+            <w:r>
+              <w:rPr>
+                <w:rFonts w:asciiTheme="minorHAnsi" w:hAnsiTheme="minorHAnsi" w:cstheme="minorHAnsi"/>
+                <w:sz w:val="20"/>
+              </w:rPr>
+              <w:t>12</w:t>
+            </w:r>
+            <w:proofErr w:type="gramEnd"/>
           </w:p>
         </w:tc>
       </w:tr>
@@ -2329,6 +2475,7 @@
                 <w:sz w:val="20"/>
               </w:rPr>
             </w:pPr>
+            <w:proofErr w:type="gramStart"/>
             <w:r>
               <w:rPr>
                 <w:rFonts w:asciiTheme="minorHAnsi" w:hAnsiTheme="minorHAnsi" w:cstheme="minorHAnsi"/>
@@ -2339,6 +2486,7 @@
               </w:rPr>
               <w:t>Nominativo</w:t>
             </w:r>
+            <w:proofErr w:type="gramEnd"/>
           </w:p>
         </w:tc>
         <w:tc>
@@ -2852,6 +3000,7 @@
                 <w:sz w:val="20"/>
               </w:rPr>
             </w:pPr>
+            <w:proofErr w:type="gramStart"/>
             <w:r>
               <w:rPr>
                 <w:rFonts w:asciiTheme="minorHAnsi" w:hAnsiTheme="minorHAnsi" w:cstheme="minorHAnsi"/>
@@ -2859,6 +3008,7 @@
               </w:rPr>
               <w:t>Responsabile Manutenzione Sistemi attuali</w:t>
             </w:r>
+            <w:proofErr w:type="gramEnd"/>
           </w:p>
         </w:tc>
       </w:tr>
@@ -3584,7 +3734,7 @@
         </w:rPr>
         <w:fldChar w:fldCharType="separate"/>
       </w:r>
-      <w:hyperlink w:anchor="_Toc120098394" w:history="1">
+      <w:hyperlink w:anchor="_Toc159427115" w:history="1">
         <w:r>
           <w:rPr>
             <w:rStyle w:val="Collegamentoipertestuale"/>
@@ -3631,7 +3781,7 @@
             <w:noProof/>
             <w:webHidden/>
           </w:rPr>
-          <w:instrText xml:space="preserve"> PAGEREF _Toc120098394 \h </w:instrText>
+          <w:instrText xml:space="preserve"> PAGEREF _Toc159427115 \h </w:instrText>
         </w:r>
         <w:r>
           <w:rPr>
@@ -3676,7 +3826,7 @@
           <w:szCs w:val="22"/>
         </w:rPr>
       </w:pPr>
-      <w:hyperlink w:anchor="_Toc120098395" w:history="1">
+      <w:hyperlink w:anchor="_Toc159427116" w:history="1">
         <w:r>
           <w:rPr>
             <w:rStyle w:val="Collegamentoipertestuale"/>
@@ -3716,7 +3866,7 @@
           <w:rPr>
             <w:webHidden/>
           </w:rPr>
-          <w:instrText xml:space="preserve"> PAGEREF _Toc120098395 \h </w:instrText>
+          <w:instrText xml:space="preserve"> PAGEREF _Toc159427116 \h </w:instrText>
         </w:r>
         <w:r>
           <w:rPr>
@@ -3757,7 +3907,7 @@
           <w:szCs w:val="22"/>
         </w:rPr>
       </w:pPr>
-      <w:hyperlink w:anchor="_Toc120098396" w:history="1">
+      <w:hyperlink w:anchor="_Toc159427117" w:history="1">
         <w:r>
           <w:rPr>
             <w:rStyle w:val="Collegamentoipertestuale"/>
@@ -3797,7 +3947,7 @@
           <w:rPr>
             <w:webHidden/>
           </w:rPr>
-          <w:instrText xml:space="preserve"> PAGEREF _Toc120098396 \h </w:instrText>
+          <w:instrText xml:space="preserve"> PAGEREF _Toc159427117 \h </w:instrText>
         </w:r>
         <w:r>
           <w:rPr>
@@ -3838,7 +3988,7 @@
           <w:szCs w:val="22"/>
         </w:rPr>
       </w:pPr>
-      <w:hyperlink w:anchor="_Toc120098397" w:history="1">
+      <w:hyperlink w:anchor="_Toc159427118" w:history="1">
         <w:r>
           <w:rPr>
             <w:rStyle w:val="Collegamentoipertestuale"/>
@@ -3878,7 +4028,7 @@
           <w:rPr>
             <w:webHidden/>
           </w:rPr>
-          <w:instrText xml:space="preserve"> PAGEREF _Toc120098397 \h </w:instrText>
+          <w:instrText xml:space="preserve"> PAGEREF _Toc159427118 \h </w:instrText>
         </w:r>
         <w:r>
           <w:rPr>
@@ -3919,7 +4069,7 @@
           <w:szCs w:val="22"/>
         </w:rPr>
       </w:pPr>
-      <w:hyperlink w:anchor="_Toc120098398" w:history="1">
+      <w:hyperlink w:anchor="_Toc159427119" w:history="1">
         <w:r>
           <w:rPr>
             <w:rStyle w:val="Collegamentoipertestuale"/>
@@ -3959,7 +4109,7 @@
           <w:rPr>
             <w:webHidden/>
           </w:rPr>
-          <w:instrText xml:space="preserve"> PAGEREF _Toc120098398 \h </w:instrText>
+          <w:instrText xml:space="preserve"> PAGEREF _Toc159427119 \h </w:instrText>
         </w:r>
         <w:r>
           <w:rPr>
@@ -4000,7 +4150,7 @@
           <w:szCs w:val="22"/>
         </w:rPr>
       </w:pPr>
-      <w:hyperlink w:anchor="_Toc120098399" w:history="1">
+      <w:hyperlink w:anchor="_Toc159427120" w:history="1">
         <w:r>
           <w:rPr>
             <w:rStyle w:val="Collegamentoipertestuale"/>
@@ -4040,7 +4190,7 @@
           <w:rPr>
             <w:webHidden/>
           </w:rPr>
-          <w:instrText xml:space="preserve"> PAGEREF _Toc120098399 \h </w:instrText>
+          <w:instrText xml:space="preserve"> PAGEREF _Toc159427120 \h </w:instrText>
         </w:r>
         <w:r>
           <w:rPr>
@@ -4083,7 +4233,7 @@
           <w:szCs w:val="22"/>
         </w:rPr>
       </w:pPr>
-      <w:hyperlink w:anchor="_Toc120098400" w:history="1">
+      <w:hyperlink w:anchor="_Toc159427121" w:history="1">
         <w:r>
           <w:rPr>
             <w:rStyle w:val="Collegamentoipertestuale"/>
@@ -4130,7 +4280,7 @@
             <w:noProof/>
             <w:webHidden/>
           </w:rPr>
-          <w:instrText xml:space="preserve"> PAGEREF _Toc120098400 \h </w:instrText>
+          <w:instrText xml:space="preserve"> PAGEREF _Toc159427121 \h </w:instrText>
         </w:r>
         <w:r>
           <w:rPr>
@@ -4177,7 +4327,7 @@
           <w:szCs w:val="22"/>
         </w:rPr>
       </w:pPr>
-      <w:hyperlink w:anchor="_Toc120098401" w:history="1">
+      <w:hyperlink w:anchor="_Toc159427122" w:history="1">
         <w:r>
           <w:rPr>
             <w:rStyle w:val="Collegamentoipertestuale"/>
@@ -4224,7 +4374,7 @@
             <w:noProof/>
             <w:webHidden/>
           </w:rPr>
-          <w:instrText xml:space="preserve"> PAGEREF _Toc120098401 \h </w:instrText>
+          <w:instrText xml:space="preserve"> PAGEREF _Toc159427122 \h </w:instrText>
         </w:r>
         <w:r>
           <w:rPr>
@@ -4271,7 +4421,7 @@
           <w:szCs w:val="22"/>
         </w:rPr>
       </w:pPr>
-      <w:hyperlink w:anchor="_Toc120098402" w:history="1">
+      <w:hyperlink w:anchor="_Toc159427123" w:history="1">
         <w:r>
           <w:rPr>
             <w:rStyle w:val="Collegamentoipertestuale"/>
@@ -4318,7 +4468,7 @@
             <w:noProof/>
             <w:webHidden/>
           </w:rPr>
-          <w:instrText xml:space="preserve"> PAGEREF _Toc120098402 \h </w:instrText>
+          <w:instrText xml:space="preserve"> PAGEREF _Toc159427123 \h </w:instrText>
         </w:r>
         <w:r>
           <w:rPr>
@@ -4363,7 +4513,7 @@
           <w:szCs w:val="22"/>
         </w:rPr>
       </w:pPr>
-      <w:hyperlink w:anchor="_Toc120098403" w:history="1">
+      <w:hyperlink w:anchor="_Toc159427124" w:history="1">
         <w:r>
           <w:rPr>
             <w:rStyle w:val="Collegamentoipertestuale"/>
@@ -4403,7 +4553,7 @@
           <w:rPr>
             <w:webHidden/>
           </w:rPr>
-          <w:instrText xml:space="preserve"> PAGEREF _Toc120098403 \h </w:instrText>
+          <w:instrText xml:space="preserve"> PAGEREF _Toc159427124 \h </w:instrText>
         </w:r>
         <w:r>
           <w:rPr>
@@ -4444,7 +4594,7 @@
           <w:szCs w:val="22"/>
         </w:rPr>
       </w:pPr>
-      <w:hyperlink w:anchor="_Toc120098404" w:history="1">
+      <w:hyperlink w:anchor="_Toc159427125" w:history="1">
         <w:r>
           <w:rPr>
             <w:rStyle w:val="Collegamentoipertestuale"/>
@@ -4484,7 +4634,7 @@
           <w:rPr>
             <w:webHidden/>
           </w:rPr>
-          <w:instrText xml:space="preserve"> PAGEREF _Toc120098404 \h </w:instrText>
+          <w:instrText xml:space="preserve"> PAGEREF _Toc159427125 \h </w:instrText>
         </w:r>
         <w:r>
           <w:rPr>
@@ -4527,7 +4677,7 @@
           <w:szCs w:val="22"/>
         </w:rPr>
       </w:pPr>
-      <w:hyperlink w:anchor="_Toc120098405" w:history="1">
+      <w:hyperlink w:anchor="_Toc159427126" w:history="1">
         <w:r>
           <w:rPr>
             <w:rStyle w:val="Collegamentoipertestuale"/>
@@ -4574,7 +4724,7 @@
             <w:noProof/>
             <w:webHidden/>
           </w:rPr>
-          <w:instrText xml:space="preserve"> PAGEREF _Toc120098405 \h </w:instrText>
+          <w:instrText xml:space="preserve"> PAGEREF _Toc159427126 \h </w:instrText>
         </w:r>
         <w:r>
           <w:rPr>
@@ -4621,7 +4771,7 @@
           <w:szCs w:val="22"/>
         </w:rPr>
       </w:pPr>
-      <w:hyperlink w:anchor="_Toc120098406" w:history="1">
+      <w:hyperlink w:anchor="_Toc159427127" w:history="1">
         <w:r>
           <w:rPr>
             <w:rStyle w:val="Collegamentoipertestuale"/>
@@ -4668,7 +4818,7 @@
             <w:noProof/>
             <w:webHidden/>
           </w:rPr>
-          <w:instrText xml:space="preserve"> PAGEREF _Toc120098406 \h </w:instrText>
+          <w:instrText xml:space="preserve"> PAGEREF _Toc159427127 \h </w:instrText>
         </w:r>
         <w:r>
           <w:rPr>
@@ -4713,7 +4863,7 @@
           <w:szCs w:val="22"/>
         </w:rPr>
       </w:pPr>
-      <w:hyperlink w:anchor="_Toc120098407" w:history="1">
+      <w:hyperlink w:anchor="_Toc159427128" w:history="1">
         <w:r>
           <w:rPr>
             <w:rStyle w:val="Collegamentoipertestuale"/>
@@ -4753,7 +4903,7 @@
           <w:rPr>
             <w:webHidden/>
           </w:rPr>
-          <w:instrText xml:space="preserve"> PAGEREF _Toc120098407 \h </w:instrText>
+          <w:instrText xml:space="preserve"> PAGEREF _Toc159427128 \h </w:instrText>
         </w:r>
         <w:r>
           <w:rPr>
@@ -4794,7 +4944,7 @@
           <w:szCs w:val="22"/>
         </w:rPr>
       </w:pPr>
-      <w:hyperlink w:anchor="_Toc120098408" w:history="1">
+      <w:hyperlink w:anchor="_Toc159427129" w:history="1">
         <w:r>
           <w:rPr>
             <w:rStyle w:val="Collegamentoipertestuale"/>
@@ -4834,7 +4984,7 @@
           <w:rPr>
             <w:webHidden/>
           </w:rPr>
-          <w:instrText xml:space="preserve"> PAGEREF _Toc120098408 \h </w:instrText>
+          <w:instrText xml:space="preserve"> PAGEREF _Toc159427129 \h </w:instrText>
         </w:r>
         <w:r>
           <w:rPr>
@@ -4875,7 +5025,7 @@
           <w:szCs w:val="22"/>
         </w:rPr>
       </w:pPr>
-      <w:hyperlink w:anchor="_Toc120098409" w:history="1">
+      <w:hyperlink w:anchor="_Toc159427130" w:history="1">
         <w:r>
           <w:rPr>
             <w:rStyle w:val="Collegamentoipertestuale"/>
@@ -4915,7 +5065,7 @@
           <w:rPr>
             <w:webHidden/>
           </w:rPr>
-          <w:instrText xml:space="preserve"> PAGEREF _Toc120098409 \h </w:instrText>
+          <w:instrText xml:space="preserve"> PAGEREF _Toc159427130 \h </w:instrText>
         </w:r>
         <w:r>
           <w:rPr>
@@ -4956,7 +5106,7 @@
           <w:szCs w:val="22"/>
         </w:rPr>
       </w:pPr>
-      <w:hyperlink w:anchor="_Toc120098410" w:history="1">
+      <w:hyperlink w:anchor="_Toc159427131" w:history="1">
         <w:r>
           <w:rPr>
             <w:rStyle w:val="Collegamentoipertestuale"/>
@@ -4996,7 +5146,7 @@
           <w:rPr>
             <w:webHidden/>
           </w:rPr>
-          <w:instrText xml:space="preserve"> PAGEREF _Toc120098410 \h </w:instrText>
+          <w:instrText xml:space="preserve"> PAGEREF _Toc159427131 \h </w:instrText>
         </w:r>
         <w:r>
           <w:rPr>
@@ -5037,7 +5187,7 @@
           <w:szCs w:val="22"/>
         </w:rPr>
       </w:pPr>
-      <w:hyperlink w:anchor="_Toc120098411" w:history="1">
+      <w:hyperlink w:anchor="_Toc159427132" w:history="1">
         <w:r>
           <w:rPr>
             <w:rStyle w:val="Collegamentoipertestuale"/>
@@ -5077,7 +5227,7 @@
           <w:rPr>
             <w:webHidden/>
           </w:rPr>
-          <w:instrText xml:space="preserve"> PAGEREF _Toc120098411 \h </w:instrText>
+          <w:instrText xml:space="preserve"> PAGEREF _Toc159427132 \h </w:instrText>
         </w:r>
         <w:r>
           <w:rPr>
@@ -5118,7 +5268,7 @@
           <w:szCs w:val="22"/>
         </w:rPr>
       </w:pPr>
-      <w:hyperlink w:anchor="_Toc120098412" w:history="1">
+      <w:hyperlink w:anchor="_Toc159427133" w:history="1">
         <w:r>
           <w:rPr>
             <w:rStyle w:val="Collegamentoipertestuale"/>
@@ -5158,7 +5308,7 @@
           <w:rPr>
             <w:webHidden/>
           </w:rPr>
-          <w:instrText xml:space="preserve"> PAGEREF _Toc120098412 \h </w:instrText>
+          <w:instrText xml:space="preserve"> PAGEREF _Toc159427133 \h </w:instrText>
         </w:r>
         <w:r>
           <w:rPr>
@@ -5199,7 +5349,7 @@
           <w:szCs w:val="22"/>
         </w:rPr>
       </w:pPr>
-      <w:hyperlink w:anchor="_Toc120098413" w:history="1">
+      <w:hyperlink w:anchor="_Toc159427134" w:history="1">
         <w:r>
           <w:rPr>
             <w:rStyle w:val="Collegamentoipertestuale"/>
@@ -5239,7 +5389,7 @@
           <w:rPr>
             <w:webHidden/>
           </w:rPr>
-          <w:instrText xml:space="preserve"> PAGEREF _Toc120098413 \h </w:instrText>
+          <w:instrText xml:space="preserve"> PAGEREF _Toc159427134 \h </w:instrText>
         </w:r>
         <w:r>
           <w:rPr>
@@ -5280,7 +5430,7 @@
           <w:szCs w:val="22"/>
         </w:rPr>
       </w:pPr>
-      <w:hyperlink w:anchor="_Toc120098414" w:history="1">
+      <w:hyperlink w:anchor="_Toc159427135" w:history="1">
         <w:r>
           <w:rPr>
             <w:rStyle w:val="Collegamentoipertestuale"/>
@@ -5320,7 +5470,7 @@
           <w:rPr>
             <w:webHidden/>
           </w:rPr>
-          <w:instrText xml:space="preserve"> PAGEREF _Toc120098414 \h </w:instrText>
+          <w:instrText xml:space="preserve"> PAGEREF _Toc159427135 \h </w:instrText>
         </w:r>
         <w:r>
           <w:rPr>
@@ -5361,7 +5511,7 @@
           <w:szCs w:val="22"/>
         </w:rPr>
       </w:pPr>
-      <w:hyperlink w:anchor="_Toc120098415" w:history="1">
+      <w:hyperlink w:anchor="_Toc159427136" w:history="1">
         <w:r>
           <w:rPr>
             <w:rStyle w:val="Collegamentoipertestuale"/>
@@ -5401,7 +5551,7 @@
           <w:rPr>
             <w:webHidden/>
           </w:rPr>
-          <w:instrText xml:space="preserve"> PAGEREF _Toc120098415 \h </w:instrText>
+          <w:instrText xml:space="preserve"> PAGEREF _Toc159427136 \h </w:instrText>
         </w:r>
         <w:r>
           <w:rPr>
@@ -5442,7 +5592,7 @@
           <w:szCs w:val="22"/>
         </w:rPr>
       </w:pPr>
-      <w:hyperlink w:anchor="_Toc120098416" w:history="1">
+      <w:hyperlink w:anchor="_Toc159427137" w:history="1">
         <w:r>
           <w:rPr>
             <w:rStyle w:val="Collegamentoipertestuale"/>
@@ -5482,7 +5632,7 @@
           <w:rPr>
             <w:webHidden/>
           </w:rPr>
-          <w:instrText xml:space="preserve"> PAGEREF _Toc120098416 \h </w:instrText>
+          <w:instrText xml:space="preserve"> PAGEREF _Toc159427137 \h </w:instrText>
         </w:r>
         <w:r>
           <w:rPr>
@@ -5539,7 +5689,7 @@
           <w:szCs w:val="24"/>
         </w:rPr>
       </w:pPr>
-      <w:bookmarkStart w:id="11" w:name="_Hlk10713035"/>
+      <w:bookmarkStart w:id="12" w:name="_Hlk10713035"/>
       <w:r>
         <w:rPr>
           <w:rFonts w:asciiTheme="minorHAnsi" w:hAnsiTheme="minorHAnsi" w:cstheme="minorHAnsi"/>
@@ -5570,10 +5720,10 @@
           <w:szCs w:val="24"/>
         </w:rPr>
       </w:pPr>
-      <w:bookmarkStart w:id="12" w:name="_Toc330316535"/>
-      <w:bookmarkStart w:id="13" w:name="_Toc8205263"/>
-      <w:bookmarkStart w:id="14" w:name="_Toc120098394"/>
-      <w:bookmarkEnd w:id="11"/>
+      <w:bookmarkStart w:id="13" w:name="_Toc330316535"/>
+      <w:bookmarkStart w:id="14" w:name="_Toc8205263"/>
+      <w:bookmarkStart w:id="15" w:name="_Toc159427115"/>
+      <w:bookmarkEnd w:id="12"/>
       <w:r>
         <w:rPr>
           <w:rFonts w:asciiTheme="minorHAnsi" w:hAnsiTheme="minorHAnsi" w:cstheme="minorHAnsi"/>
@@ -5584,9 +5734,9 @@
         <w:lastRenderedPageBreak/>
         <w:t>Introduzione</w:t>
       </w:r>
-      <w:bookmarkEnd w:id="12"/>
       <w:bookmarkEnd w:id="13"/>
       <w:bookmarkEnd w:id="14"/>
+      <w:bookmarkEnd w:id="15"/>
     </w:p>
     <w:p>
       <w:pPr>
@@ -5608,9 +5758,9 @@
           <w:szCs w:val="24"/>
         </w:rPr>
       </w:pPr>
-      <w:bookmarkStart w:id="15" w:name="_Toc330316536"/>
-      <w:bookmarkStart w:id="16" w:name="_Toc8205264"/>
-      <w:bookmarkStart w:id="17" w:name="_Toc120098395"/>
+      <w:bookmarkStart w:id="16" w:name="_Toc330316536"/>
+      <w:bookmarkStart w:id="17" w:name="_Toc8205264"/>
+      <w:bookmarkStart w:id="18" w:name="_Toc159427116"/>
       <w:r>
         <w:rPr>
           <w:rFonts w:asciiTheme="minorHAnsi" w:hAnsiTheme="minorHAnsi" w:cstheme="minorHAnsi"/>
@@ -5619,9 +5769,9 @@
         </w:rPr>
         <w:t>Scopo del documento</w:t>
       </w:r>
-      <w:bookmarkEnd w:id="15"/>
       <w:bookmarkEnd w:id="16"/>
       <w:bookmarkEnd w:id="17"/>
+      <w:bookmarkEnd w:id="18"/>
     </w:p>
     <w:p>
       <w:pPr>
@@ -5685,7 +5835,25 @@
           <w:sz w:val="22"/>
           <w:szCs w:val="22"/>
         </w:rPr>
-        <w:t>orveglianza per la realizzazione di quanto dettagliato nella scheda di intervento di riferime</w:t>
+        <w:t xml:space="preserve">orveglianza per la realizzazione di quanto dettagliato nella scheda </w:t>
+      </w:r>
+      <w:proofErr w:type="gramStart"/>
+      <w:r>
+        <w:rPr>
+          <w:rFonts w:asciiTheme="minorHAnsi" w:hAnsiTheme="minorHAnsi" w:cstheme="minorHAnsi"/>
+          <w:sz w:val="22"/>
+          <w:szCs w:val="22"/>
+        </w:rPr>
+        <w:t xml:space="preserve">di </w:t>
+      </w:r>
+      <w:proofErr w:type="gramEnd"/>
+      <w:r>
+        <w:rPr>
+          <w:rFonts w:asciiTheme="minorHAnsi" w:hAnsiTheme="minorHAnsi" w:cstheme="minorHAnsi"/>
+          <w:sz w:val="22"/>
+          <w:szCs w:val="22"/>
+        </w:rPr>
+        <w:t>intervento di riferime</w:t>
       </w:r>
       <w:r>
         <w:rPr>
@@ -5754,7 +5922,7 @@
           <w:sz w:val="22"/>
           <w:szCs w:val="22"/>
         </w:rPr>
-        <w:t>12.4.24.0-MEV_2019_021</w:t>
+        <w:t>12.5.6.0-MEV_2019_021</w:t>
       </w:r>
       <w:r>
         <w:rPr>
@@ -5805,7 +5973,25 @@
           <w:sz w:val="22"/>
           <w:szCs w:val="22"/>
         </w:rPr>
-        <w:t>Riporta inoltre le modalità di installazione degli aggiornamenti in ambiente di esercizio.</w:t>
+        <w:t xml:space="preserve">Riporta inoltre le </w:t>
+      </w:r>
+      <w:proofErr w:type="gramStart"/>
+      <w:r>
+        <w:rPr>
+          <w:rFonts w:asciiTheme="minorHAnsi" w:hAnsiTheme="minorHAnsi" w:cstheme="minorHAnsi"/>
+          <w:sz w:val="22"/>
+          <w:szCs w:val="22"/>
+        </w:rPr>
+        <w:t>modalità</w:t>
+      </w:r>
+      <w:proofErr w:type="gramEnd"/>
+      <w:r>
+        <w:rPr>
+          <w:rFonts w:asciiTheme="minorHAnsi" w:hAnsiTheme="minorHAnsi" w:cstheme="minorHAnsi"/>
+          <w:sz w:val="22"/>
+          <w:szCs w:val="22"/>
+        </w:rPr>
+        <w:t xml:space="preserve"> di installazione degli aggiornamenti in ambiente di esercizio.</w:t>
       </w:r>
     </w:p>
     <w:p>
@@ -5828,8 +6014,8 @@
           <w:szCs w:val="24"/>
         </w:rPr>
       </w:pPr>
-      <w:bookmarkStart w:id="18" w:name="_Toc16251723"/>
-      <w:bookmarkStart w:id="19" w:name="_Toc120098396"/>
+      <w:bookmarkStart w:id="19" w:name="_Toc16251723"/>
+      <w:bookmarkStart w:id="20" w:name="_Toc159427117"/>
       <w:r>
         <w:rPr>
           <w:rFonts w:asciiTheme="minorHAnsi" w:hAnsiTheme="minorHAnsi" w:cstheme="minorHAnsi"/>
@@ -5838,8 +6024,8 @@
         </w:rPr>
         <w:t>Riferimenti</w:t>
       </w:r>
-      <w:bookmarkEnd w:id="18"/>
       <w:bookmarkEnd w:id="19"/>
+      <w:bookmarkEnd w:id="20"/>
     </w:p>
     <w:tbl>
       <w:tblPr>
@@ -6000,13 +6186,23 @@
                 <w:lang w:eastAsia="ar-SA"/>
               </w:rPr>
             </w:pPr>
+            <w:proofErr w:type="gramStart"/>
             <w:r>
               <w:rPr>
                 <w:rFonts w:asciiTheme="minorHAnsi" w:hAnsiTheme="minorHAnsi" w:cstheme="minorHAnsi"/>
                 <w:sz w:val="20"/>
                 <w:lang w:eastAsia="ar-SA"/>
               </w:rPr>
-              <w:t>SIUT-SIE-SI-2.</w:t>
+              <w:t>SIUT-SIE-SI-2</w:t>
+            </w:r>
+            <w:proofErr w:type="gramEnd"/>
+            <w:r>
+              <w:rPr>
+                <w:rFonts w:asciiTheme="minorHAnsi" w:hAnsiTheme="minorHAnsi" w:cstheme="minorHAnsi"/>
+                <w:sz w:val="20"/>
+                <w:lang w:eastAsia="ar-SA"/>
+              </w:rPr>
+              <w:t>.</w:t>
             </w:r>
             <w:r>
               <w:rPr>
@@ -6260,7 +6456,7 @@
           <w:szCs w:val="24"/>
         </w:rPr>
       </w:pPr>
-      <w:bookmarkStart w:id="20" w:name="_Toc120098397"/>
+      <w:bookmarkStart w:id="21" w:name="_Toc159427118"/>
       <w:r>
         <w:rPr>
           <w:rFonts w:asciiTheme="minorHAnsi" w:hAnsiTheme="minorHAnsi" w:cstheme="minorHAnsi"/>
@@ -6269,7 +6465,7 @@
         </w:rPr>
         <w:t>Glossario</w:t>
       </w:r>
-      <w:bookmarkEnd w:id="20"/>
+      <w:bookmarkEnd w:id="21"/>
     </w:p>
     <w:p>
       <w:pPr>
@@ -6290,7 +6486,7 @@
           <w:szCs w:val="24"/>
         </w:rPr>
       </w:pPr>
-      <w:bookmarkStart w:id="21" w:name="_Toc120098398"/>
+      <w:bookmarkStart w:id="22" w:name="_Toc159427119"/>
       <w:r>
         <w:rPr>
           <w:rFonts w:asciiTheme="minorHAnsi" w:hAnsiTheme="minorHAnsi" w:cstheme="minorHAnsi"/>
@@ -6299,7 +6495,7 @@
         </w:rPr>
         <w:t>Definizioni</w:t>
       </w:r>
-      <w:bookmarkEnd w:id="21"/>
+      <w:bookmarkEnd w:id="22"/>
     </w:p>
     <w:tbl>
       <w:tblPr>
@@ -6438,7 +6634,7 @@
           <w:szCs w:val="24"/>
         </w:rPr>
       </w:pPr>
-      <w:bookmarkStart w:id="22" w:name="_Toc120098399"/>
+      <w:bookmarkStart w:id="23" w:name="_Toc159427120"/>
       <w:r>
         <w:rPr>
           <w:rFonts w:asciiTheme="minorHAnsi" w:hAnsiTheme="minorHAnsi" w:cstheme="minorHAnsi"/>
@@ -6447,7 +6643,7 @@
         </w:rPr>
         <w:t>Acronimi e abbreviazioni</w:t>
       </w:r>
-      <w:bookmarkEnd w:id="22"/>
+      <w:bookmarkEnd w:id="23"/>
     </w:p>
     <w:tbl>
       <w:tblPr>
@@ -7083,8 +7279,17 @@
                 <w:rFonts w:cstheme="minorHAnsi"/>
                 <w:sz w:val="20"/>
               </w:rPr>
-              <w:t>Manutenzione EVolutiva</w:t>
-            </w:r>
+              <w:t xml:space="preserve">Manutenzione </w:t>
+            </w:r>
+            <w:proofErr w:type="gramStart"/>
+            <w:r>
+              <w:rPr>
+                <w:rFonts w:cstheme="minorHAnsi"/>
+                <w:sz w:val="20"/>
+              </w:rPr>
+              <w:t>EVolutiva</w:t>
+            </w:r>
+            <w:proofErr w:type="gramEnd"/>
           </w:p>
         </w:tc>
       </w:tr>
@@ -7527,7 +7732,7 @@
           <w:szCs w:val="24"/>
         </w:rPr>
       </w:pPr>
-      <w:bookmarkStart w:id="23" w:name="_Toc120098400"/>
+      <w:bookmarkStart w:id="24" w:name="_Toc159427121"/>
       <w:r>
         <w:rPr>
           <w:rFonts w:asciiTheme="minorHAnsi" w:hAnsiTheme="minorHAnsi" w:cstheme="minorHAnsi"/>
@@ -7538,11 +7743,11 @@
         <w:lastRenderedPageBreak/>
         <w:t>Generalità</w:t>
       </w:r>
-      <w:bookmarkEnd w:id="3"/>
       <w:bookmarkEnd w:id="4"/>
       <w:bookmarkEnd w:id="5"/>
       <w:bookmarkEnd w:id="6"/>
-      <w:bookmarkEnd w:id="23"/>
+      <w:bookmarkEnd w:id="7"/>
+      <w:bookmarkEnd w:id="24"/>
     </w:p>
     <w:p>
       <w:pPr>
@@ -7729,7 +7934,7 @@
           <w:sz w:val="22"/>
           <w:szCs w:val="22"/>
         </w:rPr>
-        <w:t>12.4.24.0</w:t>
+        <w:t>12.5.6.0</w:t>
       </w:r>
       <w:r>
         <w:rPr>
@@ -7767,13 +7972,23 @@
           <w:szCs w:val="22"/>
         </w:rPr>
       </w:pPr>
-      <w:r>
-        <w:rPr>
-          <w:rFonts w:asciiTheme="minorHAnsi" w:hAnsiTheme="minorHAnsi" w:cstheme="minorHAnsi"/>
-          <w:sz w:val="22"/>
-          <w:szCs w:val="22"/>
-        </w:rPr>
-        <w:t>Vengono elencati i passi da effettuare per la corretta installazione di tutte le componenti in ambiente di esercizio.</w:t>
+      <w:proofErr w:type="gramStart"/>
+      <w:r>
+        <w:rPr>
+          <w:rFonts w:asciiTheme="minorHAnsi" w:hAnsiTheme="minorHAnsi" w:cstheme="minorHAnsi"/>
+          <w:sz w:val="22"/>
+          <w:szCs w:val="22"/>
+        </w:rPr>
+        <w:t>Vengono</w:t>
+      </w:r>
+      <w:proofErr w:type="gramEnd"/>
+      <w:r>
+        <w:rPr>
+          <w:rFonts w:asciiTheme="minorHAnsi" w:hAnsiTheme="minorHAnsi" w:cstheme="minorHAnsi"/>
+          <w:sz w:val="22"/>
+          <w:szCs w:val="22"/>
+        </w:rPr>
+        <w:t xml:space="preserve"> elencati i passi da effettuare per la corretta installazione di tutte le componenti in ambiente di esercizio.</w:t>
       </w:r>
     </w:p>
     <w:p>
@@ -7795,11 +8010,11 @@
           <w:szCs w:val="24"/>
         </w:rPr>
       </w:pPr>
-      <w:bookmarkStart w:id="24" w:name="_Toc72576995"/>
-      <w:bookmarkStart w:id="25" w:name="_Toc419800867"/>
-      <w:bookmarkStart w:id="26" w:name="_Toc12544355"/>
-      <w:bookmarkStart w:id="27" w:name="_Toc21599122"/>
-      <w:bookmarkStart w:id="28" w:name="_Toc120098401"/>
+      <w:bookmarkStart w:id="25" w:name="_Toc72576995"/>
+      <w:bookmarkStart w:id="26" w:name="_Toc419800867"/>
+      <w:bookmarkStart w:id="27" w:name="_Toc12544355"/>
+      <w:bookmarkStart w:id="28" w:name="_Toc21599122"/>
+      <w:bookmarkStart w:id="29" w:name="_Toc159427122"/>
       <w:r>
         <w:rPr>
           <w:rFonts w:asciiTheme="minorHAnsi" w:hAnsiTheme="minorHAnsi" w:cstheme="minorHAnsi"/>
@@ -7810,11 +8025,11 @@
         <w:lastRenderedPageBreak/>
         <w:t>Identificazione degli elementi rilasciati</w:t>
       </w:r>
-      <w:bookmarkEnd w:id="24"/>
       <w:bookmarkEnd w:id="25"/>
       <w:bookmarkEnd w:id="26"/>
       <w:bookmarkEnd w:id="27"/>
       <w:bookmarkEnd w:id="28"/>
+      <w:bookmarkEnd w:id="29"/>
     </w:p>
     <w:tbl>
       <w:tblPr>
@@ -8025,11 +8240,21 @@
             <w:pPr>
               <w:pStyle w:val="NormTab"/>
             </w:pPr>
-            <w:fldSimple w:instr=" DOCPROPERTY  Versione  \* MERGEFORMAT ">
-              <w:r>
-                <w:t>1.6</w:t>
-              </w:r>
-            </w:fldSimple>
+            <w:r>
+              <w:fldChar w:fldCharType="begin"/>
+            </w:r>
+            <w:r>
+              <w:instrText xml:space="preserve"> DOCPROPERTY  Versione  \* MERGEFORMAT </w:instrText>
+            </w:r>
+            <w:r>
+              <w:fldChar w:fldCharType="separate"/>
+            </w:r>
+            <w:r>
+              <w:t>1.6</w:t>
+            </w:r>
+            <w:r>
+              <w:fldChar w:fldCharType="end"/>
+            </w:r>
           </w:p>
         </w:tc>
         <w:tc>
@@ -8040,11 +8265,21 @@
             <w:pPr>
               <w:pStyle w:val="NormTab"/>
             </w:pPr>
-            <w:fldSimple w:instr=" DOCPROPERTY  &quot;Data Rilascio&quot;  \* MERGEFORMAT ">
-              <w:r>
-                <w:t>25/11/2022</w:t>
-              </w:r>
-            </w:fldSimple>
+            <w:r>
+              <w:fldChar w:fldCharType="begin"/>
+            </w:r>
+            <w:r>
+              <w:instrText xml:space="preserve"> DOCPROPERTY  "Data Rilascio"  \* MERGEFORMAT </w:instrText>
+            </w:r>
+            <w:r>
+              <w:fldChar w:fldCharType="separate"/>
+            </w:r>
+            <w:r>
+              <w:t>25/11/2022</w:t>
+            </w:r>
+            <w:r>
+              <w:fldChar w:fldCharType="end"/>
+            </w:r>
           </w:p>
         </w:tc>
       </w:tr>
@@ -8105,11 +8340,11 @@
           <w:szCs w:val="24"/>
         </w:rPr>
       </w:pPr>
-      <w:bookmarkStart w:id="29" w:name="_Toc72576996"/>
-      <w:bookmarkStart w:id="30" w:name="_Toc419800868"/>
-      <w:bookmarkStart w:id="31" w:name="_Toc12544356"/>
-      <w:bookmarkStart w:id="32" w:name="_Toc21599123"/>
-      <w:bookmarkStart w:id="33" w:name="_Toc120098402"/>
+      <w:bookmarkStart w:id="30" w:name="_Toc72576996"/>
+      <w:bookmarkStart w:id="31" w:name="_Toc419800868"/>
+      <w:bookmarkStart w:id="32" w:name="_Toc12544356"/>
+      <w:bookmarkStart w:id="33" w:name="_Toc21599123"/>
+      <w:bookmarkStart w:id="34" w:name="_Toc159427123"/>
       <w:r>
         <w:rPr>
           <w:rFonts w:asciiTheme="minorHAnsi" w:hAnsiTheme="minorHAnsi" w:cstheme="minorHAnsi"/>
@@ -8120,11 +8355,11 @@
         <w:lastRenderedPageBreak/>
         <w:t>Riferimenti degli oggetti del rilascio</w:t>
       </w:r>
-      <w:bookmarkEnd w:id="29"/>
       <w:bookmarkEnd w:id="30"/>
       <w:bookmarkEnd w:id="31"/>
       <w:bookmarkEnd w:id="32"/>
       <w:bookmarkEnd w:id="33"/>
+      <w:bookmarkEnd w:id="34"/>
     </w:p>
     <w:p>
       <w:pPr>
@@ -8146,11 +8381,11 @@
           <w:szCs w:val="24"/>
         </w:rPr>
       </w:pPr>
-      <w:bookmarkStart w:id="34" w:name="_Toc72576998"/>
-      <w:bookmarkStart w:id="35" w:name="_Toc419800870"/>
-      <w:bookmarkStart w:id="36" w:name="_Ref13214549"/>
-      <w:bookmarkStart w:id="37" w:name="_Toc26961269"/>
-      <w:bookmarkStart w:id="38" w:name="_Toc120098403"/>
+      <w:bookmarkStart w:id="35" w:name="_Toc72576998"/>
+      <w:bookmarkStart w:id="36" w:name="_Toc419800870"/>
+      <w:bookmarkStart w:id="37" w:name="_Ref13214549"/>
+      <w:bookmarkStart w:id="38" w:name="_Toc26961269"/>
+      <w:bookmarkStart w:id="39" w:name="_Toc159427124"/>
       <w:r>
         <w:rPr>
           <w:rFonts w:asciiTheme="minorHAnsi" w:hAnsiTheme="minorHAnsi" w:cstheme="minorHAnsi"/>
@@ -8159,7 +8394,7 @@
         </w:rPr>
         <w:t xml:space="preserve">Riferimenti </w:t>
       </w:r>
-      <w:bookmarkEnd w:id="34"/>
+      <w:bookmarkEnd w:id="35"/>
       <w:r>
         <w:rPr>
           <w:rFonts w:asciiTheme="minorHAnsi" w:hAnsiTheme="minorHAnsi" w:cstheme="minorHAnsi"/>
@@ -8168,11 +8403,11 @@
         </w:rPr>
         <w:t>Anomalia</w:t>
       </w:r>
-      <w:bookmarkStart w:id="39" w:name="_Toc72576999"/>
-      <w:bookmarkStart w:id="40" w:name="_Toc419800871"/>
-      <w:bookmarkEnd w:id="35"/>
+      <w:bookmarkStart w:id="40" w:name="_Toc72576999"/>
+      <w:bookmarkStart w:id="41" w:name="_Toc419800871"/>
       <w:bookmarkEnd w:id="36"/>
       <w:bookmarkEnd w:id="37"/>
+      <w:bookmarkEnd w:id="38"/>
       <w:r>
         <w:rPr>
           <w:rFonts w:asciiTheme="minorHAnsi" w:hAnsiTheme="minorHAnsi" w:cstheme="minorHAnsi"/>
@@ -8197,7 +8432,7 @@
         </w:rPr>
         <w:t>)</w:t>
       </w:r>
-      <w:bookmarkEnd w:id="38"/>
+      <w:bookmarkEnd w:id="39"/>
     </w:p>
     <w:tbl>
       <w:tblPr>
@@ -8386,6 +8621,7 @@
                 <w:sz w:val="20"/>
               </w:rPr>
             </w:pPr>
+            <w:proofErr w:type="gramStart"/>
             <w:r>
               <w:rPr>
                 <w:rFonts w:asciiTheme="minorHAnsi" w:hAnsiTheme="minorHAnsi" w:cstheme="minorHAnsi"/>
@@ -8396,6 +8632,7 @@
               </w:rPr>
               <w:t>intervento</w:t>
             </w:r>
+            <w:proofErr w:type="gramEnd"/>
           </w:p>
         </w:tc>
         <w:tc>
@@ -8564,8 +8801,8 @@
           <w:szCs w:val="24"/>
         </w:rPr>
       </w:pPr>
-      <w:bookmarkStart w:id="41" w:name="_Toc26961270"/>
-      <w:bookmarkStart w:id="42" w:name="_Toc120098404"/>
+      <w:bookmarkStart w:id="42" w:name="_Toc26961270"/>
+      <w:bookmarkStart w:id="43" w:name="_Toc159427125"/>
       <w:r>
         <w:rPr>
           <w:rFonts w:asciiTheme="minorHAnsi" w:hAnsiTheme="minorHAnsi" w:cstheme="minorHAnsi"/>
@@ -8590,7 +8827,7 @@
         </w:rPr>
         <w:t>/MEV)</w:t>
       </w:r>
-      <w:bookmarkEnd w:id="42"/>
+      <w:bookmarkEnd w:id="43"/>
     </w:p>
     <w:tbl>
       <w:tblPr>
@@ -8659,8 +8896,20 @@
                 <w:color w:val="FFFFFF"/>
                 <w:sz w:val="20"/>
               </w:rPr>
-              <w:t>. Richiesta o</w:t>
-            </w:r>
+              <w:t xml:space="preserve">. Richiesta </w:t>
+            </w:r>
+            <w:proofErr w:type="gramStart"/>
+            <w:r>
+              <w:rPr>
+                <w:rFonts w:asciiTheme="minorHAnsi" w:hAnsiTheme="minorHAnsi" w:cstheme="minorHAnsi"/>
+                <w:b/>
+                <w:bCs/>
+                <w:color w:val="FFFFFF"/>
+                <w:sz w:val="20"/>
+              </w:rPr>
+              <w:t>o</w:t>
+            </w:r>
+            <w:proofErr w:type="gramEnd"/>
           </w:p>
           <w:p>
             <w:pPr>
@@ -8815,8 +9064,13 @@
             <w:pPr>
               <w:pStyle w:val="NormTab"/>
             </w:pPr>
-            <w:r>
-              <w:t>SIUT-SIE-SI-2.</w:t>
+            <w:proofErr w:type="gramStart"/>
+            <w:r>
+              <w:t>SIUT-SIE-SI-2</w:t>
+            </w:r>
+            <w:proofErr w:type="gramEnd"/>
+            <w:r>
+              <w:t>.</w:t>
             </w:r>
             <w:r>
               <w:t>6</w:t>
@@ -8908,14 +9162,14 @@
           <w:szCs w:val="24"/>
         </w:rPr>
       </w:pPr>
-      <w:bookmarkStart w:id="43" w:name="_Toc72577000"/>
-      <w:bookmarkStart w:id="44" w:name="_Toc419800872"/>
-      <w:bookmarkStart w:id="45" w:name="_Toc12544360"/>
-      <w:bookmarkStart w:id="46" w:name="_Toc21599124"/>
-      <w:bookmarkStart w:id="47" w:name="_Toc120098405"/>
-      <w:bookmarkEnd w:id="39"/>
+      <w:bookmarkStart w:id="44" w:name="_Toc72577000"/>
+      <w:bookmarkStart w:id="45" w:name="_Toc419800872"/>
+      <w:bookmarkStart w:id="46" w:name="_Toc12544360"/>
+      <w:bookmarkStart w:id="47" w:name="_Toc21599124"/>
+      <w:bookmarkStart w:id="48" w:name="_Toc159427126"/>
       <w:bookmarkEnd w:id="40"/>
       <w:bookmarkEnd w:id="41"/>
+      <w:bookmarkEnd w:id="42"/>
       <w:r>
         <w:rPr>
           <w:rFonts w:asciiTheme="minorHAnsi" w:hAnsiTheme="minorHAnsi" w:cstheme="minorHAnsi"/>
@@ -8926,11 +9180,11 @@
         <w:lastRenderedPageBreak/>
         <w:t>Dettaglio degli elementi oggetto del rilascio</w:t>
       </w:r>
-      <w:bookmarkEnd w:id="43"/>
       <w:bookmarkEnd w:id="44"/>
       <w:bookmarkEnd w:id="45"/>
       <w:bookmarkEnd w:id="46"/>
       <w:bookmarkEnd w:id="47"/>
+      <w:bookmarkEnd w:id="48"/>
     </w:p>
     <w:tbl>
       <w:tblPr>
@@ -9068,6 +9322,7 @@
                 <w:sz w:val="20"/>
               </w:rPr>
             </w:pPr>
+            <w:proofErr w:type="gramStart"/>
             <w:r>
               <w:rPr>
                 <w:rFonts w:asciiTheme="minorHAnsi" w:hAnsiTheme="minorHAnsi"/>
@@ -9075,6 +9330,7 @@
               </w:rPr>
               <w:t>aggiorna_db.zip</w:t>
             </w:r>
+            <w:proofErr w:type="gramEnd"/>
           </w:p>
         </w:tc>
         <w:tc>
@@ -9232,6 +9488,7 @@
                 <w:sz w:val="20"/>
               </w:rPr>
             </w:pPr>
+            <w:proofErr w:type="gramStart"/>
             <w:r>
               <w:rPr>
                 <w:rFonts w:asciiTheme="minorHAnsi" w:hAnsiTheme="minorHAnsi"/>
@@ -9239,6 +9496,7 @@
               </w:rPr>
               <w:t>sorgenti.zip</w:t>
             </w:r>
+            <w:proofErr w:type="gramEnd"/>
           </w:p>
         </w:tc>
         <w:tc>
@@ -9311,6 +9569,7 @@
                 <w:sz w:val="20"/>
               </w:rPr>
             </w:pPr>
+            <w:proofErr w:type="gramStart"/>
             <w:r>
               <w:rPr>
                 <w:rFonts w:asciiTheme="minorHAnsi" w:hAnsiTheme="minorHAnsi"/>
@@ -9318,6 +9577,7 @@
               </w:rPr>
               <w:t>sies.war</w:t>
             </w:r>
+            <w:proofErr w:type="gramEnd"/>
           </w:p>
         </w:tc>
         <w:tc>
@@ -9392,6 +9652,7 @@
                 <w:sz w:val="20"/>
               </w:rPr>
             </w:pPr>
+            <w:proofErr w:type="gramStart"/>
             <w:r>
               <w:rPr>
                 <w:rFonts w:asciiTheme="minorHAnsi" w:hAnsiTheme="minorHAnsi"/>
@@ -9406,6 +9667,7 @@
               </w:rPr>
               <w:t>ocumentazione.zip</w:t>
             </w:r>
+            <w:proofErr w:type="gramEnd"/>
           </w:p>
         </w:tc>
         <w:tc>
@@ -9521,13 +9783,23 @@
                 <w:sz w:val="20"/>
               </w:rPr>
             </w:pPr>
+            <w:proofErr w:type="gramStart"/>
             <w:r>
               <w:rPr>
                 <w:b w:val="0"/>
                 <w:bCs/>
                 <w:sz w:val="20"/>
               </w:rPr>
-              <w:t>SIUT-SIE-MU-1.</w:t>
+              <w:t>SIUT-SIE-MU-1</w:t>
+            </w:r>
+            <w:proofErr w:type="gramEnd"/>
+            <w:r>
+              <w:rPr>
+                <w:b w:val="0"/>
+                <w:bCs/>
+                <w:sz w:val="20"/>
+              </w:rPr>
+              <w:t>.</w:t>
             </w:r>
             <w:r>
               <w:rPr>
@@ -9710,6 +9982,7 @@
                 <w:sz w:val="20"/>
               </w:rPr>
             </w:pPr>
+            <w:proofErr w:type="gramStart"/>
             <w:r>
               <w:rPr>
                 <w:b w:val="0"/>
@@ -9733,7 +10006,16 @@
                 <w:bCs/>
                 <w:sz w:val="20"/>
               </w:rPr>
-              <w:t>IE-PT-1.0-20210730-Piano_dei_Test_021_RegInde_SIES.pdf</w:t>
+              <w:t>IE-PT-1</w:t>
+            </w:r>
+            <w:proofErr w:type="gramEnd"/>
+            <w:r>
+              <w:rPr>
+                <w:b w:val="0"/>
+                <w:bCs/>
+                <w:sz w:val="20"/>
+              </w:rPr>
+              <w:t>.0-20210730-Piano_dei_Test_021_RegInde_SIES.pdf</w:t>
             </w:r>
           </w:p>
           <w:p>
@@ -9780,6 +10062,7 @@
                 <w:sz w:val="20"/>
               </w:rPr>
             </w:pPr>
+            <w:proofErr w:type="gramStart"/>
             <w:r>
               <w:rPr>
                 <w:rFonts w:asciiTheme="minorHAnsi" w:hAnsiTheme="minorHAnsi"/>
@@ -9787,6 +10070,7 @@
               </w:rPr>
               <w:t>Bonifica.zip</w:t>
             </w:r>
+            <w:proofErr w:type="gramEnd"/>
           </w:p>
         </w:tc>
         <w:tc>
@@ -9836,8 +10120,17 @@
                 <w:bCs/>
                 <w:sz w:val="20"/>
               </w:rPr>
-              <w:t>Contiene procedure e script per eseguire la bonifica</w:t>
-            </w:r>
+              <w:t xml:space="preserve">Contiene procedure e script per eseguire la </w:t>
+            </w:r>
+            <w:proofErr w:type="gramStart"/>
+            <w:r>
+              <w:rPr>
+                <w:bCs/>
+                <w:sz w:val="20"/>
+              </w:rPr>
+              <w:t>bonifica</w:t>
+            </w:r>
+            <w:proofErr w:type="gramEnd"/>
           </w:p>
         </w:tc>
       </w:tr>
@@ -9923,7 +10216,23 @@
                 <w:bCs/>
                 <w:sz w:val="20"/>
               </w:rPr>
-              <w:t xml:space="preserve">Contiene procedure e script per eseguire l’aggiornamento delle tabelle fisse </w:t>
+              <w:t xml:space="preserve">Contiene procedure e script per eseguire l’aggiornamento delle tabelle </w:t>
+            </w:r>
+            <w:proofErr w:type="gramStart"/>
+            <w:r>
+              <w:rPr>
+                <w:bCs/>
+                <w:sz w:val="20"/>
+              </w:rPr>
+              <w:t>fisse</w:t>
+            </w:r>
+            <w:proofErr w:type="gramEnd"/>
+            <w:r>
+              <w:rPr>
+                <w:bCs/>
+                <w:sz w:val="20"/>
+              </w:rPr>
+              <w:t xml:space="preserve"> </w:t>
             </w:r>
           </w:p>
         </w:tc>
@@ -9994,11 +10303,11 @@
           <w:szCs w:val="24"/>
         </w:rPr>
       </w:pPr>
-      <w:bookmarkStart w:id="48" w:name="_Toc72577001"/>
-      <w:bookmarkStart w:id="49" w:name="_Toc419800873"/>
-      <w:bookmarkStart w:id="50" w:name="_Toc12544361"/>
-      <w:bookmarkStart w:id="51" w:name="_Toc21599125"/>
-      <w:bookmarkStart w:id="52" w:name="_Toc120098406"/>
+      <w:bookmarkStart w:id="49" w:name="_Toc72577001"/>
+      <w:bookmarkStart w:id="50" w:name="_Toc419800873"/>
+      <w:bookmarkStart w:id="51" w:name="_Toc12544361"/>
+      <w:bookmarkStart w:id="52" w:name="_Toc21599125"/>
+      <w:bookmarkStart w:id="53" w:name="_Toc159427127"/>
       <w:r>
         <w:rPr>
           <w:rFonts w:asciiTheme="minorHAnsi" w:hAnsiTheme="minorHAnsi" w:cstheme="minorHAnsi"/>
@@ -10009,11 +10318,11 @@
         <w:lastRenderedPageBreak/>
         <w:t>Installazione</w:t>
       </w:r>
-      <w:bookmarkEnd w:id="48"/>
       <w:bookmarkEnd w:id="49"/>
       <w:bookmarkEnd w:id="50"/>
       <w:bookmarkEnd w:id="51"/>
       <w:bookmarkEnd w:id="52"/>
+      <w:bookmarkEnd w:id="53"/>
     </w:p>
     <w:p>
       <w:pPr>
@@ -10034,8 +10343,8 @@
           <w:szCs w:val="24"/>
         </w:rPr>
       </w:pPr>
-      <w:bookmarkStart w:id="53" w:name="_Toc38010748"/>
-      <w:bookmarkStart w:id="54" w:name="_Toc120098407"/>
+      <w:bookmarkStart w:id="54" w:name="_Toc38010748"/>
+      <w:bookmarkStart w:id="55" w:name="_Toc159427128"/>
       <w:r>
         <w:rPr>
           <w:rFonts w:asciiTheme="minorHAnsi" w:hAnsiTheme="minorHAnsi" w:cstheme="minorHAnsi"/>
@@ -10044,9 +10353,9 @@
         </w:rPr>
         <w:t>Prerequisiti</w:t>
       </w:r>
-      <w:bookmarkStart w:id="55" w:name="_Toc38010749"/>
-      <w:bookmarkEnd w:id="53"/>
+      <w:bookmarkStart w:id="56" w:name="_Toc38010749"/>
       <w:bookmarkEnd w:id="54"/>
+      <w:bookmarkEnd w:id="55"/>
     </w:p>
     <w:p>
       <w:pPr>
@@ -10119,7 +10428,7 @@
           <w:sz w:val="22"/>
           <w:szCs w:val="22"/>
         </w:rPr>
-        <w:t>12.4.24.0</w:t>
+        <w:t>12.5.6.0</w:t>
       </w:r>
       <w:r>
         <w:rPr>
@@ -10201,6 +10510,7 @@
           <w:szCs w:val="22"/>
         </w:rPr>
       </w:pPr>
+      <w:proofErr w:type="gramStart"/>
       <w:r>
         <w:rPr>
           <w:sz w:val="22"/>
@@ -10213,7 +10523,15 @@
           <w:sz w:val="22"/>
           <w:szCs w:val="22"/>
         </w:rPr>
-        <w:t>ffettuare preliminarmente uno snapshot del DB di modo che in caso di esito negativo di una o più</w:t>
+        <w:t>ffettuare</w:t>
+      </w:r>
+      <w:proofErr w:type="gramEnd"/>
+      <w:r>
+        <w:rPr>
+          <w:sz w:val="22"/>
+          <w:szCs w:val="22"/>
+        </w:rPr>
+        <w:t xml:space="preserve"> preliminarmente uno snapshot del DB di modo che in caso di esito negativo di una o più</w:t>
       </w:r>
       <w:r>
         <w:rPr>
@@ -10250,12 +10568,21 @@
           <w:szCs w:val="22"/>
         </w:rPr>
       </w:pPr>
-      <w:r>
-        <w:rPr>
-          <w:sz w:val="22"/>
-          <w:szCs w:val="22"/>
-        </w:rPr>
-        <w:t>esecuzione di una procedura batch per la bonifica dei Difensori sulla base dell’estrazione degli Avvocati presenti in ReGIndE;</w:t>
+      <w:proofErr w:type="gramStart"/>
+      <w:r>
+        <w:rPr>
+          <w:sz w:val="22"/>
+          <w:szCs w:val="22"/>
+        </w:rPr>
+        <w:t>esecuzione</w:t>
+      </w:r>
+      <w:proofErr w:type="gramEnd"/>
+      <w:r>
+        <w:rPr>
+          <w:sz w:val="22"/>
+          <w:szCs w:val="22"/>
+        </w:rPr>
+        <w:t xml:space="preserve"> di una procedura batch per la bonifica dei Difensori sulla base dell’estrazione degli Avvocati presenti in ReGIndE;</w:t>
       </w:r>
     </w:p>
     <w:p>
@@ -10271,12 +10598,21 @@
           <w:szCs w:val="22"/>
         </w:rPr>
       </w:pPr>
-      <w:r>
-        <w:rPr>
-          <w:sz w:val="22"/>
-          <w:szCs w:val="22"/>
-        </w:rPr>
-        <w:t>aggiornamento della tabella</w:t>
+      <w:proofErr w:type="gramStart"/>
+      <w:r>
+        <w:rPr>
+          <w:sz w:val="22"/>
+          <w:szCs w:val="22"/>
+        </w:rPr>
+        <w:t>aggiornamento</w:t>
+      </w:r>
+      <w:proofErr w:type="gramEnd"/>
+      <w:r>
+        <w:rPr>
+          <w:sz w:val="22"/>
+          <w:szCs w:val="22"/>
+        </w:rPr>
+        <w:t xml:space="preserve"> della tabella</w:t>
       </w:r>
       <w:r>
         <w:rPr>
@@ -10306,6 +10642,7 @@
           <w:szCs w:val="22"/>
         </w:rPr>
       </w:pPr>
+      <w:proofErr w:type="gramStart"/>
       <w:r>
         <w:rPr>
           <w:sz w:val="22"/>
@@ -10318,7 +10655,15 @@
           <w:sz w:val="22"/>
           <w:szCs w:val="22"/>
         </w:rPr>
-        <w:t>nstallazione dell’Applicazione aggiornata.</w:t>
+        <w:t>nstallazione</w:t>
+      </w:r>
+      <w:proofErr w:type="gramEnd"/>
+      <w:r>
+        <w:rPr>
+          <w:sz w:val="22"/>
+          <w:szCs w:val="22"/>
+        </w:rPr>
+        <w:t xml:space="preserve"> dell’Applicazione aggiornata.</w:t>
       </w:r>
     </w:p>
     <w:p>
@@ -10421,6 +10766,7 @@
         </w:rPr>
         <w:t>2</w:t>
       </w:r>
+      <w:proofErr w:type="gramStart"/>
       <w:r>
         <w:rPr>
           <w:rFonts w:asciiTheme="minorHAnsi" w:hAnsiTheme="minorHAnsi" w:cstheme="minorHAnsi"/>
@@ -10428,7 +10774,17 @@
           <w:sz w:val="22"/>
           <w:szCs w:val="22"/>
         </w:rPr>
-        <w:t>) non ha fornito messaggi di errore</w:t>
+        <w:t>)</w:t>
+      </w:r>
+      <w:proofErr w:type="gramEnd"/>
+      <w:r>
+        <w:rPr>
+          <w:rFonts w:asciiTheme="minorHAnsi" w:hAnsiTheme="minorHAnsi" w:cstheme="minorHAnsi"/>
+          <w:b/>
+          <w:sz w:val="22"/>
+          <w:szCs w:val="22"/>
+        </w:rPr>
+        <w:t xml:space="preserve"> non ha fornito messaggi di errore</w:t>
       </w:r>
       <w:r>
         <w:rPr>
@@ -10474,8 +10830,8 @@
           <w:szCs w:val="24"/>
         </w:rPr>
       </w:pPr>
-      <w:bookmarkStart w:id="56" w:name="_Toc120098408"/>
-      <w:bookmarkEnd w:id="55"/>
+      <w:bookmarkStart w:id="57" w:name="_Toc159427129"/>
+      <w:bookmarkEnd w:id="56"/>
       <w:r>
         <w:rPr>
           <w:rFonts w:asciiTheme="minorHAnsi" w:hAnsiTheme="minorHAnsi" w:cstheme="minorHAnsi"/>
@@ -10484,15 +10840,25 @@
         </w:rPr>
         <w:t xml:space="preserve">Attività </w:t>
       </w:r>
+      <w:proofErr w:type="gramStart"/>
       <w:r>
         <w:rPr>
           <w:rFonts w:asciiTheme="minorHAnsi" w:hAnsiTheme="minorHAnsi" w:cstheme="minorHAnsi"/>
           <w:color w:val="365F91" w:themeColor="accent1" w:themeShade="BF"/>
           <w:szCs w:val="24"/>
         </w:rPr>
-        <w:t>di installazione ed esecuzione procedura batch Bonifica Difensori</w:t>
-      </w:r>
-      <w:bookmarkEnd w:id="56"/>
+        <w:t xml:space="preserve">di </w:t>
+      </w:r>
+      <w:proofErr w:type="gramEnd"/>
+      <w:r>
+        <w:rPr>
+          <w:rFonts w:asciiTheme="minorHAnsi" w:hAnsiTheme="minorHAnsi" w:cstheme="minorHAnsi"/>
+          <w:color w:val="365F91" w:themeColor="accent1" w:themeShade="BF"/>
+          <w:szCs w:val="24"/>
+        </w:rPr>
+        <w:t>installazione ed esecuzione procedura batch Bonifica Difensori</w:t>
+      </w:r>
+      <w:bookmarkEnd w:id="57"/>
     </w:p>
     <w:p>
       <w:pPr>
@@ -10632,8 +10998,9 @@
           <w:sz w:val="22"/>
           <w:szCs w:val="22"/>
         </w:rPr>
-        <w:t xml:space="preserve">Se </w:t>
-      </w:r>
+        <w:t>Se</w:t>
+      </w:r>
+      <w:proofErr w:type="gramStart"/>
       <w:r>
         <w:rPr>
           <w:rFonts w:asciiTheme="minorHAnsi" w:hAnsiTheme="minorHAnsi" w:cstheme="minorHAnsi"/>
@@ -10641,7 +11008,26 @@
           <w:sz w:val="22"/>
           <w:szCs w:val="22"/>
         </w:rPr>
-        <w:t xml:space="preserve"> tutt</w:t>
+        <w:t xml:space="preserve"> </w:t>
+      </w:r>
+      <w:r>
+        <w:rPr>
+          <w:rFonts w:asciiTheme="minorHAnsi" w:hAnsiTheme="minorHAnsi" w:cstheme="minorHAnsi"/>
+          <w:b/>
+          <w:sz w:val="22"/>
+          <w:szCs w:val="22"/>
+        </w:rPr>
+        <w:t xml:space="preserve"> </w:t>
+      </w:r>
+      <w:proofErr w:type="gramEnd"/>
+      <w:r>
+        <w:rPr>
+          <w:rFonts w:asciiTheme="minorHAnsi" w:hAnsiTheme="minorHAnsi" w:cstheme="minorHAnsi"/>
+          <w:b/>
+          <w:sz w:val="22"/>
+          <w:szCs w:val="22"/>
+        </w:rPr>
+        <w:t>tutt</w:t>
       </w:r>
       <w:r>
         <w:rPr>
@@ -10733,7 +11119,27 @@
           <w:sz w:val="22"/>
           <w:szCs w:val="22"/>
         </w:rPr>
-        <w:t xml:space="preserve"> ed attendere loro indicazioni.</w:t>
+        <w:t xml:space="preserve"> </w:t>
+      </w:r>
+      <w:proofErr w:type="gramStart"/>
+      <w:r>
+        <w:rPr>
+          <w:b/>
+          <w:i/>
+          <w:sz w:val="22"/>
+          <w:szCs w:val="22"/>
+        </w:rPr>
+        <w:t>ed</w:t>
+      </w:r>
+      <w:proofErr w:type="gramEnd"/>
+      <w:r>
+        <w:rPr>
+          <w:b/>
+          <w:i/>
+          <w:sz w:val="22"/>
+          <w:szCs w:val="22"/>
+        </w:rPr>
+        <w:t xml:space="preserve"> attendere loro indicazioni.</w:t>
       </w:r>
     </w:p>
     <w:p>
@@ -10754,17 +11160,27 @@
           <w:szCs w:val="24"/>
         </w:rPr>
       </w:pPr>
-      <w:bookmarkStart w:id="57" w:name="_Toc27745470"/>
-      <w:bookmarkStart w:id="58" w:name="_Toc120098409"/>
+      <w:bookmarkStart w:id="58" w:name="_Toc27745470"/>
+      <w:bookmarkStart w:id="59" w:name="_Toc159427130"/>
       <w:r>
         <w:rPr>
           <w:rFonts w:asciiTheme="minorHAnsi" w:hAnsiTheme="minorHAnsi" w:cstheme="minorHAnsi"/>
           <w:color w:val="365F91" w:themeColor="accent1" w:themeShade="BF"/>
           <w:szCs w:val="24"/>
         </w:rPr>
-        <w:t>Procedura di Aggiornamento Tabella SIES da Tabella fissa DGSIA</w:t>
-      </w:r>
-      <w:bookmarkEnd w:id="58"/>
+        <w:t xml:space="preserve">Procedura di Aggiornamento Tabella SIES da Tabella fissa </w:t>
+      </w:r>
+      <w:proofErr w:type="gramStart"/>
+      <w:r>
+        <w:rPr>
+          <w:rFonts w:asciiTheme="minorHAnsi" w:hAnsiTheme="minorHAnsi" w:cstheme="minorHAnsi"/>
+          <w:color w:val="365F91" w:themeColor="accent1" w:themeShade="BF"/>
+          <w:szCs w:val="24"/>
+        </w:rPr>
+        <w:t>DGSIA</w:t>
+      </w:r>
+      <w:bookmarkEnd w:id="59"/>
+      <w:proofErr w:type="gramEnd"/>
     </w:p>
     <w:p>
       <w:pPr>
@@ -11072,7 +11488,25 @@
           <w:sz w:val="22"/>
           <w:szCs w:val="22"/>
         </w:rPr>
-        <w:t>3.1 si articolano su scripts .sql e procedures plsql, contenuti nel pacchetto</w:t>
+        <w:t xml:space="preserve">3.1 si articolano su scripts </w:t>
+      </w:r>
+      <w:proofErr w:type="gramStart"/>
+      <w:r>
+        <w:rPr>
+          <w:rFonts w:asciiTheme="minorHAnsi" w:hAnsiTheme="minorHAnsi" w:cstheme="minorHAnsi"/>
+          <w:sz w:val="22"/>
+          <w:szCs w:val="22"/>
+        </w:rPr>
+        <w:t>.sql</w:t>
+      </w:r>
+      <w:proofErr w:type="gramEnd"/>
+      <w:r>
+        <w:rPr>
+          <w:rFonts w:asciiTheme="minorHAnsi" w:hAnsiTheme="minorHAnsi" w:cstheme="minorHAnsi"/>
+          <w:sz w:val="22"/>
+          <w:szCs w:val="22"/>
+        </w:rPr>
+        <w:t xml:space="preserve"> e procedures plsql, contenuti nel pacchetto</w:t>
       </w:r>
     </w:p>
     <w:p>
@@ -11086,6 +11520,7 @@
           <w:szCs w:val="22"/>
         </w:rPr>
       </w:pPr>
+      <w:proofErr w:type="gramStart"/>
       <w:r>
         <w:rPr>
           <w:rFonts w:asciiTheme="minorHAnsi" w:hAnsiTheme="minorHAnsi" w:cstheme="minorHAnsi"/>
@@ -11095,6 +11530,7 @@
         </w:rPr>
         <w:t>aggiorna_db.zip</w:t>
       </w:r>
+      <w:proofErr w:type="gramEnd"/>
       <w:r>
         <w:rPr>
           <w:rFonts w:asciiTheme="minorHAnsi" w:hAnsiTheme="minorHAnsi" w:cstheme="minorHAnsi"/>
@@ -11152,8 +11588,18 @@
           <w:sz w:val="22"/>
           <w:szCs w:val="22"/>
         </w:rPr>
-        <w:t>, ricevute</w:t>
-      </w:r>
+        <w:t xml:space="preserve">, </w:t>
+      </w:r>
+      <w:proofErr w:type="gramStart"/>
+      <w:r>
+        <w:rPr>
+          <w:rFonts w:asciiTheme="minorHAnsi" w:hAnsiTheme="minorHAnsi" w:cstheme="minorHAnsi"/>
+          <w:sz w:val="22"/>
+          <w:szCs w:val="22"/>
+        </w:rPr>
+        <w:t>ricevute</w:t>
+      </w:r>
+      <w:proofErr w:type="gramEnd"/>
     </w:p>
     <w:p>
       <w:pPr>
@@ -11166,6 +11612,7 @@
           <w:szCs w:val="22"/>
         </w:rPr>
       </w:pPr>
+      <w:proofErr w:type="gramStart"/>
       <w:r>
         <w:rPr>
           <w:rFonts w:asciiTheme="minorHAnsi" w:hAnsiTheme="minorHAnsi" w:cstheme="minorHAnsi"/>
@@ -11173,7 +11620,17 @@
           <w:sz w:val="22"/>
           <w:szCs w:val="22"/>
         </w:rPr>
-        <w:t>tramite e-mail di Anna.Maffucci@giustizia.it a Vito.Bufi@eng.it del 06/11/2020 09:06</w:t>
+        <w:t>tramite</w:t>
+      </w:r>
+      <w:proofErr w:type="gramEnd"/>
+      <w:r>
+        <w:rPr>
+          <w:rFonts w:asciiTheme="minorHAnsi" w:hAnsiTheme="minorHAnsi" w:cstheme="minorHAnsi"/>
+          <w:b/>
+          <w:sz w:val="22"/>
+          <w:szCs w:val="22"/>
+        </w:rPr>
+        <w:t xml:space="preserve"> e-mail di Anna.Maffucci@giustizia.it a Vito.Bufi@eng.it del 06/11/2020 09:06</w:t>
       </w:r>
       <w:r>
         <w:rPr>
@@ -11199,24 +11656,42 @@
           <w:szCs w:val="24"/>
         </w:rPr>
       </w:pPr>
-      <w:bookmarkStart w:id="59" w:name="_Toc120098410"/>
+      <w:bookmarkStart w:id="60" w:name="_Toc159427131"/>
       <w:r>
         <w:rPr>
           <w:rFonts w:asciiTheme="minorHAnsi" w:hAnsiTheme="minorHAnsi" w:cstheme="minorHAnsi"/>
           <w:color w:val="365F91" w:themeColor="accent1" w:themeShade="BF"/>
           <w:szCs w:val="24"/>
         </w:rPr>
-        <w:t xml:space="preserve">Attività di installazione ed esecuzione procedura batch </w:t>
-      </w:r>
+        <w:t xml:space="preserve">Attività </w:t>
+      </w:r>
+      <w:proofErr w:type="gramStart"/>
       <w:r>
         <w:rPr>
           <w:rFonts w:asciiTheme="minorHAnsi" w:hAnsiTheme="minorHAnsi" w:cstheme="minorHAnsi"/>
           <w:color w:val="365F91" w:themeColor="accent1" w:themeShade="BF"/>
           <w:szCs w:val="24"/>
         </w:rPr>
+        <w:t xml:space="preserve">di </w:t>
+      </w:r>
+      <w:proofErr w:type="gramEnd"/>
+      <w:r>
+        <w:rPr>
+          <w:rFonts w:asciiTheme="minorHAnsi" w:hAnsiTheme="minorHAnsi" w:cstheme="minorHAnsi"/>
+          <w:color w:val="365F91" w:themeColor="accent1" w:themeShade="BF"/>
+          <w:szCs w:val="24"/>
+        </w:rPr>
+        <w:t xml:space="preserve">installazione ed esecuzione procedura batch </w:t>
+      </w:r>
+      <w:r>
+        <w:rPr>
+          <w:rFonts w:asciiTheme="minorHAnsi" w:hAnsiTheme="minorHAnsi" w:cstheme="minorHAnsi"/>
+          <w:color w:val="365F91" w:themeColor="accent1" w:themeShade="BF"/>
+          <w:szCs w:val="24"/>
+        </w:rPr>
         <w:t>Aggiornamento Tabella SIES da Tabella fissa DGSIA</w:t>
       </w:r>
-      <w:bookmarkEnd w:id="59"/>
+      <w:bookmarkEnd w:id="60"/>
     </w:p>
     <w:p>
       <w:pPr>
@@ -11259,6 +11734,7 @@
           <w:szCs w:val="22"/>
         </w:rPr>
       </w:pPr>
+      <w:proofErr w:type="gramStart"/>
       <w:r>
         <w:rPr>
           <w:b w:val="0"/>
@@ -11305,6 +11781,7 @@
         </w:rPr>
         <w:t>.</w:t>
       </w:r>
+      <w:proofErr w:type="gramEnd"/>
     </w:p>
     <w:p>
       <w:pPr>
@@ -11319,8 +11796,6 @@
           <w:szCs w:val="22"/>
         </w:rPr>
       </w:pPr>
-      <w:bookmarkStart w:id="60" w:name="_GoBack"/>
-      <w:bookmarkEnd w:id="60"/>
       <w:r>
         <w:rPr>
           <w:b w:val="0"/>
@@ -11405,8 +11880,18 @@
           <w:sz w:val="22"/>
           <w:szCs w:val="22"/>
         </w:rPr>
-        <w:t>Riassunto dei dati immessi per questa installazione</w:t>
-      </w:r>
+        <w:t xml:space="preserve">Riassunto dei dati immessi per questa </w:t>
+      </w:r>
+      <w:proofErr w:type="gramStart"/>
+      <w:r>
+        <w:rPr>
+          <w:b w:val="0"/>
+          <w:sz w:val="22"/>
+          <w:szCs w:val="22"/>
+        </w:rPr>
+        <w:t>installazione</w:t>
+      </w:r>
+      <w:proofErr w:type="gramEnd"/>
     </w:p>
     <w:p>
       <w:pPr>
@@ -11555,13 +12040,23 @@
           <w:szCs w:val="22"/>
         </w:rPr>
       </w:pPr>
-      <w:r>
-        <w:rPr>
-          <w:b w:val="0"/>
-          <w:sz w:val="22"/>
-          <w:szCs w:val="22"/>
-        </w:rPr>
-        <w:t xml:space="preserve">Posizionarsi nel percorso </w:t>
+      <w:proofErr w:type="gramStart"/>
+      <w:r>
+        <w:rPr>
+          <w:b w:val="0"/>
+          <w:sz w:val="22"/>
+          <w:szCs w:val="22"/>
+        </w:rPr>
+        <w:t>Posizionarsi</w:t>
+      </w:r>
+      <w:proofErr w:type="gramEnd"/>
+      <w:r>
+        <w:rPr>
+          <w:b w:val="0"/>
+          <w:sz w:val="22"/>
+          <w:szCs w:val="22"/>
+        </w:rPr>
+        <w:t xml:space="preserve"> nel percorso </w:t>
       </w:r>
       <w:r>
         <w:rPr>
@@ -11628,7 +12123,7 @@
           <w:szCs w:val="24"/>
         </w:rPr>
       </w:pPr>
-      <w:bookmarkStart w:id="61" w:name="_Toc120098411"/>
+      <w:bookmarkStart w:id="61" w:name="_Toc159427132"/>
       <w:r>
         <w:rPr>
           <w:rFonts w:asciiTheme="minorHAnsi" w:hAnsiTheme="minorHAnsi" w:cstheme="minorHAnsi"/>
@@ -11643,9 +12138,19 @@
           <w:color w:val="365F91" w:themeColor="accent1" w:themeShade="BF"/>
           <w:szCs w:val="24"/>
         </w:rPr>
-        <w:t xml:space="preserve"> - STEP 1</w:t>
+        <w:t xml:space="preserve"> - STEP </w:t>
+      </w:r>
+      <w:proofErr w:type="gramStart"/>
+      <w:r>
+        <w:rPr>
+          <w:rFonts w:asciiTheme="minorHAnsi" w:hAnsiTheme="minorHAnsi" w:cstheme="minorHAnsi"/>
+          <w:color w:val="365F91" w:themeColor="accent1" w:themeShade="BF"/>
+          <w:szCs w:val="24"/>
+        </w:rPr>
+        <w:t>1</w:t>
       </w:r>
       <w:bookmarkEnd w:id="61"/>
+      <w:proofErr w:type="gramEnd"/>
     </w:p>
     <w:p>
       <w:pPr>
@@ -11724,7 +12229,27 @@
           <w:sz w:val="22"/>
           <w:szCs w:val="22"/>
         </w:rPr>
-        <w:t>./aggiorna_db.sh</w:t>
+        <w:t>.</w:t>
+      </w:r>
+      <w:proofErr w:type="gramStart"/>
+      <w:r>
+        <w:rPr>
+          <w:rFonts w:asciiTheme="minorHAnsi" w:hAnsiTheme="minorHAnsi" w:cstheme="minorHAnsi"/>
+          <w:b/>
+          <w:sz w:val="22"/>
+          <w:szCs w:val="22"/>
+        </w:rPr>
+        <w:t>/</w:t>
+      </w:r>
+      <w:proofErr w:type="gramEnd"/>
+      <w:r>
+        <w:rPr>
+          <w:rFonts w:asciiTheme="minorHAnsi" w:hAnsiTheme="minorHAnsi" w:cstheme="minorHAnsi"/>
+          <w:b/>
+          <w:sz w:val="22"/>
+          <w:szCs w:val="22"/>
+        </w:rPr>
+        <w:t>aggiorna_db.sh</w:t>
       </w:r>
     </w:p>
     <w:p>
@@ -11790,7 +12315,25 @@
           <w:sz w:val="22"/>
           <w:szCs w:val="22"/>
         </w:rPr>
-        <w:t>Crea e compila la procedure</w:t>
+        <w:t xml:space="preserve">Crea e compila </w:t>
+      </w:r>
+      <w:proofErr w:type="gramStart"/>
+      <w:r>
+        <w:rPr>
+          <w:b w:val="0"/>
+          <w:sz w:val="22"/>
+          <w:szCs w:val="22"/>
+        </w:rPr>
+        <w:t>la</w:t>
+      </w:r>
+      <w:proofErr w:type="gramEnd"/>
+      <w:r>
+        <w:rPr>
+          <w:b w:val="0"/>
+          <w:sz w:val="22"/>
+          <w:szCs w:val="22"/>
+        </w:rPr>
+        <w:t xml:space="preserve"> procedure</w:t>
       </w:r>
       <w:r>
         <w:rPr>
@@ -11886,7 +12429,25 @@
           <w:sz w:val="22"/>
           <w:szCs w:val="22"/>
         </w:rPr>
-        <w:t>o script .sql aggiunge all’attuale struttura della tabella COMUNE le nuove</w:t>
+        <w:t xml:space="preserve">o script </w:t>
+      </w:r>
+      <w:proofErr w:type="gramStart"/>
+      <w:r>
+        <w:rPr>
+          <w:b w:val="0"/>
+          <w:sz w:val="22"/>
+          <w:szCs w:val="22"/>
+        </w:rPr>
+        <w:t>.sql</w:t>
+      </w:r>
+      <w:proofErr w:type="gramEnd"/>
+      <w:r>
+        <w:rPr>
+          <w:b w:val="0"/>
+          <w:sz w:val="22"/>
+          <w:szCs w:val="22"/>
+        </w:rPr>
+        <w:t xml:space="preserve"> aggiunge all’attuale struttura della tabella COMUNE le nuove</w:t>
       </w:r>
       <w:r>
         <w:rPr>
@@ -11958,7 +12519,25 @@
           <w:sz w:val="22"/>
           <w:szCs w:val="22"/>
         </w:rPr>
-        <w:t>Lo script effettua l’aggiornamento della tabella</w:t>
+        <w:t xml:space="preserve">Lo script </w:t>
+      </w:r>
+      <w:proofErr w:type="gramStart"/>
+      <w:r>
+        <w:rPr>
+          <w:b w:val="0"/>
+          <w:sz w:val="22"/>
+          <w:szCs w:val="22"/>
+        </w:rPr>
+        <w:t>effettua</w:t>
+      </w:r>
+      <w:proofErr w:type="gramEnd"/>
+      <w:r>
+        <w:rPr>
+          <w:b w:val="0"/>
+          <w:sz w:val="22"/>
+          <w:szCs w:val="22"/>
+        </w:rPr>
+        <w:t xml:space="preserve"> l’aggiornamento della tabella</w:t>
       </w:r>
       <w:r>
         <w:rPr>
@@ -12102,7 +12681,25 @@
           <w:sz w:val="22"/>
           <w:szCs w:val="22"/>
         </w:rPr>
-        <w:t>CG_REF_CODES per RV_DOMAIN = ‘REGIONE’.</w:t>
+        <w:t>CG_REF_CODES per RV_DOMAIN =</w:t>
+      </w:r>
+      <w:proofErr w:type="gramStart"/>
+      <w:r>
+        <w:rPr>
+          <w:b w:val="0"/>
+          <w:sz w:val="22"/>
+          <w:szCs w:val="22"/>
+        </w:rPr>
+        <w:t xml:space="preserve"> ‘</w:t>
+      </w:r>
+      <w:proofErr w:type="gramEnd"/>
+      <w:r>
+        <w:rPr>
+          <w:b w:val="0"/>
+          <w:sz w:val="22"/>
+          <w:szCs w:val="22"/>
+        </w:rPr>
+        <w:t>REGIONE’.</w:t>
       </w:r>
     </w:p>
     <w:p>
@@ -12158,7 +12755,25 @@
           <w:sz w:val="22"/>
           <w:szCs w:val="22"/>
         </w:rPr>
-        <w:t>CG_REF_CODES i records aventi RV_DOMAIN = ‘NAZIONE’ e carica i nuovi records. Il dominio</w:t>
+        <w:t>CG_REF_CODES i records aventi RV_DOMAIN =</w:t>
+      </w:r>
+      <w:proofErr w:type="gramStart"/>
+      <w:r>
+        <w:rPr>
+          <w:b w:val="0"/>
+          <w:sz w:val="22"/>
+          <w:szCs w:val="22"/>
+        </w:rPr>
+        <w:t xml:space="preserve"> ‘</w:t>
+      </w:r>
+      <w:proofErr w:type="gramEnd"/>
+      <w:r>
+        <w:rPr>
+          <w:b w:val="0"/>
+          <w:sz w:val="22"/>
+          <w:szCs w:val="22"/>
+        </w:rPr>
+        <w:t>NAZIONE’ e carica i nuovi records. Il dominio</w:t>
       </w:r>
       <w:r>
         <w:rPr>
@@ -12262,7 +12877,25 @@
           <w:sz w:val="22"/>
           <w:szCs w:val="22"/>
         </w:rPr>
-        <w:t>diverso valore del CO_SIES.</w:t>
+        <w:t xml:space="preserve">diverso </w:t>
+      </w:r>
+      <w:proofErr w:type="gramStart"/>
+      <w:r>
+        <w:rPr>
+          <w:b w:val="0"/>
+          <w:sz w:val="22"/>
+          <w:szCs w:val="22"/>
+        </w:rPr>
+        <w:t>valore</w:t>
+      </w:r>
+      <w:proofErr w:type="gramEnd"/>
+      <w:r>
+        <w:rPr>
+          <w:b w:val="0"/>
+          <w:sz w:val="22"/>
+          <w:szCs w:val="22"/>
+        </w:rPr>
+        <w:t xml:space="preserve"> del CO_SIES.</w:t>
       </w:r>
     </w:p>
     <w:p>
@@ -12392,7 +13025,25 @@
           <w:sz w:val="22"/>
           <w:szCs w:val="22"/>
         </w:rPr>
-        <w:t>CODICI_SIES_NSC i records aventi CO_DOMAIN = ‘NAZIONE’ e carica i nuovi records. Il dominio</w:t>
+        <w:t>CODICI_SIES_NSC i records aventi CO_DOMAIN =</w:t>
+      </w:r>
+      <w:proofErr w:type="gramStart"/>
+      <w:r>
+        <w:rPr>
+          <w:rFonts w:asciiTheme="minorHAnsi" w:hAnsiTheme="minorHAnsi" w:cstheme="minorHAnsi"/>
+          <w:sz w:val="22"/>
+          <w:szCs w:val="22"/>
+        </w:rPr>
+        <w:t xml:space="preserve"> ‘</w:t>
+      </w:r>
+      <w:proofErr w:type="gramEnd"/>
+      <w:r>
+        <w:rPr>
+          <w:rFonts w:asciiTheme="minorHAnsi" w:hAnsiTheme="minorHAnsi" w:cstheme="minorHAnsi"/>
+          <w:sz w:val="22"/>
+          <w:szCs w:val="22"/>
+        </w:rPr>
+        <w:t>NAZIONE’ e carica i nuovi records. Il dominio</w:t>
       </w:r>
     </w:p>
     <w:p>
@@ -12404,13 +13055,23 @@
           <w:szCs w:val="22"/>
         </w:rPr>
       </w:pPr>
-      <w:r>
-        <w:rPr>
-          <w:rFonts w:asciiTheme="minorHAnsi" w:hAnsiTheme="minorHAnsi" w:cstheme="minorHAnsi"/>
-          <w:sz w:val="22"/>
-          <w:szCs w:val="22"/>
-        </w:rPr>
-        <w:t>conterrà 204 records a fronte dei 201 precedenti.</w:t>
+      <w:proofErr w:type="gramStart"/>
+      <w:r>
+        <w:rPr>
+          <w:rFonts w:asciiTheme="minorHAnsi" w:hAnsiTheme="minorHAnsi" w:cstheme="minorHAnsi"/>
+          <w:sz w:val="22"/>
+          <w:szCs w:val="22"/>
+        </w:rPr>
+        <w:t>conterrà</w:t>
+      </w:r>
+      <w:proofErr w:type="gramEnd"/>
+      <w:r>
+        <w:rPr>
+          <w:rFonts w:asciiTheme="minorHAnsi" w:hAnsiTheme="minorHAnsi" w:cstheme="minorHAnsi"/>
+          <w:sz w:val="22"/>
+          <w:szCs w:val="22"/>
+        </w:rPr>
+        <w:t xml:space="preserve"> 204 records a fronte dei 201 precedenti.</w:t>
       </w:r>
     </w:p>
     <w:p>
@@ -12507,7 +13168,25 @@
           <w:sz w:val="22"/>
           <w:szCs w:val="22"/>
         </w:rPr>
-        <w:t>icerca ed alla gestione dell’Avvocato su ReGIndE e</w:t>
+        <w:t xml:space="preserve">icerca </w:t>
+      </w:r>
+      <w:proofErr w:type="gramStart"/>
+      <w:r>
+        <w:rPr>
+          <w:b w:val="0"/>
+          <w:sz w:val="22"/>
+          <w:szCs w:val="22"/>
+        </w:rPr>
+        <w:t>ed</w:t>
+      </w:r>
+      <w:proofErr w:type="gramEnd"/>
+      <w:r>
+        <w:rPr>
+          <w:b w:val="0"/>
+          <w:sz w:val="22"/>
+          <w:szCs w:val="22"/>
+        </w:rPr>
+        <w:t xml:space="preserve"> alla gestione dell’Avvocato su ReGIndE e</w:t>
       </w:r>
       <w:r>
         <w:rPr>
@@ -12686,13 +13365,23 @@
         </w:rPr>
         <w:t xml:space="preserve">CODICI_SIES_NSC i </w:t>
       </w:r>
-      <w:r>
-        <w:rPr>
-          <w:rFonts w:asciiTheme="minorHAnsi" w:hAnsiTheme="minorHAnsi" w:cstheme="minorHAnsi"/>
-          <w:sz w:val="22"/>
-          <w:szCs w:val="22"/>
-        </w:rPr>
-        <w:t xml:space="preserve">32 </w:t>
+      <w:proofErr w:type="gramStart"/>
+      <w:r>
+        <w:rPr>
+          <w:rFonts w:asciiTheme="minorHAnsi" w:hAnsiTheme="minorHAnsi" w:cstheme="minorHAnsi"/>
+          <w:sz w:val="22"/>
+          <w:szCs w:val="22"/>
+        </w:rPr>
+        <w:t>32</w:t>
+      </w:r>
+      <w:proofErr w:type="gramEnd"/>
+      <w:r>
+        <w:rPr>
+          <w:rFonts w:asciiTheme="minorHAnsi" w:hAnsiTheme="minorHAnsi" w:cstheme="minorHAnsi"/>
+          <w:sz w:val="22"/>
+          <w:szCs w:val="22"/>
+        </w:rPr>
+        <w:t xml:space="preserve"> </w:t>
       </w:r>
       <w:r>
         <w:rPr>
@@ -12838,12 +13527,21 @@
           <w:szCs w:val="22"/>
         </w:rPr>
       </w:pPr>
-      <w:r>
-        <w:rPr>
-          <w:sz w:val="22"/>
-          <w:szCs w:val="22"/>
-        </w:rPr>
-        <w:t xml:space="preserve">aggiorna_versione.sql = </w:t>
+      <w:proofErr w:type="gramStart"/>
+      <w:r>
+        <w:rPr>
+          <w:sz w:val="22"/>
+          <w:szCs w:val="22"/>
+        </w:rPr>
+        <w:t>aggiorna_versione.sql</w:t>
+      </w:r>
+      <w:proofErr w:type="gramEnd"/>
+      <w:r>
+        <w:rPr>
+          <w:sz w:val="22"/>
+          <w:szCs w:val="22"/>
+        </w:rPr>
+        <w:t xml:space="preserve"> = </w:t>
       </w:r>
       <w:r>
         <w:rPr>
@@ -12927,13 +13625,23 @@
           <w:szCs w:val="22"/>
         </w:rPr>
       </w:pPr>
-      <w:r>
-        <w:rPr>
-          <w:b w:val="0"/>
-          <w:sz w:val="22"/>
-          <w:szCs w:val="22"/>
-        </w:rPr>
-        <w:t>verificare che nel file /home/oracle/MEV-2019_21/</w:t>
+      <w:proofErr w:type="gramStart"/>
+      <w:r>
+        <w:rPr>
+          <w:b w:val="0"/>
+          <w:sz w:val="22"/>
+          <w:szCs w:val="22"/>
+        </w:rPr>
+        <w:t>verificare</w:t>
+      </w:r>
+      <w:proofErr w:type="gramEnd"/>
+      <w:r>
+        <w:rPr>
+          <w:b w:val="0"/>
+          <w:sz w:val="22"/>
+          <w:szCs w:val="22"/>
+        </w:rPr>
+        <w:t xml:space="preserve"> che nel file /home/oracle/MEV-2019_21/</w:t>
       </w:r>
       <w:r>
         <w:rPr>
@@ -13054,7 +13762,25 @@
           <w:sz w:val="22"/>
           <w:szCs w:val="22"/>
         </w:rPr>
-        <w:t xml:space="preserve">Per verificare l’aggiornamento effettuato al terzo punto eseguire quanto di seguito </w:t>
+        <w:t xml:space="preserve">Per verificare l’aggiornamento effettuato al terzo punto eseguire quanto di </w:t>
+      </w:r>
+      <w:proofErr w:type="gramStart"/>
+      <w:r>
+        <w:rPr>
+          <w:b w:val="0"/>
+          <w:sz w:val="22"/>
+          <w:szCs w:val="22"/>
+        </w:rPr>
+        <w:t>seguito</w:t>
+      </w:r>
+      <w:proofErr w:type="gramEnd"/>
+      <w:r>
+        <w:rPr>
+          <w:b w:val="0"/>
+          <w:sz w:val="22"/>
+          <w:szCs w:val="22"/>
+        </w:rPr>
+        <w:t xml:space="preserve"> </w:t>
       </w:r>
     </w:p>
     <w:p>
@@ -13072,7 +13798,23 @@
           <w:sz w:val="22"/>
           <w:szCs w:val="22"/>
         </w:rPr>
-        <w:t xml:space="preserve">SELECT COUNT(*) FROM COMUNE </w:t>
+        <w:t>SELECT COUNT</w:t>
+      </w:r>
+      <w:proofErr w:type="gramStart"/>
+      <w:r>
+        <w:rPr>
+          <w:sz w:val="22"/>
+          <w:szCs w:val="22"/>
+        </w:rPr>
+        <w:t>(</w:t>
+      </w:r>
+      <w:proofErr w:type="gramEnd"/>
+      <w:r>
+        <w:rPr>
+          <w:sz w:val="22"/>
+          <w:szCs w:val="22"/>
+        </w:rPr>
+        <w:t xml:space="preserve">*) FROM COMUNE </w:t>
       </w:r>
     </w:p>
     <w:p>
@@ -13086,13 +13828,23 @@
           <w:szCs w:val="22"/>
         </w:rPr>
       </w:pPr>
-      <w:r>
-        <w:rPr>
-          <w:b w:val="0"/>
-          <w:sz w:val="22"/>
-          <w:szCs w:val="22"/>
-        </w:rPr>
-        <w:t>il risultato deve essere 13327.</w:t>
+      <w:proofErr w:type="gramStart"/>
+      <w:r>
+        <w:rPr>
+          <w:b w:val="0"/>
+          <w:sz w:val="22"/>
+          <w:szCs w:val="22"/>
+        </w:rPr>
+        <w:t>il</w:t>
+      </w:r>
+      <w:proofErr w:type="gramEnd"/>
+      <w:r>
+        <w:rPr>
+          <w:b w:val="0"/>
+          <w:sz w:val="22"/>
+          <w:szCs w:val="22"/>
+        </w:rPr>
+        <w:t xml:space="preserve"> risultato deve essere 13327.</w:t>
       </w:r>
     </w:p>
     <w:p>
@@ -13115,7 +13867,25 @@
           <w:sz w:val="22"/>
           <w:szCs w:val="22"/>
         </w:rPr>
-        <w:t xml:space="preserve">Per verificare l’aggiornamento effettuato al quarto punto eseguire quanto di seguito </w:t>
+        <w:t xml:space="preserve">Per verificare l’aggiornamento effettuato al quarto punto eseguire quanto di </w:t>
+      </w:r>
+      <w:proofErr w:type="gramStart"/>
+      <w:r>
+        <w:rPr>
+          <w:b w:val="0"/>
+          <w:sz w:val="22"/>
+          <w:szCs w:val="22"/>
+        </w:rPr>
+        <w:t>seguito</w:t>
+      </w:r>
+      <w:proofErr w:type="gramEnd"/>
+      <w:r>
+        <w:rPr>
+          <w:b w:val="0"/>
+          <w:sz w:val="22"/>
+          <w:szCs w:val="22"/>
+        </w:rPr>
+        <w:t xml:space="preserve"> </w:t>
       </w:r>
     </w:p>
     <w:p>
@@ -13135,7 +13905,25 @@
           <w:szCs w:val="22"/>
           <w:lang w:val="en-GB"/>
         </w:rPr>
-        <w:t xml:space="preserve">SELECT COUNT(*) FROM CG_REF_CODES WHERE RV_DOMAIN = 'PROVINCIA' </w:t>
+        <w:t xml:space="preserve">SELECT </w:t>
+      </w:r>
+      <w:proofErr w:type="gramStart"/>
+      <w:r>
+        <w:rPr>
+          <w:sz w:val="22"/>
+          <w:szCs w:val="22"/>
+          <w:lang w:val="en-GB"/>
+        </w:rPr>
+        <w:t>COUNT(</w:t>
+      </w:r>
+      <w:proofErr w:type="gramEnd"/>
+      <w:r>
+        <w:rPr>
+          <w:sz w:val="22"/>
+          <w:szCs w:val="22"/>
+          <w:lang w:val="en-GB"/>
+        </w:rPr>
+        <w:t xml:space="preserve">*) FROM CG_REF_CODES WHERE RV_DOMAIN = 'PROVINCIA' </w:t>
       </w:r>
     </w:p>
     <w:p>
@@ -13149,13 +13937,23 @@
           <w:szCs w:val="22"/>
         </w:rPr>
       </w:pPr>
-      <w:r>
-        <w:rPr>
-          <w:b w:val="0"/>
-          <w:sz w:val="22"/>
-          <w:szCs w:val="22"/>
-        </w:rPr>
-        <w:t>il risultato deve</w:t>
+      <w:proofErr w:type="gramStart"/>
+      <w:r>
+        <w:rPr>
+          <w:b w:val="0"/>
+          <w:sz w:val="22"/>
+          <w:szCs w:val="22"/>
+        </w:rPr>
+        <w:t>il</w:t>
+      </w:r>
+      <w:proofErr w:type="gramEnd"/>
+      <w:r>
+        <w:rPr>
+          <w:b w:val="0"/>
+          <w:sz w:val="22"/>
+          <w:szCs w:val="22"/>
+        </w:rPr>
+        <w:t xml:space="preserve"> risultato deve</w:t>
       </w:r>
       <w:r>
         <w:rPr>
@@ -13195,8 +13993,18 @@
           <w:sz w:val="22"/>
           <w:szCs w:val="22"/>
         </w:rPr>
-        <w:t>Per verificare l’aggiornamento effettuato al quinto punto eseguire quanto di seguito</w:t>
-      </w:r>
+        <w:t xml:space="preserve">Per verificare l’aggiornamento effettuato al quinto punto eseguire quanto di </w:t>
+      </w:r>
+      <w:proofErr w:type="gramStart"/>
+      <w:r>
+        <w:rPr>
+          <w:b w:val="0"/>
+          <w:sz w:val="22"/>
+          <w:szCs w:val="22"/>
+        </w:rPr>
+        <w:t>seguito</w:t>
+      </w:r>
+      <w:proofErr w:type="gramEnd"/>
     </w:p>
     <w:p>
       <w:pPr>
@@ -13229,13 +14037,23 @@
           <w:szCs w:val="22"/>
         </w:rPr>
       </w:pPr>
-      <w:r>
-        <w:rPr>
-          <w:rFonts w:asciiTheme="minorHAnsi" w:hAnsiTheme="minorHAnsi" w:cstheme="minorHAnsi"/>
-          <w:sz w:val="22"/>
-          <w:szCs w:val="22"/>
-        </w:rPr>
-        <w:t>verificare che nell’elenco sia presente il record con RV_LOW_VALUE = 21</w:t>
+      <w:proofErr w:type="gramStart"/>
+      <w:r>
+        <w:rPr>
+          <w:rFonts w:asciiTheme="minorHAnsi" w:hAnsiTheme="minorHAnsi" w:cstheme="minorHAnsi"/>
+          <w:sz w:val="22"/>
+          <w:szCs w:val="22"/>
+        </w:rPr>
+        <w:t>verificare</w:t>
+      </w:r>
+      <w:proofErr w:type="gramEnd"/>
+      <w:r>
+        <w:rPr>
+          <w:rFonts w:asciiTheme="minorHAnsi" w:hAnsiTheme="minorHAnsi" w:cstheme="minorHAnsi"/>
+          <w:sz w:val="22"/>
+          <w:szCs w:val="22"/>
+        </w:rPr>
+        <w:t xml:space="preserve"> che nell’elenco sia presente il record con RV_LOW_VALUE = 21</w:t>
       </w:r>
     </w:p>
     <w:p>
@@ -13258,8 +14076,18 @@
           <w:sz w:val="22"/>
           <w:szCs w:val="22"/>
         </w:rPr>
-        <w:t>Per verificare l’aggiornamento effettuato al sesto punto eseguire quanto di seguito</w:t>
-      </w:r>
+        <w:t xml:space="preserve">Per verificare l’aggiornamento effettuato al sesto punto eseguire quanto di </w:t>
+      </w:r>
+      <w:proofErr w:type="gramStart"/>
+      <w:r>
+        <w:rPr>
+          <w:b w:val="0"/>
+          <w:sz w:val="22"/>
+          <w:szCs w:val="22"/>
+        </w:rPr>
+        <w:t>seguito</w:t>
+      </w:r>
+      <w:proofErr w:type="gramEnd"/>
     </w:p>
     <w:p>
       <w:pPr>
@@ -13292,13 +14120,23 @@
           <w:szCs w:val="22"/>
         </w:rPr>
       </w:pPr>
-      <w:r>
-        <w:rPr>
-          <w:rFonts w:asciiTheme="minorHAnsi" w:hAnsiTheme="minorHAnsi" w:cstheme="minorHAnsi"/>
-          <w:sz w:val="22"/>
-          <w:szCs w:val="22"/>
-        </w:rPr>
-        <w:t>il risultato deve essere 269.</w:t>
+      <w:proofErr w:type="gramStart"/>
+      <w:r>
+        <w:rPr>
+          <w:rFonts w:asciiTheme="minorHAnsi" w:hAnsiTheme="minorHAnsi" w:cstheme="minorHAnsi"/>
+          <w:sz w:val="22"/>
+          <w:szCs w:val="22"/>
+        </w:rPr>
+        <w:t>il</w:t>
+      </w:r>
+      <w:proofErr w:type="gramEnd"/>
+      <w:r>
+        <w:rPr>
+          <w:rFonts w:asciiTheme="minorHAnsi" w:hAnsiTheme="minorHAnsi" w:cstheme="minorHAnsi"/>
+          <w:sz w:val="22"/>
+          <w:szCs w:val="22"/>
+        </w:rPr>
+        <w:t xml:space="preserve"> risultato deve essere 269.</w:t>
       </w:r>
     </w:p>
     <w:p>
@@ -13321,8 +14159,18 @@
           <w:sz w:val="22"/>
           <w:szCs w:val="22"/>
         </w:rPr>
-        <w:t>Per verificare l’aggiornamento effettuato all’ottavo punto eseguire quanto di seguito</w:t>
-      </w:r>
+        <w:t xml:space="preserve">Per verificare l’aggiornamento effettuato all’ottavo punto eseguire quanto di </w:t>
+      </w:r>
+      <w:proofErr w:type="gramStart"/>
+      <w:r>
+        <w:rPr>
+          <w:b w:val="0"/>
+          <w:sz w:val="22"/>
+          <w:szCs w:val="22"/>
+        </w:rPr>
+        <w:t>seguito</w:t>
+      </w:r>
+      <w:proofErr w:type="gramEnd"/>
     </w:p>
     <w:p>
       <w:pPr>
@@ -13343,7 +14191,29 @@
           <w:szCs w:val="22"/>
           <w:lang w:val="en-GB"/>
         </w:rPr>
-        <w:t>SELECT COUNT(*) FROM CODICI_SIES_NSC WHERE CO_DOMAIN = 'COMUNE'</w:t>
+        <w:t xml:space="preserve">SELECT </w:t>
+      </w:r>
+      <w:proofErr w:type="gramStart"/>
+      <w:r>
+        <w:rPr>
+          <w:rFonts w:asciiTheme="minorHAnsi" w:hAnsiTheme="minorHAnsi" w:cstheme="minorHAnsi"/>
+          <w:b/>
+          <w:sz w:val="22"/>
+          <w:szCs w:val="22"/>
+          <w:lang w:val="en-GB"/>
+        </w:rPr>
+        <w:t>COUNT(</w:t>
+      </w:r>
+      <w:proofErr w:type="gramEnd"/>
+      <w:r>
+        <w:rPr>
+          <w:rFonts w:asciiTheme="minorHAnsi" w:hAnsiTheme="minorHAnsi" w:cstheme="minorHAnsi"/>
+          <w:b/>
+          <w:sz w:val="22"/>
+          <w:szCs w:val="22"/>
+          <w:lang w:val="en-GB"/>
+        </w:rPr>
+        <w:t>*) FROM CODICI_SIES_NSC WHERE CO_DOMAIN = 'COMUNE'</w:t>
       </w:r>
     </w:p>
     <w:p>
@@ -13355,13 +14225,23 @@
           <w:szCs w:val="22"/>
         </w:rPr>
       </w:pPr>
-      <w:r>
-        <w:rPr>
-          <w:rFonts w:asciiTheme="minorHAnsi" w:hAnsiTheme="minorHAnsi" w:cstheme="minorHAnsi"/>
-          <w:sz w:val="22"/>
-          <w:szCs w:val="22"/>
-        </w:rPr>
-        <w:t>il risultato deve essere 8607.</w:t>
+      <w:proofErr w:type="gramStart"/>
+      <w:r>
+        <w:rPr>
+          <w:rFonts w:asciiTheme="minorHAnsi" w:hAnsiTheme="minorHAnsi" w:cstheme="minorHAnsi"/>
+          <w:sz w:val="22"/>
+          <w:szCs w:val="22"/>
+        </w:rPr>
+        <w:t>il</w:t>
+      </w:r>
+      <w:proofErr w:type="gramEnd"/>
+      <w:r>
+        <w:rPr>
+          <w:rFonts w:asciiTheme="minorHAnsi" w:hAnsiTheme="minorHAnsi" w:cstheme="minorHAnsi"/>
+          <w:sz w:val="22"/>
+          <w:szCs w:val="22"/>
+        </w:rPr>
+        <w:t xml:space="preserve"> risultato deve essere 8607.</w:t>
       </w:r>
     </w:p>
     <w:p>
@@ -13400,8 +14280,18 @@
           <w:sz w:val="22"/>
           <w:szCs w:val="22"/>
         </w:rPr>
-        <w:t xml:space="preserve"> punto eseguire quanto di seguito</w:t>
-      </w:r>
+        <w:t xml:space="preserve"> punto eseguire quanto di </w:t>
+      </w:r>
+      <w:proofErr w:type="gramStart"/>
+      <w:r>
+        <w:rPr>
+          <w:b w:val="0"/>
+          <w:sz w:val="22"/>
+          <w:szCs w:val="22"/>
+        </w:rPr>
+        <w:t>seguito</w:t>
+      </w:r>
+      <w:proofErr w:type="gramEnd"/>
     </w:p>
     <w:p>
       <w:pPr>
@@ -13422,7 +14312,29 @@
           <w:szCs w:val="22"/>
           <w:lang w:val="en-GB"/>
         </w:rPr>
-        <w:t>SELECT COUNT(*) FROM CODICI_SIES_NSC WHERE CO_DOMAIN = 'NAZIONE'</w:t>
+        <w:t xml:space="preserve">SELECT </w:t>
+      </w:r>
+      <w:proofErr w:type="gramStart"/>
+      <w:r>
+        <w:rPr>
+          <w:rFonts w:asciiTheme="minorHAnsi" w:hAnsiTheme="minorHAnsi" w:cstheme="minorHAnsi"/>
+          <w:b/>
+          <w:sz w:val="22"/>
+          <w:szCs w:val="22"/>
+          <w:lang w:val="en-GB"/>
+        </w:rPr>
+        <w:t>COUNT(</w:t>
+      </w:r>
+      <w:proofErr w:type="gramEnd"/>
+      <w:r>
+        <w:rPr>
+          <w:rFonts w:asciiTheme="minorHAnsi" w:hAnsiTheme="minorHAnsi" w:cstheme="minorHAnsi"/>
+          <w:b/>
+          <w:sz w:val="22"/>
+          <w:szCs w:val="22"/>
+          <w:lang w:val="en-GB"/>
+        </w:rPr>
+        <w:t>*) FROM CODICI_SIES_NSC WHERE CO_DOMAIN = 'NAZIONE'</w:t>
       </w:r>
     </w:p>
     <w:p>
@@ -13434,13 +14346,23 @@
           <w:szCs w:val="22"/>
         </w:rPr>
       </w:pPr>
-      <w:r>
-        <w:rPr>
-          <w:rFonts w:asciiTheme="minorHAnsi" w:hAnsiTheme="minorHAnsi" w:cstheme="minorHAnsi"/>
-          <w:sz w:val="22"/>
-          <w:szCs w:val="22"/>
-        </w:rPr>
-        <w:t>il risultato deve essere</w:t>
+      <w:proofErr w:type="gramStart"/>
+      <w:r>
+        <w:rPr>
+          <w:rFonts w:asciiTheme="minorHAnsi" w:hAnsiTheme="minorHAnsi" w:cstheme="minorHAnsi"/>
+          <w:sz w:val="22"/>
+          <w:szCs w:val="22"/>
+        </w:rPr>
+        <w:t>il</w:t>
+      </w:r>
+      <w:proofErr w:type="gramEnd"/>
+      <w:r>
+        <w:rPr>
+          <w:rFonts w:asciiTheme="minorHAnsi" w:hAnsiTheme="minorHAnsi" w:cstheme="minorHAnsi"/>
+          <w:sz w:val="22"/>
+          <w:szCs w:val="22"/>
+        </w:rPr>
+        <w:t xml:space="preserve"> risultato deve essere</w:t>
       </w:r>
       <w:r>
         <w:rPr>
@@ -13495,7 +14417,27 @@
           <w:sz w:val="22"/>
           <w:szCs w:val="22"/>
         </w:rPr>
-        <w:t xml:space="preserve">In caso di esito positivo delle su riportate attività LE TABELLE DI BACKUP </w:t>
+        <w:t xml:space="preserve">In caso di esito positivo </w:t>
+      </w:r>
+      <w:proofErr w:type="gramStart"/>
+      <w:r>
+        <w:rPr>
+          <w:rFonts w:asciiTheme="minorHAnsi" w:hAnsiTheme="minorHAnsi" w:cstheme="minorHAnsi"/>
+          <w:b/>
+          <w:sz w:val="22"/>
+          <w:szCs w:val="22"/>
+        </w:rPr>
+        <w:t>delle su</w:t>
+      </w:r>
+      <w:proofErr w:type="gramEnd"/>
+      <w:r>
+        <w:rPr>
+          <w:rFonts w:asciiTheme="minorHAnsi" w:hAnsiTheme="minorHAnsi" w:cstheme="minorHAnsi"/>
+          <w:b/>
+          <w:sz w:val="22"/>
+          <w:szCs w:val="22"/>
+        </w:rPr>
+        <w:t xml:space="preserve"> riportate attività LE TABELLE DI BACKUP </w:t>
       </w:r>
       <w:r>
         <w:rPr>
@@ -13579,7 +14521,7 @@
           <w:szCs w:val="24"/>
         </w:rPr>
       </w:pPr>
-      <w:bookmarkStart w:id="62" w:name="_Toc120098412"/>
+      <w:bookmarkStart w:id="62" w:name="_Toc159427133"/>
       <w:r>
         <w:rPr>
           <w:rFonts w:asciiTheme="minorHAnsi" w:hAnsiTheme="minorHAnsi" w:cstheme="minorHAnsi"/>
@@ -13594,9 +14536,19 @@
           <w:color w:val="365F91" w:themeColor="accent1" w:themeShade="BF"/>
           <w:szCs w:val="24"/>
         </w:rPr>
-        <w:t xml:space="preserve"> - STEP 2</w:t>
+        <w:t xml:space="preserve"> - STEP </w:t>
+      </w:r>
+      <w:proofErr w:type="gramStart"/>
+      <w:r>
+        <w:rPr>
+          <w:rFonts w:asciiTheme="minorHAnsi" w:hAnsiTheme="minorHAnsi" w:cstheme="minorHAnsi"/>
+          <w:color w:val="365F91" w:themeColor="accent1" w:themeShade="BF"/>
+          <w:szCs w:val="24"/>
+        </w:rPr>
+        <w:t>2</w:t>
       </w:r>
       <w:bookmarkEnd w:id="62"/>
+      <w:proofErr w:type="gramEnd"/>
     </w:p>
     <w:p>
       <w:pPr>
@@ -13614,7 +14566,27 @@
           <w:sz w:val="22"/>
           <w:szCs w:val="22"/>
         </w:rPr>
-        <w:t>In caso di errori verificatisi nell’esecuzione di uno degli step precedenti, a seguito indicazioni dell’help desk del</w:t>
+        <w:t xml:space="preserve">In caso di errori verificatisi nell’esecuzione di uno </w:t>
+      </w:r>
+      <w:proofErr w:type="gramStart"/>
+      <w:r>
+        <w:rPr>
+          <w:rFonts w:asciiTheme="minorHAnsi" w:hAnsiTheme="minorHAnsi" w:cstheme="minorHAnsi"/>
+          <w:b/>
+          <w:sz w:val="22"/>
+          <w:szCs w:val="22"/>
+        </w:rPr>
+        <w:t>degli</w:t>
+      </w:r>
+      <w:proofErr w:type="gramEnd"/>
+      <w:r>
+        <w:rPr>
+          <w:rFonts w:asciiTheme="minorHAnsi" w:hAnsiTheme="minorHAnsi" w:cstheme="minorHAnsi"/>
+          <w:b/>
+          <w:sz w:val="22"/>
+          <w:szCs w:val="22"/>
+        </w:rPr>
+        <w:t xml:space="preserve"> step precedenti, a seguito indicazioni dell’help desk del</w:t>
       </w:r>
       <w:r>
         <w:rPr>
@@ -13673,8 +14645,8 @@
       </w:pPr>
       <w:bookmarkStart w:id="63" w:name="_Toc27745472"/>
       <w:bookmarkStart w:id="64" w:name="_Hlk38463271"/>
-      <w:bookmarkStart w:id="65" w:name="_Toc120098413"/>
-      <w:bookmarkEnd w:id="57"/>
+      <w:bookmarkStart w:id="65" w:name="_Toc159427134"/>
+      <w:bookmarkEnd w:id="58"/>
       <w:r>
         <w:rPr>
           <w:rFonts w:asciiTheme="minorHAnsi" w:hAnsiTheme="minorHAnsi" w:cstheme="minorHAnsi"/>
@@ -13710,7 +14682,7 @@
           <w:szCs w:val="24"/>
         </w:rPr>
       </w:pPr>
-      <w:bookmarkStart w:id="66" w:name="_Toc120098414"/>
+      <w:bookmarkStart w:id="66" w:name="_Toc159427135"/>
       <w:bookmarkEnd w:id="64"/>
       <w:r>
         <w:rPr>
@@ -13738,6 +14710,7 @@
           <w:szCs w:val="22"/>
         </w:rPr>
       </w:pPr>
+      <w:proofErr w:type="gramStart"/>
       <w:r>
         <w:rPr>
           <w:b w:val="0"/>
@@ -13746,6 +14719,7 @@
         </w:rPr>
         <w:t>Aprire una shell linux sul server SIES e loggarsi come utente “root”;</w:t>
       </w:r>
+      <w:proofErr w:type="gramEnd"/>
     </w:p>
     <w:p>
       <w:pPr>
@@ -13760,6 +14734,7 @@
           <w:szCs w:val="22"/>
         </w:rPr>
       </w:pPr>
+      <w:proofErr w:type="gramStart"/>
       <w:r>
         <w:rPr>
           <w:b w:val="0"/>
@@ -13774,7 +14749,16 @@
           <w:sz w:val="22"/>
           <w:szCs w:val="22"/>
         </w:rPr>
-        <w:t>osizionarsi sotto la cartella:</w:t>
+        <w:t>osizionarsi</w:t>
+      </w:r>
+      <w:proofErr w:type="gramEnd"/>
+      <w:r>
+        <w:rPr>
+          <w:b w:val="0"/>
+          <w:sz w:val="22"/>
+          <w:szCs w:val="22"/>
+        </w:rPr>
+        <w:t xml:space="preserve"> sotto la cartella:</w:t>
       </w:r>
     </w:p>
     <w:p>
@@ -13828,13 +14812,23 @@
           <w:szCs w:val="22"/>
         </w:rPr>
       </w:pPr>
-      <w:r>
-        <w:rPr>
-          <w:b w:val="0"/>
-          <w:sz w:val="22"/>
-          <w:szCs w:val="22"/>
-        </w:rPr>
-        <w:t>Editare il file “f3b.properties” ed aggiungere alla fine del file le seguenti righe:</w:t>
+      <w:proofErr w:type="gramStart"/>
+      <w:r>
+        <w:rPr>
+          <w:b w:val="0"/>
+          <w:sz w:val="22"/>
+          <w:szCs w:val="22"/>
+        </w:rPr>
+        <w:t>Editare</w:t>
+      </w:r>
+      <w:proofErr w:type="gramEnd"/>
+      <w:r>
+        <w:rPr>
+          <w:b w:val="0"/>
+          <w:sz w:val="22"/>
+          <w:szCs w:val="22"/>
+        </w:rPr>
+        <w:t xml:space="preserve"> il file “f3b.properties” ed aggiungere alla fine del file le seguenti righe:</w:t>
       </w:r>
     </w:p>
     <w:p>
@@ -13899,8 +14893,17 @@
           <w:sz w:val="22"/>
           <w:szCs w:val="22"/>
         </w:rPr>
-        <w:t xml:space="preserve">http://reginde.processotelematico.giustizia.it/ServiziInterrogazioneRegindeExt/ServiziInterrogazioneInterni  </w:t>
-      </w:r>
+        <w:t>http://reginde.processotelematico.giustizia.it/ServiziInterrogazioneRegindeExt/ServiziInterrogazioneInterni</w:t>
+      </w:r>
+      <w:proofErr w:type="gramStart"/>
+      <w:r>
+        <w:rPr>
+          <w:sz w:val="22"/>
+          <w:szCs w:val="22"/>
+        </w:rPr>
+        <w:t xml:space="preserve">  </w:t>
+      </w:r>
+      <w:proofErr w:type="gramEnd"/>
     </w:p>
     <w:p>
       <w:pPr>
@@ -13923,6 +14926,7 @@
         </w:rPr>
         <w:t xml:space="preserve"> </w:t>
       </w:r>
+      <w:proofErr w:type="gramStart"/>
       <w:r>
         <w:rPr>
           <w:b w:val="0"/>
@@ -13931,6 +14935,7 @@
         </w:rPr>
         <w:t>oppure</w:t>
       </w:r>
+      <w:proofErr w:type="gramEnd"/>
       <w:r>
         <w:rPr>
           <w:b w:val="0"/>
@@ -14016,7 +15021,25 @@
           <w:sz w:val="22"/>
           <w:szCs w:val="22"/>
         </w:rPr>
-        <w:t>NB: Tali valori devono essere parametrizzati in base all’ambiente di installazione del servizio reso disponibile dal sistema REGINDE per la verifica di conformità.</w:t>
+        <w:t xml:space="preserve">NB: Tali valori </w:t>
+      </w:r>
+      <w:proofErr w:type="gramStart"/>
+      <w:r>
+        <w:rPr>
+          <w:b w:val="0"/>
+          <w:sz w:val="22"/>
+          <w:szCs w:val="22"/>
+        </w:rPr>
+        <w:t>devono</w:t>
+      </w:r>
+      <w:proofErr w:type="gramEnd"/>
+      <w:r>
+        <w:rPr>
+          <w:b w:val="0"/>
+          <w:sz w:val="22"/>
+          <w:szCs w:val="22"/>
+        </w:rPr>
+        <w:t xml:space="preserve"> essere parametrizzati in base all’ambiente di installazione del servizio reso disponibile dal sistema REGINDE per la verifica di conformità.</w:t>
       </w:r>
     </w:p>
     <w:p>
@@ -14053,7 +15076,16 @@
           <w:sz w:val="22"/>
           <w:szCs w:val="22"/>
         </w:rPr>
-        <w:t xml:space="preserve">, proseguire con i passi di cui al punto </w:t>
+        <w:t xml:space="preserve">, proseguire con i passi di cui </w:t>
+      </w:r>
+      <w:proofErr w:type="gramStart"/>
+      <w:r>
+        <w:rPr>
+          <w:b w:val="0"/>
+          <w:sz w:val="22"/>
+          <w:szCs w:val="22"/>
+        </w:rPr>
+        <w:t xml:space="preserve">al punto </w:t>
       </w:r>
       <w:r>
         <w:rPr>
@@ -14079,6 +15111,7 @@
         </w:rPr>
         <w:t>8</w:t>
       </w:r>
+      <w:proofErr w:type="gramEnd"/>
       <w:r>
         <w:rPr>
           <w:b w:val="0"/>
@@ -14135,13 +15168,23 @@
           <w:szCs w:val="22"/>
         </w:rPr>
       </w:pPr>
-      <w:r>
-        <w:rPr>
-          <w:b w:val="0"/>
-          <w:sz w:val="22"/>
-          <w:szCs w:val="22"/>
-        </w:rPr>
-        <w:t>Posizionarsi sotto la cartella:</w:t>
+      <w:proofErr w:type="gramStart"/>
+      <w:r>
+        <w:rPr>
+          <w:b w:val="0"/>
+          <w:sz w:val="22"/>
+          <w:szCs w:val="22"/>
+        </w:rPr>
+        <w:t>Posizionarsi</w:t>
+      </w:r>
+      <w:proofErr w:type="gramEnd"/>
+      <w:r>
+        <w:rPr>
+          <w:b w:val="0"/>
+          <w:sz w:val="22"/>
+          <w:szCs w:val="22"/>
+        </w:rPr>
+        <w:t xml:space="preserve"> sotto la cartella:</w:t>
       </w:r>
     </w:p>
     <w:p>
@@ -14188,7 +15231,25 @@
           <w:sz w:val="22"/>
           <w:szCs w:val="22"/>
         </w:rPr>
-        <w:t xml:space="preserve">Proseguire con l’aggiornamento del file trustStore </w:t>
+        <w:t xml:space="preserve">Proseguire con l’aggiornamento del file </w:t>
+      </w:r>
+      <w:proofErr w:type="gramStart"/>
+      <w:r>
+        <w:rPr>
+          <w:b w:val="0"/>
+          <w:sz w:val="22"/>
+          <w:szCs w:val="22"/>
+        </w:rPr>
+        <w:t>trustStore</w:t>
+      </w:r>
+      <w:proofErr w:type="gramEnd"/>
+      <w:r>
+        <w:rPr>
+          <w:b w:val="0"/>
+          <w:sz w:val="22"/>
+          <w:szCs w:val="22"/>
+        </w:rPr>
+        <w:t xml:space="preserve"> </w:t>
       </w:r>
       <w:r>
         <w:rPr>
@@ -14250,7 +15311,25 @@
           <w:sz w:val="22"/>
           <w:szCs w:val="22"/>
         </w:rPr>
-        <w:t>Scaricare i files “sies.war” sul server SIES ed eseguire le seguenti operazioni:</w:t>
+        <w:t>Scaricare i files “</w:t>
+      </w:r>
+      <w:proofErr w:type="gramStart"/>
+      <w:r>
+        <w:rPr>
+          <w:b w:val="0"/>
+          <w:sz w:val="22"/>
+          <w:szCs w:val="22"/>
+        </w:rPr>
+        <w:t>sies.war</w:t>
+      </w:r>
+      <w:proofErr w:type="gramEnd"/>
+      <w:r>
+        <w:rPr>
+          <w:b w:val="0"/>
+          <w:sz w:val="22"/>
+          <w:szCs w:val="22"/>
+        </w:rPr>
+        <w:t>” sul server SIES ed eseguire le seguenti operazioni:</w:t>
       </w:r>
     </w:p>
     <w:p>
@@ -14269,13 +15348,23 @@
           <w:szCs w:val="22"/>
         </w:rPr>
       </w:pPr>
-      <w:r>
-        <w:rPr>
-          <w:b w:val="0"/>
-          <w:sz w:val="22"/>
-          <w:szCs w:val="22"/>
-        </w:rPr>
-        <w:t>posizionarsi sotto la cartella:</w:t>
+      <w:proofErr w:type="gramStart"/>
+      <w:r>
+        <w:rPr>
+          <w:b w:val="0"/>
+          <w:sz w:val="22"/>
+          <w:szCs w:val="22"/>
+        </w:rPr>
+        <w:t>posizionarsi</w:t>
+      </w:r>
+      <w:proofErr w:type="gramEnd"/>
+      <w:r>
+        <w:rPr>
+          <w:b w:val="0"/>
+          <w:sz w:val="22"/>
+          <w:szCs w:val="22"/>
+        </w:rPr>
+        <w:t xml:space="preserve"> sotto la cartella:</w:t>
       </w:r>
     </w:p>
     <w:p>
@@ -14312,13 +15401,23 @@
           <w:szCs w:val="22"/>
         </w:rPr>
       </w:pPr>
-      <w:r>
-        <w:rPr>
-          <w:b w:val="0"/>
-          <w:sz w:val="22"/>
-          <w:szCs w:val="22"/>
-        </w:rPr>
-        <w:t>cancellare il vecchio eseguibile (se esistente) “sies.war” e la copia deployata “sies.war.deployed”;</w:t>
+      <w:proofErr w:type="gramStart"/>
+      <w:r>
+        <w:rPr>
+          <w:b w:val="0"/>
+          <w:sz w:val="22"/>
+          <w:szCs w:val="22"/>
+        </w:rPr>
+        <w:t>cancellare</w:t>
+      </w:r>
+      <w:proofErr w:type="gramEnd"/>
+      <w:r>
+        <w:rPr>
+          <w:b w:val="0"/>
+          <w:sz w:val="22"/>
+          <w:szCs w:val="22"/>
+        </w:rPr>
+        <w:t xml:space="preserve"> il vecchio eseguibile (se esistente) “sies.war” e la copia deployata “sies.war.deployed”;</w:t>
       </w:r>
     </w:p>
     <w:p>
@@ -14337,13 +15436,23 @@
           <w:szCs w:val="22"/>
         </w:rPr>
       </w:pPr>
-      <w:r>
-        <w:rPr>
-          <w:b w:val="0"/>
-          <w:sz w:val="22"/>
-          <w:szCs w:val="22"/>
-        </w:rPr>
-        <w:t>copiare, nello stesso percorso, il nuovo eseguibile “sies.war”;</w:t>
+      <w:proofErr w:type="gramStart"/>
+      <w:r>
+        <w:rPr>
+          <w:b w:val="0"/>
+          <w:sz w:val="22"/>
+          <w:szCs w:val="22"/>
+        </w:rPr>
+        <w:t>copiare</w:t>
+      </w:r>
+      <w:proofErr w:type="gramEnd"/>
+      <w:r>
+        <w:rPr>
+          <w:b w:val="0"/>
+          <w:sz w:val="22"/>
+          <w:szCs w:val="22"/>
+        </w:rPr>
+        <w:t>, nello stesso percorso, il nuovo eseguibile “sies.war”;</w:t>
       </w:r>
     </w:p>
     <w:p>
@@ -14362,13 +15471,23 @@
           <w:szCs w:val="22"/>
         </w:rPr>
       </w:pPr>
-      <w:r>
-        <w:rPr>
-          <w:b w:val="0"/>
-          <w:sz w:val="22"/>
-          <w:szCs w:val="22"/>
-        </w:rPr>
-        <w:t>posizionarsi sotto la cartella:</w:t>
+      <w:proofErr w:type="gramStart"/>
+      <w:r>
+        <w:rPr>
+          <w:b w:val="0"/>
+          <w:sz w:val="22"/>
+          <w:szCs w:val="22"/>
+        </w:rPr>
+        <w:t>posizionarsi</w:t>
+      </w:r>
+      <w:proofErr w:type="gramEnd"/>
+      <w:r>
+        <w:rPr>
+          <w:b w:val="0"/>
+          <w:sz w:val="22"/>
+          <w:szCs w:val="22"/>
+        </w:rPr>
+        <w:t xml:space="preserve"> sotto la cartella:</w:t>
       </w:r>
     </w:p>
     <w:p>
@@ -14386,7 +15505,25 @@
           <w:sz w:val="22"/>
           <w:szCs w:val="22"/>
         </w:rPr>
-        <w:t>“/opt/jboss-eap-6.4/standalone”;</w:t>
+        <w:t>“/opt/</w:t>
+      </w:r>
+      <w:proofErr w:type="gramStart"/>
+      <w:r>
+        <w:rPr>
+          <w:rFonts w:asciiTheme="minorHAnsi" w:hAnsiTheme="minorHAnsi" w:cstheme="minorHAnsi"/>
+          <w:sz w:val="22"/>
+          <w:szCs w:val="22"/>
+        </w:rPr>
+        <w:t>jboss-eap-6</w:t>
+      </w:r>
+      <w:proofErr w:type="gramEnd"/>
+      <w:r>
+        <w:rPr>
+          <w:rFonts w:asciiTheme="minorHAnsi" w:hAnsiTheme="minorHAnsi" w:cstheme="minorHAnsi"/>
+          <w:sz w:val="22"/>
+          <w:szCs w:val="22"/>
+        </w:rPr>
+        <w:t>.4/standalone”;</w:t>
       </w:r>
     </w:p>
     <w:p>
@@ -14405,13 +15542,23 @@
           <w:szCs w:val="22"/>
         </w:rPr>
       </w:pPr>
-      <w:r>
-        <w:rPr>
-          <w:b w:val="0"/>
-          <w:sz w:val="22"/>
-          <w:szCs w:val="22"/>
-        </w:rPr>
-        <w:t>cancellare le cartelle “data”, “log” e “tmp” (se esistenti);</w:t>
+      <w:proofErr w:type="gramStart"/>
+      <w:r>
+        <w:rPr>
+          <w:b w:val="0"/>
+          <w:sz w:val="22"/>
+          <w:szCs w:val="22"/>
+        </w:rPr>
+        <w:t>cancellare</w:t>
+      </w:r>
+      <w:proofErr w:type="gramEnd"/>
+      <w:r>
+        <w:rPr>
+          <w:b w:val="0"/>
+          <w:sz w:val="22"/>
+          <w:szCs w:val="22"/>
+        </w:rPr>
+        <w:t xml:space="preserve"> le cartelle “data”, “log” e “tmp” (se esistenti);</w:t>
       </w:r>
     </w:p>
     <w:p>
@@ -14441,8 +15588,9 @@
           <w:sz w:val="22"/>
           <w:szCs w:val="22"/>
         </w:rPr>
-        <w:t xml:space="preserve">Attenzione!! Prima di avviare il server jboss assicurarsi di aver cancellato gli elementi già esistenti seguendo le istruzioni ai punti </w:t>
-      </w:r>
+        <w:t>Attenzione</w:t>
+      </w:r>
+      <w:proofErr w:type="gramStart"/>
       <w:r>
         <w:rPr>
           <w:rFonts w:asciiTheme="minorHAnsi" w:hAnsiTheme="minorHAnsi" w:cstheme="minorHAnsi"/>
@@ -14450,6 +15598,25 @@
           <w:sz w:val="22"/>
           <w:szCs w:val="22"/>
         </w:rPr>
+        <w:t>!!</w:t>
+      </w:r>
+      <w:proofErr w:type="gramEnd"/>
+      <w:r>
+        <w:rPr>
+          <w:rFonts w:asciiTheme="minorHAnsi" w:hAnsiTheme="minorHAnsi" w:cstheme="minorHAnsi"/>
+          <w:color w:val="FF0000"/>
+          <w:sz w:val="22"/>
+          <w:szCs w:val="22"/>
+        </w:rPr>
+        <w:t xml:space="preserve"> Prima di avviare il server jboss assicurarsi di aver cancellato gli elementi già esistenti seguendo le istruzioni ai punti </w:t>
+      </w:r>
+      <w:r>
+        <w:rPr>
+          <w:rFonts w:asciiTheme="minorHAnsi" w:hAnsiTheme="minorHAnsi" w:cstheme="minorHAnsi"/>
+          <w:color w:val="FF0000"/>
+          <w:sz w:val="22"/>
+          <w:szCs w:val="22"/>
+        </w:rPr>
         <w:t>6</w:t>
       </w:r>
       <w:r>
@@ -14461,6 +15628,7 @@
         </w:rPr>
         <w:t xml:space="preserve">.b e </w:t>
       </w:r>
+      <w:proofErr w:type="gramStart"/>
       <w:r>
         <w:rPr>
           <w:rFonts w:asciiTheme="minorHAnsi" w:hAnsiTheme="minorHAnsi" w:cstheme="minorHAnsi"/>
@@ -14495,7 +15663,17 @@
           <w:sz w:val="22"/>
           <w:szCs w:val="22"/>
         </w:rPr>
-        <w:t>. All’avvio, infatti, tali cartelle verranno ricreate.</w:t>
+        <w:t>.</w:t>
+      </w:r>
+      <w:proofErr w:type="gramEnd"/>
+      <w:r>
+        <w:rPr>
+          <w:rFonts w:asciiTheme="minorHAnsi" w:hAnsiTheme="minorHAnsi" w:cstheme="minorHAnsi"/>
+          <w:color w:val="FF0000"/>
+          <w:sz w:val="22"/>
+          <w:szCs w:val="22"/>
+        </w:rPr>
+        <w:t xml:space="preserve"> All’avvio, infatti, tali cartelle verranno ricreate.</w:t>
       </w:r>
     </w:p>
     <w:p>
@@ -14524,6 +15702,7 @@
           <w:szCs w:val="22"/>
         </w:rPr>
       </w:pPr>
+      <w:proofErr w:type="gramStart"/>
       <w:r>
         <w:rPr>
           <w:b w:val="0"/>
@@ -14532,6 +15711,7 @@
         </w:rPr>
         <w:t>Avviare il processo di gestione delle code tramite il comando: “/etc/init.d/imq start”.</w:t>
       </w:r>
+      <w:proofErr w:type="gramEnd"/>
     </w:p>
     <w:p>
       <w:pPr>
@@ -14550,7 +15730,25 @@
           <w:sz w:val="22"/>
           <w:szCs w:val="22"/>
         </w:rPr>
-        <w:t>Per verificare la partenza delle code si può analizzare il file di log “log.txt”, presente nel percorso “/var/mq/instances/imqbroker/log”, controllando al suo interno la presenza della dicitura “Broker 'imqbroker@nomemacchina:7676' pronto”;</w:t>
+        <w:t>Per verificare la partenza delle code si può analizzare il file di log “log.txt”, presente nel percorso “/var/mq/instances/imqbroker/log”, controllando al suo interno la presenza della dicitura “Broker</w:t>
+      </w:r>
+      <w:proofErr w:type="gramStart"/>
+      <w:r>
+        <w:rPr>
+          <w:b w:val="0"/>
+          <w:sz w:val="22"/>
+          <w:szCs w:val="22"/>
+        </w:rPr>
+        <w:t xml:space="preserve"> '</w:t>
+      </w:r>
+      <w:proofErr w:type="gramEnd"/>
+      <w:r>
+        <w:rPr>
+          <w:b w:val="0"/>
+          <w:sz w:val="22"/>
+          <w:szCs w:val="22"/>
+        </w:rPr>
+        <w:t>imqbroker@nomemacchina:7676' pronto”;</w:t>
       </w:r>
     </w:p>
     <w:p>
@@ -14576,7 +15774,25 @@
           <w:szCs w:val="22"/>
         </w:rPr>
         <w:lastRenderedPageBreak/>
-        <w:t>Avviare il server jboss tramite il comando “service jboss start” e controllare l’avvenuta esecuzione dell’istruzione tramite il comando: “service jboss status”.</w:t>
+        <w:t>Avviare il server jboss tramite il comando “service jboss start” e controllare l’avvenuta esecuzione dell’istruzione tramite il comando: “</w:t>
+      </w:r>
+      <w:proofErr w:type="gramStart"/>
+      <w:r>
+        <w:rPr>
+          <w:b w:val="0"/>
+          <w:sz w:val="22"/>
+          <w:szCs w:val="22"/>
+        </w:rPr>
+        <w:t>service</w:t>
+      </w:r>
+      <w:proofErr w:type="gramEnd"/>
+      <w:r>
+        <w:rPr>
+          <w:b w:val="0"/>
+          <w:sz w:val="22"/>
+          <w:szCs w:val="22"/>
+        </w:rPr>
+        <w:t xml:space="preserve"> jboss status”.</w:t>
       </w:r>
     </w:p>
     <w:p>
@@ -14598,7 +15814,7 @@
           <w:szCs w:val="24"/>
         </w:rPr>
       </w:pPr>
-      <w:bookmarkStart w:id="67" w:name="_Toc120098415"/>
+      <w:bookmarkStart w:id="67" w:name="_Toc159427136"/>
       <w:r>
         <w:rPr>
           <w:rFonts w:asciiTheme="minorHAnsi" w:hAnsiTheme="minorHAnsi" w:cstheme="minorHAnsi"/>
@@ -14616,12 +15832,21 @@
           <w:szCs w:val="22"/>
         </w:rPr>
       </w:pPr>
-      <w:r>
-        <w:rPr>
-          <w:sz w:val="22"/>
-          <w:szCs w:val="22"/>
-        </w:rPr>
-        <w:t>N.A.</w:t>
+      <w:proofErr w:type="gramStart"/>
+      <w:r>
+        <w:rPr>
+          <w:sz w:val="22"/>
+          <w:szCs w:val="22"/>
+        </w:rPr>
+        <w:t>N.A</w:t>
+      </w:r>
+      <w:proofErr w:type="gramEnd"/>
+      <w:r>
+        <w:rPr>
+          <w:sz w:val="22"/>
+          <w:szCs w:val="22"/>
+        </w:rPr>
+        <w:t>.</w:t>
       </w:r>
     </w:p>
     <w:p>
@@ -14643,7 +15868,7 @@
           <w:szCs w:val="24"/>
         </w:rPr>
       </w:pPr>
-      <w:bookmarkStart w:id="68" w:name="_Toc120098416"/>
+      <w:bookmarkStart w:id="68" w:name="_Toc159427137"/>
       <w:r>
         <w:rPr>
           <w:rFonts w:asciiTheme="minorHAnsi" w:hAnsiTheme="minorHAnsi" w:cstheme="minorHAnsi"/>
@@ -14663,12 +15888,21 @@
           <w:sz w:val="22"/>
         </w:rPr>
       </w:pPr>
-      <w:r>
-        <w:rPr>
-          <w:sz w:val="22"/>
-        </w:rPr>
-        <w:t>N.A.</w:t>
-      </w:r>
+      <w:proofErr w:type="gramStart"/>
+      <w:r>
+        <w:rPr>
+          <w:sz w:val="22"/>
+        </w:rPr>
+        <w:t>N.A</w:t>
+      </w:r>
+      <w:proofErr w:type="gramEnd"/>
+      <w:r>
+        <w:rPr>
+          <w:sz w:val="22"/>
+        </w:rPr>
+        <w:t>.</w:t>
+      </w:r>
+      <w:bookmarkEnd w:id="0"/>
     </w:p>
     <w:sectPr>
       <w:headerReference w:type="default" r:id="rId10"/>
@@ -14772,6 +16006,7 @@
             </w:rPr>
             <w:fldChar w:fldCharType="separate"/>
           </w:r>
+          <w:proofErr w:type="gramStart"/>
           <w:r>
             <w:rPr>
               <w:rFonts w:asciiTheme="minorHAnsi" w:hAnsiTheme="minorHAnsi" w:cstheme="minorHAnsi"/>
@@ -14779,7 +16014,17 @@
               <w:sz w:val="16"/>
               <w:szCs w:val="22"/>
             </w:rPr>
-            <w:t>SIUT-SIES-PR-1.6-20221125-Piano_di_Rilascio_021_RegInde_SIES</w:t>
+            <w:t>SIUT-SIES-PR-1</w:t>
+          </w:r>
+          <w:proofErr w:type="gramEnd"/>
+          <w:r>
+            <w:rPr>
+              <w:rFonts w:asciiTheme="minorHAnsi" w:hAnsiTheme="minorHAnsi" w:cstheme="minorHAnsi"/>
+              <w:color w:val="404040"/>
+              <w:sz w:val="16"/>
+              <w:szCs w:val="22"/>
+            </w:rPr>
+            <w:t>.6-20221125-Piano_di_Rilascio_021_RegInde_SIES</w:t>
           </w:r>
           <w:r>
             <w:rPr>
@@ -21820,7 +23065,7 @@
 </file>
 
 <file path=customXml/itemProps1.xml><?xml version="1.0" encoding="utf-8"?>
-<ds:datastoreItem xmlns:ds="http://schemas.openxmlformats.org/officeDocument/2006/customXml" ds:itemID="{9FE38EB3-B4F2-4088-8834-7C0B56C2B443}">
+<ds:datastoreItem xmlns:ds="http://schemas.openxmlformats.org/officeDocument/2006/customXml" ds:itemID="{AB9C3F22-82FB-40DC-B6B9-BEA5496ADF37}">
   <ds:schemaRefs>
     <ds:schemaRef ds:uri="http://schemas.openxmlformats.org/officeDocument/2006/bibliography"/>
   </ds:schemaRefs>

</xml_diff>

<commit_message>
Rilascio_20250228-V_S_12.7.1.0 (Patch Mesi di Gennaio, Febbraio 2025)
</commit_message>
<xml_diff>
--- a/MEV/SCHEDA_021/Docs/SIUT-SIES-PR-1.6-20221125-Piano_di_Rilascio_021_RegInde_SIES.docx
+++ b/MEV/SCHEDA_021/Docs/SIUT-SIES-PR-1.6-20221125-Piano_di_Rilascio_021_RegInde_SIES.docx
@@ -29,7 +29,6 @@
                 <w:lang w:eastAsia="en-US"/>
               </w:rPr>
             </w:pPr>
-            <w:bookmarkStart w:id="0" w:name="_GoBack"/>
             <w:r>
               <w:rPr>
                 <w:rFonts w:asciiTheme="minorHAnsi" w:hAnsiTheme="minorHAnsi" w:cstheme="minorHAnsi"/>
@@ -183,10 +182,10 @@
         </w:tc>
       </w:tr>
     </w:tbl>
-    <w:bookmarkStart w:id="1" w:name="_Hlk14967838" w:displacedByCustomXml="next"/>
-    <w:bookmarkEnd w:id="1" w:displacedByCustomXml="next"/>
+    <w:bookmarkStart w:id="0" w:name="_Hlk14967838" w:displacedByCustomXml="next"/>
+    <w:bookmarkEnd w:id="0" w:displacedByCustomXml="next"/>
+    <w:bookmarkStart w:id="1" w:name="_Hlk15306111" w:displacedByCustomXml="next"/>
     <w:bookmarkStart w:id="2" w:name="_Hlk10713674" w:displacedByCustomXml="next"/>
-    <w:bookmarkStart w:id="3" w:name="_Hlk15306111" w:displacedByCustomXml="next"/>
     <w:sdt>
       <w:sdtPr>
         <w:rPr>
@@ -582,12 +581,12 @@
           <w:lang w:eastAsia="ja-JP"/>
         </w:rPr>
       </w:pPr>
-      <w:bookmarkStart w:id="4" w:name="_Toc520005733"/>
-      <w:bookmarkStart w:id="5" w:name="_Toc419800866"/>
-      <w:bookmarkStart w:id="6" w:name="_Toc12544354"/>
-      <w:bookmarkStart w:id="7" w:name="_Toc21599121"/>
-      <w:bookmarkEnd w:id="3"/>
+      <w:bookmarkStart w:id="3" w:name="_Toc520005733"/>
+      <w:bookmarkStart w:id="4" w:name="_Toc419800866"/>
+      <w:bookmarkStart w:id="5" w:name="_Toc12544354"/>
+      <w:bookmarkStart w:id="6" w:name="_Toc21599121"/>
       <w:bookmarkEnd w:id="2"/>
+      <w:bookmarkEnd w:id="1"/>
     </w:p>
     <w:p>
       <w:pPr>
@@ -704,7 +703,7 @@
         </w:rPr>
         <w:t>”</w:t>
       </w:r>
-      <w:bookmarkStart w:id="8" w:name="_Hlk24008890"/>
+      <w:bookmarkStart w:id="7" w:name="_Hlk24008890"/>
       <w:r>
         <w:rPr>
           <w:rFonts w:asciiTheme="minorHAnsi" w:hAnsiTheme="minorHAnsi" w:cstheme="minorHAnsi"/>
@@ -718,7 +717,7 @@
         </w:rPr>
         <w:t>.</w:t>
       </w:r>
-      <w:bookmarkEnd w:id="8"/>
+      <w:bookmarkEnd w:id="7"/>
     </w:p>
     <w:p>
       <w:pPr>
@@ -1005,7 +1004,7 @@
                 <w:sz w:val="20"/>
               </w:rPr>
             </w:pPr>
-            <w:bookmarkStart w:id="9" w:name="_Hlk10558887"/>
+            <w:bookmarkStart w:id="8" w:name="_Hlk10558887"/>
             <w:r>
               <w:rPr>
                 <w:rFonts w:asciiTheme="minorHAnsi" w:hAnsiTheme="minorHAnsi" w:cstheme="minorHAnsi"/>
@@ -1081,7 +1080,7 @@
           </w:p>
         </w:tc>
       </w:tr>
-      <w:bookmarkEnd w:id="9"/>
+      <w:bookmarkEnd w:id="8"/>
       <w:tr>
         <w:trPr>
           <w:jc w:val="center"/>
@@ -1193,7 +1192,7 @@
                 <w:sz w:val="20"/>
               </w:rPr>
             </w:pPr>
-            <w:bookmarkStart w:id="10" w:name="_Hlk10558793"/>
+            <w:bookmarkStart w:id="9" w:name="_Hlk10558793"/>
             <w:r>
               <w:rPr>
                 <w:rFonts w:asciiTheme="minorHAnsi" w:hAnsiTheme="minorHAnsi" w:cstheme="minorHAnsi"/>
@@ -1304,8 +1303,8 @@
                 <w:sz w:val="20"/>
               </w:rPr>
             </w:pPr>
-            <w:bookmarkStart w:id="11" w:name="_Hlk10558777"/>
-            <w:bookmarkEnd w:id="10"/>
+            <w:bookmarkStart w:id="10" w:name="_Hlk10558777"/>
+            <w:bookmarkEnd w:id="9"/>
             <w:r>
               <w:rPr>
                 <w:rFonts w:asciiTheme="minorHAnsi" w:hAnsiTheme="minorHAnsi" w:cstheme="minorHAnsi"/>
@@ -1361,7 +1360,7 @@
           </w:p>
         </w:tc>
       </w:tr>
-      <w:bookmarkEnd w:id="11"/>
+      <w:bookmarkEnd w:id="10"/>
     </w:tbl>
     <w:p>
       <w:pPr>
@@ -3734,7 +3733,7 @@
         </w:rPr>
         <w:fldChar w:fldCharType="separate"/>
       </w:r>
-      <w:hyperlink w:anchor="_Toc177648683" w:history="1">
+      <w:hyperlink w:anchor="_Toc184987732" w:history="1">
         <w:r>
           <w:rPr>
             <w:rStyle w:val="Collegamentoipertestuale"/>
@@ -3781,7 +3780,7 @@
             <w:noProof/>
             <w:webHidden/>
           </w:rPr>
-          <w:instrText xml:space="preserve"> PAGEREF _Toc177648683 \h </w:instrText>
+          <w:instrText xml:space="preserve"> PAGEREF _Toc184987732 \h </w:instrText>
         </w:r>
         <w:r>
           <w:rPr>
@@ -3826,7 +3825,7 @@
           <w:szCs w:val="22"/>
         </w:rPr>
       </w:pPr>
-      <w:hyperlink w:anchor="_Toc177648684" w:history="1">
+      <w:hyperlink w:anchor="_Toc184987733" w:history="1">
         <w:r>
           <w:rPr>
             <w:rStyle w:val="Collegamentoipertestuale"/>
@@ -3866,7 +3865,7 @@
           <w:rPr>
             <w:webHidden/>
           </w:rPr>
-          <w:instrText xml:space="preserve"> PAGEREF _Toc177648684 \h </w:instrText>
+          <w:instrText xml:space="preserve"> PAGEREF _Toc184987733 \h </w:instrText>
         </w:r>
         <w:r>
           <w:rPr>
@@ -3907,7 +3906,7 @@
           <w:szCs w:val="22"/>
         </w:rPr>
       </w:pPr>
-      <w:hyperlink w:anchor="_Toc177648685" w:history="1">
+      <w:hyperlink w:anchor="_Toc184987734" w:history="1">
         <w:r>
           <w:rPr>
             <w:rStyle w:val="Collegamentoipertestuale"/>
@@ -3947,7 +3946,7 @@
           <w:rPr>
             <w:webHidden/>
           </w:rPr>
-          <w:instrText xml:space="preserve"> PAGEREF _Toc177648685 \h </w:instrText>
+          <w:instrText xml:space="preserve"> PAGEREF _Toc184987734 \h </w:instrText>
         </w:r>
         <w:r>
           <w:rPr>
@@ -3988,7 +3987,7 @@
           <w:szCs w:val="22"/>
         </w:rPr>
       </w:pPr>
-      <w:hyperlink w:anchor="_Toc177648686" w:history="1">
+      <w:hyperlink w:anchor="_Toc184987735" w:history="1">
         <w:r>
           <w:rPr>
             <w:rStyle w:val="Collegamentoipertestuale"/>
@@ -4028,7 +4027,7 @@
           <w:rPr>
             <w:webHidden/>
           </w:rPr>
-          <w:instrText xml:space="preserve"> PAGEREF _Toc177648686 \h </w:instrText>
+          <w:instrText xml:space="preserve"> PAGEREF _Toc184987735 \h </w:instrText>
         </w:r>
         <w:r>
           <w:rPr>
@@ -4069,7 +4068,7 @@
           <w:szCs w:val="22"/>
         </w:rPr>
       </w:pPr>
-      <w:hyperlink w:anchor="_Toc177648687" w:history="1">
+      <w:hyperlink w:anchor="_Toc184987736" w:history="1">
         <w:r>
           <w:rPr>
             <w:rStyle w:val="Collegamentoipertestuale"/>
@@ -4109,7 +4108,7 @@
           <w:rPr>
             <w:webHidden/>
           </w:rPr>
-          <w:instrText xml:space="preserve"> PAGEREF _Toc177648687 \h </w:instrText>
+          <w:instrText xml:space="preserve"> PAGEREF _Toc184987736 \h </w:instrText>
         </w:r>
         <w:r>
           <w:rPr>
@@ -4150,7 +4149,7 @@
           <w:szCs w:val="22"/>
         </w:rPr>
       </w:pPr>
-      <w:hyperlink w:anchor="_Toc177648688" w:history="1">
+      <w:hyperlink w:anchor="_Toc184987737" w:history="1">
         <w:r>
           <w:rPr>
             <w:rStyle w:val="Collegamentoipertestuale"/>
@@ -4190,7 +4189,7 @@
           <w:rPr>
             <w:webHidden/>
           </w:rPr>
-          <w:instrText xml:space="preserve"> PAGEREF _Toc177648688 \h </w:instrText>
+          <w:instrText xml:space="preserve"> PAGEREF _Toc184987737 \h </w:instrText>
         </w:r>
         <w:r>
           <w:rPr>
@@ -4233,7 +4232,7 @@
           <w:szCs w:val="22"/>
         </w:rPr>
       </w:pPr>
-      <w:hyperlink w:anchor="_Toc177648689" w:history="1">
+      <w:hyperlink w:anchor="_Toc184987738" w:history="1">
         <w:r>
           <w:rPr>
             <w:rStyle w:val="Collegamentoipertestuale"/>
@@ -4280,7 +4279,7 @@
             <w:noProof/>
             <w:webHidden/>
           </w:rPr>
-          <w:instrText xml:space="preserve"> PAGEREF _Toc177648689 \h </w:instrText>
+          <w:instrText xml:space="preserve"> PAGEREF _Toc184987738 \h </w:instrText>
         </w:r>
         <w:r>
           <w:rPr>
@@ -4327,7 +4326,7 @@
           <w:szCs w:val="22"/>
         </w:rPr>
       </w:pPr>
-      <w:hyperlink w:anchor="_Toc177648690" w:history="1">
+      <w:hyperlink w:anchor="_Toc184987739" w:history="1">
         <w:r>
           <w:rPr>
             <w:rStyle w:val="Collegamentoipertestuale"/>
@@ -4374,7 +4373,7 @@
             <w:noProof/>
             <w:webHidden/>
           </w:rPr>
-          <w:instrText xml:space="preserve"> PAGEREF _Toc177648690 \h </w:instrText>
+          <w:instrText xml:space="preserve"> PAGEREF _Toc184987739 \h </w:instrText>
         </w:r>
         <w:r>
           <w:rPr>
@@ -4421,7 +4420,7 @@
           <w:szCs w:val="22"/>
         </w:rPr>
       </w:pPr>
-      <w:hyperlink w:anchor="_Toc177648691" w:history="1">
+      <w:hyperlink w:anchor="_Toc184987740" w:history="1">
         <w:r>
           <w:rPr>
             <w:rStyle w:val="Collegamentoipertestuale"/>
@@ -4468,7 +4467,7 @@
             <w:noProof/>
             <w:webHidden/>
           </w:rPr>
-          <w:instrText xml:space="preserve"> PAGEREF _Toc177648691 \h </w:instrText>
+          <w:instrText xml:space="preserve"> PAGEREF _Toc184987740 \h </w:instrText>
         </w:r>
         <w:r>
           <w:rPr>
@@ -4513,7 +4512,7 @@
           <w:szCs w:val="22"/>
         </w:rPr>
       </w:pPr>
-      <w:hyperlink w:anchor="_Toc177648692" w:history="1">
+      <w:hyperlink w:anchor="_Toc184987741" w:history="1">
         <w:r>
           <w:rPr>
             <w:rStyle w:val="Collegamentoipertestuale"/>
@@ -4553,7 +4552,7 @@
           <w:rPr>
             <w:webHidden/>
           </w:rPr>
-          <w:instrText xml:space="preserve"> PAGEREF _Toc177648692 \h </w:instrText>
+          <w:instrText xml:space="preserve"> PAGEREF _Toc184987741 \h </w:instrText>
         </w:r>
         <w:r>
           <w:rPr>
@@ -4594,7 +4593,7 @@
           <w:szCs w:val="22"/>
         </w:rPr>
       </w:pPr>
-      <w:hyperlink w:anchor="_Toc177648693" w:history="1">
+      <w:hyperlink w:anchor="_Toc184987742" w:history="1">
         <w:r>
           <w:rPr>
             <w:rStyle w:val="Collegamentoipertestuale"/>
@@ -4634,7 +4633,7 @@
           <w:rPr>
             <w:webHidden/>
           </w:rPr>
-          <w:instrText xml:space="preserve"> PAGEREF _Toc177648693 \h </w:instrText>
+          <w:instrText xml:space="preserve"> PAGEREF _Toc184987742 \h </w:instrText>
         </w:r>
         <w:r>
           <w:rPr>
@@ -4677,7 +4676,7 @@
           <w:szCs w:val="22"/>
         </w:rPr>
       </w:pPr>
-      <w:hyperlink w:anchor="_Toc177648694" w:history="1">
+      <w:hyperlink w:anchor="_Toc184987743" w:history="1">
         <w:r>
           <w:rPr>
             <w:rStyle w:val="Collegamentoipertestuale"/>
@@ -4724,7 +4723,7 @@
             <w:noProof/>
             <w:webHidden/>
           </w:rPr>
-          <w:instrText xml:space="preserve"> PAGEREF _Toc177648694 \h </w:instrText>
+          <w:instrText xml:space="preserve"> PAGEREF _Toc184987743 \h </w:instrText>
         </w:r>
         <w:r>
           <w:rPr>
@@ -4771,7 +4770,7 @@
           <w:szCs w:val="22"/>
         </w:rPr>
       </w:pPr>
-      <w:hyperlink w:anchor="_Toc177648695" w:history="1">
+      <w:hyperlink w:anchor="_Toc184987744" w:history="1">
         <w:r>
           <w:rPr>
             <w:rStyle w:val="Collegamentoipertestuale"/>
@@ -4818,7 +4817,7 @@
             <w:noProof/>
             <w:webHidden/>
           </w:rPr>
-          <w:instrText xml:space="preserve"> PAGEREF _Toc177648695 \h </w:instrText>
+          <w:instrText xml:space="preserve"> PAGEREF _Toc184987744 \h </w:instrText>
         </w:r>
         <w:r>
           <w:rPr>
@@ -4863,7 +4862,7 @@
           <w:szCs w:val="22"/>
         </w:rPr>
       </w:pPr>
-      <w:hyperlink w:anchor="_Toc177648696" w:history="1">
+      <w:hyperlink w:anchor="_Toc184987745" w:history="1">
         <w:r>
           <w:rPr>
             <w:rStyle w:val="Collegamentoipertestuale"/>
@@ -4903,7 +4902,7 @@
           <w:rPr>
             <w:webHidden/>
           </w:rPr>
-          <w:instrText xml:space="preserve"> PAGEREF _Toc177648696 \h </w:instrText>
+          <w:instrText xml:space="preserve"> PAGEREF _Toc184987745 \h </w:instrText>
         </w:r>
         <w:r>
           <w:rPr>
@@ -4944,7 +4943,7 @@
           <w:szCs w:val="22"/>
         </w:rPr>
       </w:pPr>
-      <w:hyperlink w:anchor="_Toc177648697" w:history="1">
+      <w:hyperlink w:anchor="_Toc184987746" w:history="1">
         <w:r>
           <w:rPr>
             <w:rStyle w:val="Collegamentoipertestuale"/>
@@ -4984,7 +4983,7 @@
           <w:rPr>
             <w:webHidden/>
           </w:rPr>
-          <w:instrText xml:space="preserve"> PAGEREF _Toc177648697 \h </w:instrText>
+          <w:instrText xml:space="preserve"> PAGEREF _Toc184987746 \h </w:instrText>
         </w:r>
         <w:r>
           <w:rPr>
@@ -5025,7 +5024,7 @@
           <w:szCs w:val="22"/>
         </w:rPr>
       </w:pPr>
-      <w:hyperlink w:anchor="_Toc177648698" w:history="1">
+      <w:hyperlink w:anchor="_Toc184987747" w:history="1">
         <w:r>
           <w:rPr>
             <w:rStyle w:val="Collegamentoipertestuale"/>
@@ -5065,7 +5064,7 @@
           <w:rPr>
             <w:webHidden/>
           </w:rPr>
-          <w:instrText xml:space="preserve"> PAGEREF _Toc177648698 \h </w:instrText>
+          <w:instrText xml:space="preserve"> PAGEREF _Toc184987747 \h </w:instrText>
         </w:r>
         <w:r>
           <w:rPr>
@@ -5106,7 +5105,7 @@
           <w:szCs w:val="22"/>
         </w:rPr>
       </w:pPr>
-      <w:hyperlink w:anchor="_Toc177648699" w:history="1">
+      <w:hyperlink w:anchor="_Toc184987748" w:history="1">
         <w:r>
           <w:rPr>
             <w:rStyle w:val="Collegamentoipertestuale"/>
@@ -5146,7 +5145,7 @@
           <w:rPr>
             <w:webHidden/>
           </w:rPr>
-          <w:instrText xml:space="preserve"> PAGEREF _Toc177648699 \h </w:instrText>
+          <w:instrText xml:space="preserve"> PAGEREF _Toc184987748 \h </w:instrText>
         </w:r>
         <w:r>
           <w:rPr>
@@ -5187,7 +5186,7 @@
           <w:szCs w:val="22"/>
         </w:rPr>
       </w:pPr>
-      <w:hyperlink w:anchor="_Toc177648700" w:history="1">
+      <w:hyperlink w:anchor="_Toc184987749" w:history="1">
         <w:r>
           <w:rPr>
             <w:rStyle w:val="Collegamentoipertestuale"/>
@@ -5227,7 +5226,7 @@
           <w:rPr>
             <w:webHidden/>
           </w:rPr>
-          <w:instrText xml:space="preserve"> PAGEREF _Toc177648700 \h </w:instrText>
+          <w:instrText xml:space="preserve"> PAGEREF _Toc184987749 \h </w:instrText>
         </w:r>
         <w:r>
           <w:rPr>
@@ -5268,7 +5267,7 @@
           <w:szCs w:val="22"/>
         </w:rPr>
       </w:pPr>
-      <w:hyperlink w:anchor="_Toc177648701" w:history="1">
+      <w:hyperlink w:anchor="_Toc184987750" w:history="1">
         <w:r>
           <w:rPr>
             <w:rStyle w:val="Collegamentoipertestuale"/>
@@ -5308,7 +5307,7 @@
           <w:rPr>
             <w:webHidden/>
           </w:rPr>
-          <w:instrText xml:space="preserve"> PAGEREF _Toc177648701 \h </w:instrText>
+          <w:instrText xml:space="preserve"> PAGEREF _Toc184987750 \h </w:instrText>
         </w:r>
         <w:r>
           <w:rPr>
@@ -5349,7 +5348,7 @@
           <w:szCs w:val="22"/>
         </w:rPr>
       </w:pPr>
-      <w:hyperlink w:anchor="_Toc177648702" w:history="1">
+      <w:hyperlink w:anchor="_Toc184987751" w:history="1">
         <w:r>
           <w:rPr>
             <w:rStyle w:val="Collegamentoipertestuale"/>
@@ -5389,7 +5388,7 @@
           <w:rPr>
             <w:webHidden/>
           </w:rPr>
-          <w:instrText xml:space="preserve"> PAGEREF _Toc177648702 \h </w:instrText>
+          <w:instrText xml:space="preserve"> PAGEREF _Toc184987751 \h </w:instrText>
         </w:r>
         <w:r>
           <w:rPr>
@@ -5430,7 +5429,7 @@
           <w:szCs w:val="22"/>
         </w:rPr>
       </w:pPr>
-      <w:hyperlink w:anchor="_Toc177648703" w:history="1">
+      <w:hyperlink w:anchor="_Toc184987752" w:history="1">
         <w:r>
           <w:rPr>
             <w:rStyle w:val="Collegamentoipertestuale"/>
@@ -5470,7 +5469,7 @@
           <w:rPr>
             <w:webHidden/>
           </w:rPr>
-          <w:instrText xml:space="preserve"> PAGEREF _Toc177648703 \h </w:instrText>
+          <w:instrText xml:space="preserve"> PAGEREF _Toc184987752 \h </w:instrText>
         </w:r>
         <w:r>
           <w:rPr>
@@ -5511,7 +5510,7 @@
           <w:szCs w:val="22"/>
         </w:rPr>
       </w:pPr>
-      <w:hyperlink w:anchor="_Toc177648704" w:history="1">
+      <w:hyperlink w:anchor="_Toc184987753" w:history="1">
         <w:r>
           <w:rPr>
             <w:rStyle w:val="Collegamentoipertestuale"/>
@@ -5551,7 +5550,7 @@
           <w:rPr>
             <w:webHidden/>
           </w:rPr>
-          <w:instrText xml:space="preserve"> PAGEREF _Toc177648704 \h </w:instrText>
+          <w:instrText xml:space="preserve"> PAGEREF _Toc184987753 \h </w:instrText>
         </w:r>
         <w:r>
           <w:rPr>
@@ -5592,7 +5591,7 @@
           <w:szCs w:val="22"/>
         </w:rPr>
       </w:pPr>
-      <w:hyperlink w:anchor="_Toc177648705" w:history="1">
+      <w:hyperlink w:anchor="_Toc184987754" w:history="1">
         <w:r>
           <w:rPr>
             <w:rStyle w:val="Collegamentoipertestuale"/>
@@ -5632,7 +5631,7 @@
           <w:rPr>
             <w:webHidden/>
           </w:rPr>
-          <w:instrText xml:space="preserve"> PAGEREF _Toc177648705 \h </w:instrText>
+          <w:instrText xml:space="preserve"> PAGEREF _Toc184987754 \h </w:instrText>
         </w:r>
         <w:r>
           <w:rPr>
@@ -5689,7 +5688,7 @@
           <w:szCs w:val="24"/>
         </w:rPr>
       </w:pPr>
-      <w:bookmarkStart w:id="12" w:name="_Hlk10713035"/>
+      <w:bookmarkStart w:id="11" w:name="_Hlk10713035"/>
       <w:r>
         <w:rPr>
           <w:rFonts w:asciiTheme="minorHAnsi" w:hAnsiTheme="minorHAnsi" w:cstheme="minorHAnsi"/>
@@ -5720,10 +5719,10 @@
           <w:szCs w:val="24"/>
         </w:rPr>
       </w:pPr>
-      <w:bookmarkStart w:id="13" w:name="_Toc330316535"/>
-      <w:bookmarkStart w:id="14" w:name="_Toc8205263"/>
-      <w:bookmarkStart w:id="15" w:name="_Toc177648683"/>
-      <w:bookmarkEnd w:id="12"/>
+      <w:bookmarkStart w:id="12" w:name="_Toc330316535"/>
+      <w:bookmarkStart w:id="13" w:name="_Toc8205263"/>
+      <w:bookmarkStart w:id="14" w:name="_Toc184987732"/>
+      <w:bookmarkEnd w:id="11"/>
       <w:r>
         <w:rPr>
           <w:rFonts w:asciiTheme="minorHAnsi" w:hAnsiTheme="minorHAnsi" w:cstheme="minorHAnsi"/>
@@ -5734,9 +5733,9 @@
         <w:lastRenderedPageBreak/>
         <w:t>Introduzione</w:t>
       </w:r>
+      <w:bookmarkEnd w:id="12"/>
       <w:bookmarkEnd w:id="13"/>
       <w:bookmarkEnd w:id="14"/>
-      <w:bookmarkEnd w:id="15"/>
     </w:p>
     <w:p>
       <w:pPr>
@@ -5758,9 +5757,9 @@
           <w:szCs w:val="24"/>
         </w:rPr>
       </w:pPr>
-      <w:bookmarkStart w:id="16" w:name="_Toc330316536"/>
-      <w:bookmarkStart w:id="17" w:name="_Toc8205264"/>
-      <w:bookmarkStart w:id="18" w:name="_Toc177648684"/>
+      <w:bookmarkStart w:id="15" w:name="_Toc330316536"/>
+      <w:bookmarkStart w:id="16" w:name="_Toc8205264"/>
+      <w:bookmarkStart w:id="17" w:name="_Toc184987733"/>
       <w:r>
         <w:rPr>
           <w:rFonts w:asciiTheme="minorHAnsi" w:hAnsiTheme="minorHAnsi" w:cstheme="minorHAnsi"/>
@@ -5769,9 +5768,9 @@
         </w:rPr>
         <w:t>Scopo del documento</w:t>
       </w:r>
+      <w:bookmarkEnd w:id="15"/>
       <w:bookmarkEnd w:id="16"/>
       <w:bookmarkEnd w:id="17"/>
-      <w:bookmarkEnd w:id="18"/>
     </w:p>
     <w:p>
       <w:pPr>
@@ -5922,7 +5921,7 @@
           <w:sz w:val="22"/>
           <w:szCs w:val="22"/>
         </w:rPr>
-        <w:t>12.6.2.0-MEV_2019_021</w:t>
+        <w:t>12.6.4.0-MEV_2019_021</w:t>
       </w:r>
       <w:r>
         <w:rPr>
@@ -6014,8 +6013,8 @@
           <w:szCs w:val="24"/>
         </w:rPr>
       </w:pPr>
-      <w:bookmarkStart w:id="19" w:name="_Toc16251723"/>
-      <w:bookmarkStart w:id="20" w:name="_Toc177648685"/>
+      <w:bookmarkStart w:id="18" w:name="_Toc16251723"/>
+      <w:bookmarkStart w:id="19" w:name="_Toc184987734"/>
       <w:r>
         <w:rPr>
           <w:rFonts w:asciiTheme="minorHAnsi" w:hAnsiTheme="minorHAnsi" w:cstheme="minorHAnsi"/>
@@ -6024,8 +6023,8 @@
         </w:rPr>
         <w:t>Riferimenti</w:t>
       </w:r>
+      <w:bookmarkEnd w:id="18"/>
       <w:bookmarkEnd w:id="19"/>
-      <w:bookmarkEnd w:id="20"/>
     </w:p>
     <w:tbl>
       <w:tblPr>
@@ -6456,7 +6455,7 @@
           <w:szCs w:val="24"/>
         </w:rPr>
       </w:pPr>
-      <w:bookmarkStart w:id="21" w:name="_Toc177648686"/>
+      <w:bookmarkStart w:id="20" w:name="_Toc184987735"/>
       <w:r>
         <w:rPr>
           <w:rFonts w:asciiTheme="minorHAnsi" w:hAnsiTheme="minorHAnsi" w:cstheme="minorHAnsi"/>
@@ -6465,7 +6464,7 @@
         </w:rPr>
         <w:t>Glossario</w:t>
       </w:r>
-      <w:bookmarkEnd w:id="21"/>
+      <w:bookmarkEnd w:id="20"/>
     </w:p>
     <w:p>
       <w:pPr>
@@ -6486,7 +6485,7 @@
           <w:szCs w:val="24"/>
         </w:rPr>
       </w:pPr>
-      <w:bookmarkStart w:id="22" w:name="_Toc177648687"/>
+      <w:bookmarkStart w:id="21" w:name="_Toc184987736"/>
       <w:r>
         <w:rPr>
           <w:rFonts w:asciiTheme="minorHAnsi" w:hAnsiTheme="minorHAnsi" w:cstheme="minorHAnsi"/>
@@ -6495,7 +6494,7 @@
         </w:rPr>
         <w:t>Definizioni</w:t>
       </w:r>
-      <w:bookmarkEnd w:id="22"/>
+      <w:bookmarkEnd w:id="21"/>
     </w:p>
     <w:tbl>
       <w:tblPr>
@@ -6634,7 +6633,7 @@
           <w:szCs w:val="24"/>
         </w:rPr>
       </w:pPr>
-      <w:bookmarkStart w:id="23" w:name="_Toc177648688"/>
+      <w:bookmarkStart w:id="22" w:name="_Toc184987737"/>
       <w:r>
         <w:rPr>
           <w:rFonts w:asciiTheme="minorHAnsi" w:hAnsiTheme="minorHAnsi" w:cstheme="minorHAnsi"/>
@@ -6643,7 +6642,7 @@
         </w:rPr>
         <w:t>Acronimi e abbreviazioni</w:t>
       </w:r>
-      <w:bookmarkEnd w:id="23"/>
+      <w:bookmarkEnd w:id="22"/>
     </w:p>
     <w:tbl>
       <w:tblPr>
@@ -7732,7 +7731,7 @@
           <w:szCs w:val="24"/>
         </w:rPr>
       </w:pPr>
-      <w:bookmarkStart w:id="24" w:name="_Toc177648689"/>
+      <w:bookmarkStart w:id="23" w:name="_Toc184987738"/>
       <w:r>
         <w:rPr>
           <w:rFonts w:asciiTheme="minorHAnsi" w:hAnsiTheme="minorHAnsi" w:cstheme="minorHAnsi"/>
@@ -7743,11 +7742,11 @@
         <w:lastRenderedPageBreak/>
         <w:t>Generalità</w:t>
       </w:r>
+      <w:bookmarkEnd w:id="3"/>
       <w:bookmarkEnd w:id="4"/>
       <w:bookmarkEnd w:id="5"/>
       <w:bookmarkEnd w:id="6"/>
-      <w:bookmarkEnd w:id="7"/>
-      <w:bookmarkEnd w:id="24"/>
+      <w:bookmarkEnd w:id="23"/>
     </w:p>
     <w:p>
       <w:pPr>
@@ -7934,7 +7933,7 @@
           <w:sz w:val="22"/>
           <w:szCs w:val="22"/>
         </w:rPr>
-        <w:t>12.6.2.0</w:t>
+        <w:t>12.6.4.0</w:t>
       </w:r>
       <w:r>
         <w:rPr>
@@ -8010,11 +8009,11 @@
           <w:szCs w:val="24"/>
         </w:rPr>
       </w:pPr>
-      <w:bookmarkStart w:id="25" w:name="_Toc72576995"/>
-      <w:bookmarkStart w:id="26" w:name="_Toc419800867"/>
-      <w:bookmarkStart w:id="27" w:name="_Toc12544355"/>
-      <w:bookmarkStart w:id="28" w:name="_Toc21599122"/>
-      <w:bookmarkStart w:id="29" w:name="_Toc177648690"/>
+      <w:bookmarkStart w:id="24" w:name="_Toc72576995"/>
+      <w:bookmarkStart w:id="25" w:name="_Toc419800867"/>
+      <w:bookmarkStart w:id="26" w:name="_Toc12544355"/>
+      <w:bookmarkStart w:id="27" w:name="_Toc21599122"/>
+      <w:bookmarkStart w:id="28" w:name="_Toc184987739"/>
       <w:r>
         <w:rPr>
           <w:rFonts w:asciiTheme="minorHAnsi" w:hAnsiTheme="minorHAnsi" w:cstheme="minorHAnsi"/>
@@ -8025,11 +8024,11 @@
         <w:lastRenderedPageBreak/>
         <w:t>Identificazione degli elementi rilasciati</w:t>
       </w:r>
+      <w:bookmarkEnd w:id="24"/>
       <w:bookmarkEnd w:id="25"/>
       <w:bookmarkEnd w:id="26"/>
       <w:bookmarkEnd w:id="27"/>
       <w:bookmarkEnd w:id="28"/>
-      <w:bookmarkEnd w:id="29"/>
     </w:p>
     <w:tbl>
       <w:tblPr>
@@ -8240,11 +8239,21 @@
             <w:pPr>
               <w:pStyle w:val="NormTab"/>
             </w:pPr>
-            <w:fldSimple w:instr=" DOCPROPERTY  Versione  \* MERGEFORMAT ">
-              <w:r>
-                <w:t>1.6</w:t>
-              </w:r>
-            </w:fldSimple>
+            <w:r>
+              <w:fldChar w:fldCharType="begin"/>
+            </w:r>
+            <w:r>
+              <w:instrText xml:space="preserve"> DOCPROPERTY  Versione  \* MERGEFORMAT </w:instrText>
+            </w:r>
+            <w:r>
+              <w:fldChar w:fldCharType="separate"/>
+            </w:r>
+            <w:r>
+              <w:t>1.6</w:t>
+            </w:r>
+            <w:r>
+              <w:fldChar w:fldCharType="end"/>
+            </w:r>
           </w:p>
         </w:tc>
         <w:tc>
@@ -8255,11 +8264,21 @@
             <w:pPr>
               <w:pStyle w:val="NormTab"/>
             </w:pPr>
-            <w:fldSimple w:instr=" DOCPROPERTY  &quot;Data Rilascio&quot;  \* MERGEFORMAT ">
-              <w:r>
-                <w:t>25/11/2022</w:t>
-              </w:r>
-            </w:fldSimple>
+            <w:r>
+              <w:fldChar w:fldCharType="begin"/>
+            </w:r>
+            <w:r>
+              <w:instrText xml:space="preserve"> DOCPROPERTY  "Data Rilascio"  \* MERGEFORMAT </w:instrText>
+            </w:r>
+            <w:r>
+              <w:fldChar w:fldCharType="separate"/>
+            </w:r>
+            <w:r>
+              <w:t>25/11/2022</w:t>
+            </w:r>
+            <w:r>
+              <w:fldChar w:fldCharType="end"/>
+            </w:r>
           </w:p>
         </w:tc>
       </w:tr>
@@ -8320,11 +8339,11 @@
           <w:szCs w:val="24"/>
         </w:rPr>
       </w:pPr>
-      <w:bookmarkStart w:id="30" w:name="_Toc72576996"/>
-      <w:bookmarkStart w:id="31" w:name="_Toc419800868"/>
-      <w:bookmarkStart w:id="32" w:name="_Toc12544356"/>
-      <w:bookmarkStart w:id="33" w:name="_Toc21599123"/>
-      <w:bookmarkStart w:id="34" w:name="_Toc177648691"/>
+      <w:bookmarkStart w:id="29" w:name="_Toc72576996"/>
+      <w:bookmarkStart w:id="30" w:name="_Toc419800868"/>
+      <w:bookmarkStart w:id="31" w:name="_Toc12544356"/>
+      <w:bookmarkStart w:id="32" w:name="_Toc21599123"/>
+      <w:bookmarkStart w:id="33" w:name="_Toc184987740"/>
       <w:r>
         <w:rPr>
           <w:rFonts w:asciiTheme="minorHAnsi" w:hAnsiTheme="minorHAnsi" w:cstheme="minorHAnsi"/>
@@ -8335,11 +8354,11 @@
         <w:lastRenderedPageBreak/>
         <w:t>Riferimenti degli oggetti del rilascio</w:t>
       </w:r>
+      <w:bookmarkEnd w:id="29"/>
       <w:bookmarkEnd w:id="30"/>
       <w:bookmarkEnd w:id="31"/>
       <w:bookmarkEnd w:id="32"/>
       <w:bookmarkEnd w:id="33"/>
-      <w:bookmarkEnd w:id="34"/>
     </w:p>
     <w:p>
       <w:pPr>
@@ -8361,11 +8380,11 @@
           <w:szCs w:val="24"/>
         </w:rPr>
       </w:pPr>
-      <w:bookmarkStart w:id="35" w:name="_Toc72576998"/>
-      <w:bookmarkStart w:id="36" w:name="_Toc419800870"/>
-      <w:bookmarkStart w:id="37" w:name="_Ref13214549"/>
-      <w:bookmarkStart w:id="38" w:name="_Toc26961269"/>
-      <w:bookmarkStart w:id="39" w:name="_Toc177648692"/>
+      <w:bookmarkStart w:id="34" w:name="_Toc72576998"/>
+      <w:bookmarkStart w:id="35" w:name="_Toc419800870"/>
+      <w:bookmarkStart w:id="36" w:name="_Ref13214549"/>
+      <w:bookmarkStart w:id="37" w:name="_Toc26961269"/>
+      <w:bookmarkStart w:id="38" w:name="_Toc184987741"/>
       <w:r>
         <w:rPr>
           <w:rFonts w:asciiTheme="minorHAnsi" w:hAnsiTheme="minorHAnsi" w:cstheme="minorHAnsi"/>
@@ -8374,7 +8393,7 @@
         </w:rPr>
         <w:t xml:space="preserve">Riferimenti </w:t>
       </w:r>
-      <w:bookmarkEnd w:id="35"/>
+      <w:bookmarkEnd w:id="34"/>
       <w:r>
         <w:rPr>
           <w:rFonts w:asciiTheme="minorHAnsi" w:hAnsiTheme="minorHAnsi" w:cstheme="minorHAnsi"/>
@@ -8383,11 +8402,11 @@
         </w:rPr>
         <w:t>Anomalia</w:t>
       </w:r>
-      <w:bookmarkStart w:id="40" w:name="_Toc72576999"/>
-      <w:bookmarkStart w:id="41" w:name="_Toc419800871"/>
+      <w:bookmarkStart w:id="39" w:name="_Toc72576999"/>
+      <w:bookmarkStart w:id="40" w:name="_Toc419800871"/>
+      <w:bookmarkEnd w:id="35"/>
       <w:bookmarkEnd w:id="36"/>
       <w:bookmarkEnd w:id="37"/>
-      <w:bookmarkEnd w:id="38"/>
       <w:r>
         <w:rPr>
           <w:rFonts w:asciiTheme="minorHAnsi" w:hAnsiTheme="minorHAnsi" w:cstheme="minorHAnsi"/>
@@ -8412,7 +8431,7 @@
         </w:rPr>
         <w:t>)</w:t>
       </w:r>
-      <w:bookmarkEnd w:id="39"/>
+      <w:bookmarkEnd w:id="38"/>
     </w:p>
     <w:tbl>
       <w:tblPr>
@@ -8781,8 +8800,8 @@
           <w:szCs w:val="24"/>
         </w:rPr>
       </w:pPr>
-      <w:bookmarkStart w:id="42" w:name="_Toc26961270"/>
-      <w:bookmarkStart w:id="43" w:name="_Toc177648693"/>
+      <w:bookmarkStart w:id="41" w:name="_Toc26961270"/>
+      <w:bookmarkStart w:id="42" w:name="_Toc184987742"/>
       <w:r>
         <w:rPr>
           <w:rFonts w:asciiTheme="minorHAnsi" w:hAnsiTheme="minorHAnsi" w:cstheme="minorHAnsi"/>
@@ -8807,7 +8826,7 @@
         </w:rPr>
         <w:t>/MEV)</w:t>
       </w:r>
-      <w:bookmarkEnd w:id="43"/>
+      <w:bookmarkEnd w:id="42"/>
     </w:p>
     <w:tbl>
       <w:tblPr>
@@ -9142,14 +9161,14 @@
           <w:szCs w:val="24"/>
         </w:rPr>
       </w:pPr>
-      <w:bookmarkStart w:id="44" w:name="_Toc72577000"/>
-      <w:bookmarkStart w:id="45" w:name="_Toc419800872"/>
-      <w:bookmarkStart w:id="46" w:name="_Toc12544360"/>
-      <w:bookmarkStart w:id="47" w:name="_Toc21599124"/>
-      <w:bookmarkStart w:id="48" w:name="_Toc177648694"/>
+      <w:bookmarkStart w:id="43" w:name="_Toc72577000"/>
+      <w:bookmarkStart w:id="44" w:name="_Toc419800872"/>
+      <w:bookmarkStart w:id="45" w:name="_Toc12544360"/>
+      <w:bookmarkStart w:id="46" w:name="_Toc21599124"/>
+      <w:bookmarkStart w:id="47" w:name="_Toc184987743"/>
+      <w:bookmarkEnd w:id="39"/>
       <w:bookmarkEnd w:id="40"/>
       <w:bookmarkEnd w:id="41"/>
-      <w:bookmarkEnd w:id="42"/>
       <w:r>
         <w:rPr>
           <w:rFonts w:asciiTheme="minorHAnsi" w:hAnsiTheme="minorHAnsi" w:cstheme="minorHAnsi"/>
@@ -9160,11 +9179,11 @@
         <w:lastRenderedPageBreak/>
         <w:t>Dettaglio degli elementi oggetto del rilascio</w:t>
       </w:r>
+      <w:bookmarkEnd w:id="43"/>
       <w:bookmarkEnd w:id="44"/>
       <w:bookmarkEnd w:id="45"/>
       <w:bookmarkEnd w:id="46"/>
       <w:bookmarkEnd w:id="47"/>
-      <w:bookmarkEnd w:id="48"/>
     </w:p>
     <w:tbl>
       <w:tblPr>
@@ -10283,11 +10302,11 @@
           <w:szCs w:val="24"/>
         </w:rPr>
       </w:pPr>
-      <w:bookmarkStart w:id="49" w:name="_Toc72577001"/>
-      <w:bookmarkStart w:id="50" w:name="_Toc419800873"/>
-      <w:bookmarkStart w:id="51" w:name="_Toc12544361"/>
-      <w:bookmarkStart w:id="52" w:name="_Toc21599125"/>
-      <w:bookmarkStart w:id="53" w:name="_Toc177648695"/>
+      <w:bookmarkStart w:id="48" w:name="_Toc72577001"/>
+      <w:bookmarkStart w:id="49" w:name="_Toc419800873"/>
+      <w:bookmarkStart w:id="50" w:name="_Toc12544361"/>
+      <w:bookmarkStart w:id="51" w:name="_Toc21599125"/>
+      <w:bookmarkStart w:id="52" w:name="_Toc184987744"/>
       <w:r>
         <w:rPr>
           <w:rFonts w:asciiTheme="minorHAnsi" w:hAnsiTheme="minorHAnsi" w:cstheme="minorHAnsi"/>
@@ -10298,11 +10317,11 @@
         <w:lastRenderedPageBreak/>
         <w:t>Installazione</w:t>
       </w:r>
+      <w:bookmarkEnd w:id="48"/>
       <w:bookmarkEnd w:id="49"/>
       <w:bookmarkEnd w:id="50"/>
       <w:bookmarkEnd w:id="51"/>
       <w:bookmarkEnd w:id="52"/>
-      <w:bookmarkEnd w:id="53"/>
     </w:p>
     <w:p>
       <w:pPr>
@@ -10323,8 +10342,8 @@
           <w:szCs w:val="24"/>
         </w:rPr>
       </w:pPr>
-      <w:bookmarkStart w:id="54" w:name="_Toc38010748"/>
-      <w:bookmarkStart w:id="55" w:name="_Toc177648696"/>
+      <w:bookmarkStart w:id="53" w:name="_Toc38010748"/>
+      <w:bookmarkStart w:id="54" w:name="_Toc184987745"/>
       <w:r>
         <w:rPr>
           <w:rFonts w:asciiTheme="minorHAnsi" w:hAnsiTheme="minorHAnsi" w:cstheme="minorHAnsi"/>
@@ -10333,9 +10352,9 @@
         </w:rPr>
         <w:t>Prerequisiti</w:t>
       </w:r>
-      <w:bookmarkStart w:id="56" w:name="_Toc38010749"/>
+      <w:bookmarkStart w:id="55" w:name="_Toc38010749"/>
+      <w:bookmarkEnd w:id="53"/>
       <w:bookmarkEnd w:id="54"/>
-      <w:bookmarkEnd w:id="55"/>
     </w:p>
     <w:p>
       <w:pPr>
@@ -10408,7 +10427,25 @@
           <w:sz w:val="22"/>
           <w:szCs w:val="22"/>
         </w:rPr>
-        <w:t>12.6.2.0</w:t>
+        <w:t>12</w:t>
+      </w:r>
+      <w:bookmarkStart w:id="56" w:name="_GoBack"/>
+      <w:r>
+        <w:rPr>
+          <w:b/>
+          <w:sz w:val="22"/>
+          <w:szCs w:val="22"/>
+        </w:rPr>
+        <w:t>.6.4.</w:t>
+      </w:r>
+      <w:bookmarkEnd w:id="56"/>
+      <w:r>
+        <w:rPr>
+          <w:b/>
+          <w:sz w:val="22"/>
+          <w:szCs w:val="22"/>
+        </w:rPr>
+        <w:t>0</w:t>
       </w:r>
       <w:r>
         <w:rPr>
@@ -10810,8 +10847,8 @@
           <w:szCs w:val="24"/>
         </w:rPr>
       </w:pPr>
-      <w:bookmarkStart w:id="57" w:name="_Toc177648697"/>
-      <w:bookmarkEnd w:id="56"/>
+      <w:bookmarkStart w:id="57" w:name="_Toc184987746"/>
+      <w:bookmarkEnd w:id="55"/>
       <w:r>
         <w:rPr>
           <w:rFonts w:asciiTheme="minorHAnsi" w:hAnsiTheme="minorHAnsi" w:cstheme="minorHAnsi"/>
@@ -11141,7 +11178,7 @@
         </w:rPr>
       </w:pPr>
       <w:bookmarkStart w:id="58" w:name="_Toc27745470"/>
-      <w:bookmarkStart w:id="59" w:name="_Toc177648698"/>
+      <w:bookmarkStart w:id="59" w:name="_Toc184987747"/>
       <w:r>
         <w:rPr>
           <w:rFonts w:asciiTheme="minorHAnsi" w:hAnsiTheme="minorHAnsi" w:cstheme="minorHAnsi"/>
@@ -11636,7 +11673,7 @@
           <w:szCs w:val="24"/>
         </w:rPr>
       </w:pPr>
-      <w:bookmarkStart w:id="60" w:name="_Toc177648699"/>
+      <w:bookmarkStart w:id="60" w:name="_Toc184987748"/>
       <w:r>
         <w:rPr>
           <w:rFonts w:asciiTheme="minorHAnsi" w:hAnsiTheme="minorHAnsi" w:cstheme="minorHAnsi"/>
@@ -12119,7 +12156,7 @@
           <w:szCs w:val="24"/>
         </w:rPr>
       </w:pPr>
-      <w:bookmarkStart w:id="61" w:name="_Toc177648700"/>
+      <w:bookmarkStart w:id="61" w:name="_Toc184987749"/>
       <w:r>
         <w:rPr>
           <w:rFonts w:asciiTheme="minorHAnsi" w:hAnsiTheme="minorHAnsi" w:cstheme="minorHAnsi"/>
@@ -14517,7 +14554,7 @@
           <w:szCs w:val="24"/>
         </w:rPr>
       </w:pPr>
-      <w:bookmarkStart w:id="62" w:name="_Toc177648701"/>
+      <w:bookmarkStart w:id="62" w:name="_Toc184987750"/>
       <w:r>
         <w:rPr>
           <w:rFonts w:asciiTheme="minorHAnsi" w:hAnsiTheme="minorHAnsi" w:cstheme="minorHAnsi"/>
@@ -14641,7 +14678,7 @@
       </w:pPr>
       <w:bookmarkStart w:id="63" w:name="_Toc27745472"/>
       <w:bookmarkStart w:id="64" w:name="_Hlk38463271"/>
-      <w:bookmarkStart w:id="65" w:name="_Toc177648702"/>
+      <w:bookmarkStart w:id="65" w:name="_Toc184987751"/>
       <w:bookmarkEnd w:id="58"/>
       <w:r>
         <w:rPr>
@@ -14678,7 +14715,7 @@
           <w:szCs w:val="24"/>
         </w:rPr>
       </w:pPr>
-      <w:bookmarkStart w:id="66" w:name="_Toc177648703"/>
+      <w:bookmarkStart w:id="66" w:name="_Toc184987752"/>
       <w:bookmarkEnd w:id="64"/>
       <w:r>
         <w:rPr>
@@ -15810,7 +15847,7 @@
           <w:szCs w:val="24"/>
         </w:rPr>
       </w:pPr>
-      <w:bookmarkStart w:id="67" w:name="_Toc177648704"/>
+      <w:bookmarkStart w:id="67" w:name="_Toc184987753"/>
       <w:r>
         <w:rPr>
           <w:rFonts w:asciiTheme="minorHAnsi" w:hAnsiTheme="minorHAnsi" w:cstheme="minorHAnsi"/>
@@ -15864,7 +15901,7 @@
           <w:szCs w:val="24"/>
         </w:rPr>
       </w:pPr>
-      <w:bookmarkStart w:id="68" w:name="_Toc177648705"/>
+      <w:bookmarkStart w:id="68" w:name="_Toc184987754"/>
       <w:r>
         <w:rPr>
           <w:rFonts w:asciiTheme="minorHAnsi" w:hAnsiTheme="minorHAnsi" w:cstheme="minorHAnsi"/>
@@ -15898,7 +15935,6 @@
         </w:rPr>
         <w:t>.</w:t>
       </w:r>
-      <w:bookmarkEnd w:id="0"/>
     </w:p>
     <w:sectPr>
       <w:headerReference w:type="default" r:id="rId10"/>
@@ -16234,7 +16270,7 @@
               <w:sz w:val="16"/>
               <w:szCs w:val="22"/>
             </w:rPr>
-            <w:t>14</w:t>
+            <w:t>10</w:t>
           </w:r>
           <w:r>
             <w:rPr>
@@ -23061,7 +23097,7 @@
 </file>
 
 <file path=customXml/itemProps1.xml><?xml version="1.0" encoding="utf-8"?>
-<ds:datastoreItem xmlns:ds="http://schemas.openxmlformats.org/officeDocument/2006/customXml" ds:itemID="{62F9145A-89B5-448A-BB78-E0C94B754475}">
+<ds:datastoreItem xmlns:ds="http://schemas.openxmlformats.org/officeDocument/2006/customXml" ds:itemID="{34461AD2-E48C-44FA-8570-61835EB16C3E}">
   <ds:schemaRefs>
     <ds:schemaRef ds:uri="http://schemas.openxmlformats.org/officeDocument/2006/bibliography"/>
   </ds:schemaRefs>

</xml_diff>

<commit_message>
Rilascio_20250626-V_S_12.8.0.3 (Patch GAR MEV_021)
</commit_message>
<xml_diff>
--- a/MEV/SCHEDA_021/Docs/SIUT-SIES-PR-1.6-20221125-Piano_di_Rilascio_021_RegInde_SIES.docx
+++ b/MEV/SCHEDA_021/Docs/SIUT-SIES-PR-1.6-20221125-Piano_di_Rilascio_021_RegInde_SIES.docx
@@ -184,8 +184,8 @@
     </w:tbl>
     <w:bookmarkStart w:id="0" w:name="_Hlk14967838" w:displacedByCustomXml="next"/>
     <w:bookmarkEnd w:id="0" w:displacedByCustomXml="next"/>
-    <w:bookmarkStart w:id="1" w:name="_Hlk15306111" w:displacedByCustomXml="next"/>
-    <w:bookmarkStart w:id="2" w:name="_Hlk10713674" w:displacedByCustomXml="next"/>
+    <w:bookmarkStart w:id="1" w:name="_Hlk10713674" w:displacedByCustomXml="next"/>
+    <w:bookmarkStart w:id="2" w:name="_Hlk15306111" w:displacedByCustomXml="next"/>
     <w:sdt>
       <w:sdtPr>
         <w:rPr>
@@ -3733,7 +3733,7 @@
         </w:rPr>
         <w:fldChar w:fldCharType="separate"/>
       </w:r>
-      <w:hyperlink w:anchor="_Toc184987732" w:history="1">
+      <w:hyperlink w:anchor="_Toc194652897" w:history="1">
         <w:r>
           <w:rPr>
             <w:rStyle w:val="Collegamentoipertestuale"/>
@@ -3780,7 +3780,7 @@
             <w:noProof/>
             <w:webHidden/>
           </w:rPr>
-          <w:instrText xml:space="preserve"> PAGEREF _Toc184987732 \h </w:instrText>
+          <w:instrText xml:space="preserve"> PAGEREF _Toc194652897 \h </w:instrText>
         </w:r>
         <w:r>
           <w:rPr>
@@ -3825,7 +3825,7 @@
           <w:szCs w:val="22"/>
         </w:rPr>
       </w:pPr>
-      <w:hyperlink w:anchor="_Toc184987733" w:history="1">
+      <w:hyperlink w:anchor="_Toc194652898" w:history="1">
         <w:r>
           <w:rPr>
             <w:rStyle w:val="Collegamentoipertestuale"/>
@@ -3865,7 +3865,7 @@
           <w:rPr>
             <w:webHidden/>
           </w:rPr>
-          <w:instrText xml:space="preserve"> PAGEREF _Toc184987733 \h </w:instrText>
+          <w:instrText xml:space="preserve"> PAGEREF _Toc194652898 \h </w:instrText>
         </w:r>
         <w:r>
           <w:rPr>
@@ -3906,7 +3906,7 @@
           <w:szCs w:val="22"/>
         </w:rPr>
       </w:pPr>
-      <w:hyperlink w:anchor="_Toc184987734" w:history="1">
+      <w:hyperlink w:anchor="_Toc194652899" w:history="1">
         <w:r>
           <w:rPr>
             <w:rStyle w:val="Collegamentoipertestuale"/>
@@ -3946,7 +3946,7 @@
           <w:rPr>
             <w:webHidden/>
           </w:rPr>
-          <w:instrText xml:space="preserve"> PAGEREF _Toc184987734 \h </w:instrText>
+          <w:instrText xml:space="preserve"> PAGEREF _Toc194652899 \h </w:instrText>
         </w:r>
         <w:r>
           <w:rPr>
@@ -3987,7 +3987,7 @@
           <w:szCs w:val="22"/>
         </w:rPr>
       </w:pPr>
-      <w:hyperlink w:anchor="_Toc184987735" w:history="1">
+      <w:hyperlink w:anchor="_Toc194652900" w:history="1">
         <w:r>
           <w:rPr>
             <w:rStyle w:val="Collegamentoipertestuale"/>
@@ -4027,7 +4027,7 @@
           <w:rPr>
             <w:webHidden/>
           </w:rPr>
-          <w:instrText xml:space="preserve"> PAGEREF _Toc184987735 \h </w:instrText>
+          <w:instrText xml:space="preserve"> PAGEREF _Toc194652900 \h </w:instrText>
         </w:r>
         <w:r>
           <w:rPr>
@@ -4068,7 +4068,7 @@
           <w:szCs w:val="22"/>
         </w:rPr>
       </w:pPr>
-      <w:hyperlink w:anchor="_Toc184987736" w:history="1">
+      <w:hyperlink w:anchor="_Toc194652901" w:history="1">
         <w:r>
           <w:rPr>
             <w:rStyle w:val="Collegamentoipertestuale"/>
@@ -4108,7 +4108,7 @@
           <w:rPr>
             <w:webHidden/>
           </w:rPr>
-          <w:instrText xml:space="preserve"> PAGEREF _Toc184987736 \h </w:instrText>
+          <w:instrText xml:space="preserve"> PAGEREF _Toc194652901 \h </w:instrText>
         </w:r>
         <w:r>
           <w:rPr>
@@ -4149,7 +4149,7 @@
           <w:szCs w:val="22"/>
         </w:rPr>
       </w:pPr>
-      <w:hyperlink w:anchor="_Toc184987737" w:history="1">
+      <w:hyperlink w:anchor="_Toc194652902" w:history="1">
         <w:r>
           <w:rPr>
             <w:rStyle w:val="Collegamentoipertestuale"/>
@@ -4189,7 +4189,7 @@
           <w:rPr>
             <w:webHidden/>
           </w:rPr>
-          <w:instrText xml:space="preserve"> PAGEREF _Toc184987737 \h </w:instrText>
+          <w:instrText xml:space="preserve"> PAGEREF _Toc194652902 \h </w:instrText>
         </w:r>
         <w:r>
           <w:rPr>
@@ -4232,7 +4232,7 @@
           <w:szCs w:val="22"/>
         </w:rPr>
       </w:pPr>
-      <w:hyperlink w:anchor="_Toc184987738" w:history="1">
+      <w:hyperlink w:anchor="_Toc194652903" w:history="1">
         <w:r>
           <w:rPr>
             <w:rStyle w:val="Collegamentoipertestuale"/>
@@ -4279,7 +4279,7 @@
             <w:noProof/>
             <w:webHidden/>
           </w:rPr>
-          <w:instrText xml:space="preserve"> PAGEREF _Toc184987738 \h </w:instrText>
+          <w:instrText xml:space="preserve"> PAGEREF _Toc194652903 \h </w:instrText>
         </w:r>
         <w:r>
           <w:rPr>
@@ -4326,7 +4326,7 @@
           <w:szCs w:val="22"/>
         </w:rPr>
       </w:pPr>
-      <w:hyperlink w:anchor="_Toc184987739" w:history="1">
+      <w:hyperlink w:anchor="_Toc194652904" w:history="1">
         <w:r>
           <w:rPr>
             <w:rStyle w:val="Collegamentoipertestuale"/>
@@ -4373,7 +4373,7 @@
             <w:noProof/>
             <w:webHidden/>
           </w:rPr>
-          <w:instrText xml:space="preserve"> PAGEREF _Toc184987739 \h </w:instrText>
+          <w:instrText xml:space="preserve"> PAGEREF _Toc194652904 \h </w:instrText>
         </w:r>
         <w:r>
           <w:rPr>
@@ -4420,7 +4420,7 @@
           <w:szCs w:val="22"/>
         </w:rPr>
       </w:pPr>
-      <w:hyperlink w:anchor="_Toc184987740" w:history="1">
+      <w:hyperlink w:anchor="_Toc194652905" w:history="1">
         <w:r>
           <w:rPr>
             <w:rStyle w:val="Collegamentoipertestuale"/>
@@ -4467,7 +4467,7 @@
             <w:noProof/>
             <w:webHidden/>
           </w:rPr>
-          <w:instrText xml:space="preserve"> PAGEREF _Toc184987740 \h </w:instrText>
+          <w:instrText xml:space="preserve"> PAGEREF _Toc194652905 \h </w:instrText>
         </w:r>
         <w:r>
           <w:rPr>
@@ -4512,7 +4512,7 @@
           <w:szCs w:val="22"/>
         </w:rPr>
       </w:pPr>
-      <w:hyperlink w:anchor="_Toc184987741" w:history="1">
+      <w:hyperlink w:anchor="_Toc194652906" w:history="1">
         <w:r>
           <w:rPr>
             <w:rStyle w:val="Collegamentoipertestuale"/>
@@ -4552,7 +4552,7 @@
           <w:rPr>
             <w:webHidden/>
           </w:rPr>
-          <w:instrText xml:space="preserve"> PAGEREF _Toc184987741 \h </w:instrText>
+          <w:instrText xml:space="preserve"> PAGEREF _Toc194652906 \h </w:instrText>
         </w:r>
         <w:r>
           <w:rPr>
@@ -4593,7 +4593,7 @@
           <w:szCs w:val="22"/>
         </w:rPr>
       </w:pPr>
-      <w:hyperlink w:anchor="_Toc184987742" w:history="1">
+      <w:hyperlink w:anchor="_Toc194652907" w:history="1">
         <w:r>
           <w:rPr>
             <w:rStyle w:val="Collegamentoipertestuale"/>
@@ -4633,7 +4633,7 @@
           <w:rPr>
             <w:webHidden/>
           </w:rPr>
-          <w:instrText xml:space="preserve"> PAGEREF _Toc184987742 \h </w:instrText>
+          <w:instrText xml:space="preserve"> PAGEREF _Toc194652907 \h </w:instrText>
         </w:r>
         <w:r>
           <w:rPr>
@@ -4676,7 +4676,7 @@
           <w:szCs w:val="22"/>
         </w:rPr>
       </w:pPr>
-      <w:hyperlink w:anchor="_Toc184987743" w:history="1">
+      <w:hyperlink w:anchor="_Toc194652908" w:history="1">
         <w:r>
           <w:rPr>
             <w:rStyle w:val="Collegamentoipertestuale"/>
@@ -4723,7 +4723,7 @@
             <w:noProof/>
             <w:webHidden/>
           </w:rPr>
-          <w:instrText xml:space="preserve"> PAGEREF _Toc184987743 \h </w:instrText>
+          <w:instrText xml:space="preserve"> PAGEREF _Toc194652908 \h </w:instrText>
         </w:r>
         <w:r>
           <w:rPr>
@@ -4770,7 +4770,7 @@
           <w:szCs w:val="22"/>
         </w:rPr>
       </w:pPr>
-      <w:hyperlink w:anchor="_Toc184987744" w:history="1">
+      <w:hyperlink w:anchor="_Toc194652909" w:history="1">
         <w:r>
           <w:rPr>
             <w:rStyle w:val="Collegamentoipertestuale"/>
@@ -4817,7 +4817,7 @@
             <w:noProof/>
             <w:webHidden/>
           </w:rPr>
-          <w:instrText xml:space="preserve"> PAGEREF _Toc184987744 \h </w:instrText>
+          <w:instrText xml:space="preserve"> PAGEREF _Toc194652909 \h </w:instrText>
         </w:r>
         <w:r>
           <w:rPr>
@@ -4862,7 +4862,7 @@
           <w:szCs w:val="22"/>
         </w:rPr>
       </w:pPr>
-      <w:hyperlink w:anchor="_Toc184987745" w:history="1">
+      <w:hyperlink w:anchor="_Toc194652910" w:history="1">
         <w:r>
           <w:rPr>
             <w:rStyle w:val="Collegamentoipertestuale"/>
@@ -4902,7 +4902,7 @@
           <w:rPr>
             <w:webHidden/>
           </w:rPr>
-          <w:instrText xml:space="preserve"> PAGEREF _Toc184987745 \h </w:instrText>
+          <w:instrText xml:space="preserve"> PAGEREF _Toc194652910 \h </w:instrText>
         </w:r>
         <w:r>
           <w:rPr>
@@ -4943,7 +4943,7 @@
           <w:szCs w:val="22"/>
         </w:rPr>
       </w:pPr>
-      <w:hyperlink w:anchor="_Toc184987746" w:history="1">
+      <w:hyperlink w:anchor="_Toc194652911" w:history="1">
         <w:r>
           <w:rPr>
             <w:rStyle w:val="Collegamentoipertestuale"/>
@@ -4983,7 +4983,7 @@
           <w:rPr>
             <w:webHidden/>
           </w:rPr>
-          <w:instrText xml:space="preserve"> PAGEREF _Toc184987746 \h </w:instrText>
+          <w:instrText xml:space="preserve"> PAGEREF _Toc194652911 \h </w:instrText>
         </w:r>
         <w:r>
           <w:rPr>
@@ -5024,7 +5024,7 @@
           <w:szCs w:val="22"/>
         </w:rPr>
       </w:pPr>
-      <w:hyperlink w:anchor="_Toc184987747" w:history="1">
+      <w:hyperlink w:anchor="_Toc194652912" w:history="1">
         <w:r>
           <w:rPr>
             <w:rStyle w:val="Collegamentoipertestuale"/>
@@ -5064,7 +5064,7 @@
           <w:rPr>
             <w:webHidden/>
           </w:rPr>
-          <w:instrText xml:space="preserve"> PAGEREF _Toc184987747 \h </w:instrText>
+          <w:instrText xml:space="preserve"> PAGEREF _Toc194652912 \h </w:instrText>
         </w:r>
         <w:r>
           <w:rPr>
@@ -5105,7 +5105,7 @@
           <w:szCs w:val="22"/>
         </w:rPr>
       </w:pPr>
-      <w:hyperlink w:anchor="_Toc184987748" w:history="1">
+      <w:hyperlink w:anchor="_Toc194652913" w:history="1">
         <w:r>
           <w:rPr>
             <w:rStyle w:val="Collegamentoipertestuale"/>
@@ -5145,7 +5145,7 @@
           <w:rPr>
             <w:webHidden/>
           </w:rPr>
-          <w:instrText xml:space="preserve"> PAGEREF _Toc184987748 \h </w:instrText>
+          <w:instrText xml:space="preserve"> PAGEREF _Toc194652913 \h </w:instrText>
         </w:r>
         <w:r>
           <w:rPr>
@@ -5186,7 +5186,7 @@
           <w:szCs w:val="22"/>
         </w:rPr>
       </w:pPr>
-      <w:hyperlink w:anchor="_Toc184987749" w:history="1">
+      <w:hyperlink w:anchor="_Toc194652914" w:history="1">
         <w:r>
           <w:rPr>
             <w:rStyle w:val="Collegamentoipertestuale"/>
@@ -5226,7 +5226,7 @@
           <w:rPr>
             <w:webHidden/>
           </w:rPr>
-          <w:instrText xml:space="preserve"> PAGEREF _Toc184987749 \h </w:instrText>
+          <w:instrText xml:space="preserve"> PAGEREF _Toc194652914 \h </w:instrText>
         </w:r>
         <w:r>
           <w:rPr>
@@ -5267,7 +5267,7 @@
           <w:szCs w:val="22"/>
         </w:rPr>
       </w:pPr>
-      <w:hyperlink w:anchor="_Toc184987750" w:history="1">
+      <w:hyperlink w:anchor="_Toc194652915" w:history="1">
         <w:r>
           <w:rPr>
             <w:rStyle w:val="Collegamentoipertestuale"/>
@@ -5307,7 +5307,7 @@
           <w:rPr>
             <w:webHidden/>
           </w:rPr>
-          <w:instrText xml:space="preserve"> PAGEREF _Toc184987750 \h </w:instrText>
+          <w:instrText xml:space="preserve"> PAGEREF _Toc194652915 \h </w:instrText>
         </w:r>
         <w:r>
           <w:rPr>
@@ -5348,7 +5348,7 @@
           <w:szCs w:val="22"/>
         </w:rPr>
       </w:pPr>
-      <w:hyperlink w:anchor="_Toc184987751" w:history="1">
+      <w:hyperlink w:anchor="_Toc194652916" w:history="1">
         <w:r>
           <w:rPr>
             <w:rStyle w:val="Collegamentoipertestuale"/>
@@ -5388,7 +5388,7 @@
           <w:rPr>
             <w:webHidden/>
           </w:rPr>
-          <w:instrText xml:space="preserve"> PAGEREF _Toc184987751 \h </w:instrText>
+          <w:instrText xml:space="preserve"> PAGEREF _Toc194652916 \h </w:instrText>
         </w:r>
         <w:r>
           <w:rPr>
@@ -5429,7 +5429,7 @@
           <w:szCs w:val="22"/>
         </w:rPr>
       </w:pPr>
-      <w:hyperlink w:anchor="_Toc184987752" w:history="1">
+      <w:hyperlink w:anchor="_Toc194652917" w:history="1">
         <w:r>
           <w:rPr>
             <w:rStyle w:val="Collegamentoipertestuale"/>
@@ -5469,7 +5469,7 @@
           <w:rPr>
             <w:webHidden/>
           </w:rPr>
-          <w:instrText xml:space="preserve"> PAGEREF _Toc184987752 \h </w:instrText>
+          <w:instrText xml:space="preserve"> PAGEREF _Toc194652917 \h </w:instrText>
         </w:r>
         <w:r>
           <w:rPr>
@@ -5510,7 +5510,7 @@
           <w:szCs w:val="22"/>
         </w:rPr>
       </w:pPr>
-      <w:hyperlink w:anchor="_Toc184987753" w:history="1">
+      <w:hyperlink w:anchor="_Toc194652918" w:history="1">
         <w:r>
           <w:rPr>
             <w:rStyle w:val="Collegamentoipertestuale"/>
@@ -5550,7 +5550,7 @@
           <w:rPr>
             <w:webHidden/>
           </w:rPr>
-          <w:instrText xml:space="preserve"> PAGEREF _Toc184987753 \h </w:instrText>
+          <w:instrText xml:space="preserve"> PAGEREF _Toc194652918 \h </w:instrText>
         </w:r>
         <w:r>
           <w:rPr>
@@ -5591,7 +5591,7 @@
           <w:szCs w:val="22"/>
         </w:rPr>
       </w:pPr>
-      <w:hyperlink w:anchor="_Toc184987754" w:history="1">
+      <w:hyperlink w:anchor="_Toc194652919" w:history="1">
         <w:r>
           <w:rPr>
             <w:rStyle w:val="Collegamentoipertestuale"/>
@@ -5631,7 +5631,7 @@
           <w:rPr>
             <w:webHidden/>
           </w:rPr>
-          <w:instrText xml:space="preserve"> PAGEREF _Toc184987754 \h </w:instrText>
+          <w:instrText xml:space="preserve"> PAGEREF _Toc194652919 \h </w:instrText>
         </w:r>
         <w:r>
           <w:rPr>
@@ -5721,7 +5721,7 @@
       </w:pPr>
       <w:bookmarkStart w:id="12" w:name="_Toc330316535"/>
       <w:bookmarkStart w:id="13" w:name="_Toc8205263"/>
-      <w:bookmarkStart w:id="14" w:name="_Toc184987732"/>
+      <w:bookmarkStart w:id="14" w:name="_Toc194652897"/>
       <w:bookmarkEnd w:id="11"/>
       <w:r>
         <w:rPr>
@@ -5759,7 +5759,7 @@
       </w:pPr>
       <w:bookmarkStart w:id="15" w:name="_Toc330316536"/>
       <w:bookmarkStart w:id="16" w:name="_Toc8205264"/>
-      <w:bookmarkStart w:id="17" w:name="_Toc184987733"/>
+      <w:bookmarkStart w:id="17" w:name="_Toc194652898"/>
       <w:r>
         <w:rPr>
           <w:rFonts w:asciiTheme="minorHAnsi" w:hAnsiTheme="minorHAnsi" w:cstheme="minorHAnsi"/>
@@ -5921,7 +5921,7 @@
           <w:sz w:val="22"/>
           <w:szCs w:val="22"/>
         </w:rPr>
-        <w:t>12.6.4.0-MEV_2019_021</w:t>
+        <w:t>12.7.1.0-MEV_2019_021</w:t>
       </w:r>
       <w:r>
         <w:rPr>
@@ -6014,7 +6014,7 @@
         </w:rPr>
       </w:pPr>
       <w:bookmarkStart w:id="18" w:name="_Toc16251723"/>
-      <w:bookmarkStart w:id="19" w:name="_Toc184987734"/>
+      <w:bookmarkStart w:id="19" w:name="_Toc194652899"/>
       <w:r>
         <w:rPr>
           <w:rFonts w:asciiTheme="minorHAnsi" w:hAnsiTheme="minorHAnsi" w:cstheme="minorHAnsi"/>
@@ -6455,7 +6455,7 @@
           <w:szCs w:val="24"/>
         </w:rPr>
       </w:pPr>
-      <w:bookmarkStart w:id="20" w:name="_Toc184987735"/>
+      <w:bookmarkStart w:id="20" w:name="_Toc194652900"/>
       <w:r>
         <w:rPr>
           <w:rFonts w:asciiTheme="minorHAnsi" w:hAnsiTheme="minorHAnsi" w:cstheme="minorHAnsi"/>
@@ -6485,7 +6485,7 @@
           <w:szCs w:val="24"/>
         </w:rPr>
       </w:pPr>
-      <w:bookmarkStart w:id="21" w:name="_Toc184987736"/>
+      <w:bookmarkStart w:id="21" w:name="_Toc194652901"/>
       <w:r>
         <w:rPr>
           <w:rFonts w:asciiTheme="minorHAnsi" w:hAnsiTheme="minorHAnsi" w:cstheme="minorHAnsi"/>
@@ -6633,7 +6633,7 @@
           <w:szCs w:val="24"/>
         </w:rPr>
       </w:pPr>
-      <w:bookmarkStart w:id="22" w:name="_Toc184987737"/>
+      <w:bookmarkStart w:id="22" w:name="_Toc194652902"/>
       <w:r>
         <w:rPr>
           <w:rFonts w:asciiTheme="minorHAnsi" w:hAnsiTheme="minorHAnsi" w:cstheme="minorHAnsi"/>
@@ -7731,7 +7731,7 @@
           <w:szCs w:val="24"/>
         </w:rPr>
       </w:pPr>
-      <w:bookmarkStart w:id="23" w:name="_Toc184987738"/>
+      <w:bookmarkStart w:id="23" w:name="_Toc194652903"/>
       <w:r>
         <w:rPr>
           <w:rFonts w:asciiTheme="minorHAnsi" w:hAnsiTheme="minorHAnsi" w:cstheme="minorHAnsi"/>
@@ -7933,7 +7933,7 @@
           <w:sz w:val="22"/>
           <w:szCs w:val="22"/>
         </w:rPr>
-        <w:t>12.6.4.0</w:t>
+        <w:t>12.7.1.0</w:t>
       </w:r>
       <w:r>
         <w:rPr>
@@ -8013,7 +8013,7 @@
       <w:bookmarkStart w:id="25" w:name="_Toc419800867"/>
       <w:bookmarkStart w:id="26" w:name="_Toc12544355"/>
       <w:bookmarkStart w:id="27" w:name="_Toc21599122"/>
-      <w:bookmarkStart w:id="28" w:name="_Toc184987739"/>
+      <w:bookmarkStart w:id="28" w:name="_Toc194652904"/>
       <w:r>
         <w:rPr>
           <w:rFonts w:asciiTheme="minorHAnsi" w:hAnsiTheme="minorHAnsi" w:cstheme="minorHAnsi"/>
@@ -8239,21 +8239,11 @@
             <w:pPr>
               <w:pStyle w:val="NormTab"/>
             </w:pPr>
-            <w:r>
-              <w:fldChar w:fldCharType="begin"/>
-            </w:r>
-            <w:r>
-              <w:instrText xml:space="preserve"> DOCPROPERTY  Versione  \* MERGEFORMAT </w:instrText>
-            </w:r>
-            <w:r>
-              <w:fldChar w:fldCharType="separate"/>
-            </w:r>
-            <w:r>
-              <w:t>1.6</w:t>
-            </w:r>
-            <w:r>
-              <w:fldChar w:fldCharType="end"/>
-            </w:r>
+            <w:fldSimple w:instr=" DOCPROPERTY  Versione  \* MERGEFORMAT ">
+              <w:r>
+                <w:t>1.6</w:t>
+              </w:r>
+            </w:fldSimple>
           </w:p>
         </w:tc>
         <w:tc>
@@ -8264,21 +8254,11 @@
             <w:pPr>
               <w:pStyle w:val="NormTab"/>
             </w:pPr>
-            <w:r>
-              <w:fldChar w:fldCharType="begin"/>
-            </w:r>
-            <w:r>
-              <w:instrText xml:space="preserve"> DOCPROPERTY  "Data Rilascio"  \* MERGEFORMAT </w:instrText>
-            </w:r>
-            <w:r>
-              <w:fldChar w:fldCharType="separate"/>
-            </w:r>
-            <w:r>
-              <w:t>25/11/2022</w:t>
-            </w:r>
-            <w:r>
-              <w:fldChar w:fldCharType="end"/>
-            </w:r>
+            <w:fldSimple w:instr=" DOCPROPERTY  &quot;Data Rilascio&quot;  \* MERGEFORMAT ">
+              <w:r>
+                <w:t>25/11/2022</w:t>
+              </w:r>
+            </w:fldSimple>
           </w:p>
         </w:tc>
       </w:tr>
@@ -8343,7 +8323,7 @@
       <w:bookmarkStart w:id="30" w:name="_Toc419800868"/>
       <w:bookmarkStart w:id="31" w:name="_Toc12544356"/>
       <w:bookmarkStart w:id="32" w:name="_Toc21599123"/>
-      <w:bookmarkStart w:id="33" w:name="_Toc184987740"/>
+      <w:bookmarkStart w:id="33" w:name="_Toc194652905"/>
       <w:r>
         <w:rPr>
           <w:rFonts w:asciiTheme="minorHAnsi" w:hAnsiTheme="minorHAnsi" w:cstheme="minorHAnsi"/>
@@ -8384,7 +8364,7 @@
       <w:bookmarkStart w:id="35" w:name="_Toc419800870"/>
       <w:bookmarkStart w:id="36" w:name="_Ref13214549"/>
       <w:bookmarkStart w:id="37" w:name="_Toc26961269"/>
-      <w:bookmarkStart w:id="38" w:name="_Toc184987741"/>
+      <w:bookmarkStart w:id="38" w:name="_Toc194652906"/>
       <w:r>
         <w:rPr>
           <w:rFonts w:asciiTheme="minorHAnsi" w:hAnsiTheme="minorHAnsi" w:cstheme="minorHAnsi"/>
@@ -8801,7 +8781,7 @@
         </w:rPr>
       </w:pPr>
       <w:bookmarkStart w:id="41" w:name="_Toc26961270"/>
-      <w:bookmarkStart w:id="42" w:name="_Toc184987742"/>
+      <w:bookmarkStart w:id="42" w:name="_Toc194652907"/>
       <w:r>
         <w:rPr>
           <w:rFonts w:asciiTheme="minorHAnsi" w:hAnsiTheme="minorHAnsi" w:cstheme="minorHAnsi"/>
@@ -9165,7 +9145,7 @@
       <w:bookmarkStart w:id="44" w:name="_Toc419800872"/>
       <w:bookmarkStart w:id="45" w:name="_Toc12544360"/>
       <w:bookmarkStart w:id="46" w:name="_Toc21599124"/>
-      <w:bookmarkStart w:id="47" w:name="_Toc184987743"/>
+      <w:bookmarkStart w:id="47" w:name="_Toc194652908"/>
       <w:bookmarkEnd w:id="39"/>
       <w:bookmarkEnd w:id="40"/>
       <w:bookmarkEnd w:id="41"/>
@@ -10306,7 +10286,7 @@
       <w:bookmarkStart w:id="49" w:name="_Toc419800873"/>
       <w:bookmarkStart w:id="50" w:name="_Toc12544361"/>
       <w:bookmarkStart w:id="51" w:name="_Toc21599125"/>
-      <w:bookmarkStart w:id="52" w:name="_Toc184987744"/>
+      <w:bookmarkStart w:id="52" w:name="_Toc194652909"/>
       <w:r>
         <w:rPr>
           <w:rFonts w:asciiTheme="minorHAnsi" w:hAnsiTheme="minorHAnsi" w:cstheme="minorHAnsi"/>
@@ -10343,7 +10323,7 @@
         </w:rPr>
       </w:pPr>
       <w:bookmarkStart w:id="53" w:name="_Toc38010748"/>
-      <w:bookmarkStart w:id="54" w:name="_Toc184987745"/>
+      <w:bookmarkStart w:id="54" w:name="_Toc194652910"/>
       <w:r>
         <w:rPr>
           <w:rFonts w:asciiTheme="minorHAnsi" w:hAnsiTheme="minorHAnsi" w:cstheme="minorHAnsi"/>
@@ -10427,7 +10407,7 @@
           <w:sz w:val="22"/>
           <w:szCs w:val="22"/>
         </w:rPr>
-        <w:t>12</w:t>
+        <w:t>12.</w:t>
       </w:r>
       <w:bookmarkStart w:id="56" w:name="_GoBack"/>
       <w:r>
@@ -10436,7 +10416,7 @@
           <w:sz w:val="22"/>
           <w:szCs w:val="22"/>
         </w:rPr>
-        <w:t>.6.4.</w:t>
+        <w:t>7.1</w:t>
       </w:r>
       <w:bookmarkEnd w:id="56"/>
       <w:r>
@@ -10445,7 +10425,7 @@
           <w:sz w:val="22"/>
           <w:szCs w:val="22"/>
         </w:rPr>
-        <w:t>0</w:t>
+        <w:t>.0</w:t>
       </w:r>
       <w:r>
         <w:rPr>
@@ -10847,7 +10827,7 @@
           <w:szCs w:val="24"/>
         </w:rPr>
       </w:pPr>
-      <w:bookmarkStart w:id="57" w:name="_Toc184987746"/>
+      <w:bookmarkStart w:id="57" w:name="_Toc194652911"/>
       <w:bookmarkEnd w:id="55"/>
       <w:r>
         <w:rPr>
@@ -11178,7 +11158,7 @@
         </w:rPr>
       </w:pPr>
       <w:bookmarkStart w:id="58" w:name="_Toc27745470"/>
-      <w:bookmarkStart w:id="59" w:name="_Toc184987747"/>
+      <w:bookmarkStart w:id="59" w:name="_Toc194652912"/>
       <w:r>
         <w:rPr>
           <w:rFonts w:asciiTheme="minorHAnsi" w:hAnsiTheme="minorHAnsi" w:cstheme="minorHAnsi"/>
@@ -11673,7 +11653,7 @@
           <w:szCs w:val="24"/>
         </w:rPr>
       </w:pPr>
-      <w:bookmarkStart w:id="60" w:name="_Toc184987748"/>
+      <w:bookmarkStart w:id="60" w:name="_Toc194652913"/>
       <w:r>
         <w:rPr>
           <w:rFonts w:asciiTheme="minorHAnsi" w:hAnsiTheme="minorHAnsi" w:cstheme="minorHAnsi"/>
@@ -12156,7 +12136,7 @@
           <w:szCs w:val="24"/>
         </w:rPr>
       </w:pPr>
-      <w:bookmarkStart w:id="61" w:name="_Toc184987749"/>
+      <w:bookmarkStart w:id="61" w:name="_Toc194652914"/>
       <w:r>
         <w:rPr>
           <w:rFonts w:asciiTheme="minorHAnsi" w:hAnsiTheme="minorHAnsi" w:cstheme="minorHAnsi"/>
@@ -14554,7 +14534,7 @@
           <w:szCs w:val="24"/>
         </w:rPr>
       </w:pPr>
-      <w:bookmarkStart w:id="62" w:name="_Toc184987750"/>
+      <w:bookmarkStart w:id="62" w:name="_Toc194652915"/>
       <w:r>
         <w:rPr>
           <w:rFonts w:asciiTheme="minorHAnsi" w:hAnsiTheme="minorHAnsi" w:cstheme="minorHAnsi"/>
@@ -14678,7 +14658,7 @@
       </w:pPr>
       <w:bookmarkStart w:id="63" w:name="_Toc27745472"/>
       <w:bookmarkStart w:id="64" w:name="_Hlk38463271"/>
-      <w:bookmarkStart w:id="65" w:name="_Toc184987751"/>
+      <w:bookmarkStart w:id="65" w:name="_Toc194652916"/>
       <w:bookmarkEnd w:id="58"/>
       <w:r>
         <w:rPr>
@@ -14715,7 +14695,7 @@
           <w:szCs w:val="24"/>
         </w:rPr>
       </w:pPr>
-      <w:bookmarkStart w:id="66" w:name="_Toc184987752"/>
+      <w:bookmarkStart w:id="66" w:name="_Toc194652917"/>
       <w:bookmarkEnd w:id="64"/>
       <w:r>
         <w:rPr>
@@ -15847,7 +15827,7 @@
           <w:szCs w:val="24"/>
         </w:rPr>
       </w:pPr>
-      <w:bookmarkStart w:id="67" w:name="_Toc184987753"/>
+      <w:bookmarkStart w:id="67" w:name="_Toc194652918"/>
       <w:r>
         <w:rPr>
           <w:rFonts w:asciiTheme="minorHAnsi" w:hAnsiTheme="minorHAnsi" w:cstheme="minorHAnsi"/>
@@ -15901,7 +15881,7 @@
           <w:szCs w:val="24"/>
         </w:rPr>
       </w:pPr>
-      <w:bookmarkStart w:id="68" w:name="_Toc184987754"/>
+      <w:bookmarkStart w:id="68" w:name="_Toc194652919"/>
       <w:r>
         <w:rPr>
           <w:rFonts w:asciiTheme="minorHAnsi" w:hAnsiTheme="minorHAnsi" w:cstheme="minorHAnsi"/>
@@ -23097,7 +23077,7 @@
 </file>
 
 <file path=customXml/itemProps1.xml><?xml version="1.0" encoding="utf-8"?>
-<ds:datastoreItem xmlns:ds="http://schemas.openxmlformats.org/officeDocument/2006/customXml" ds:itemID="{34461AD2-E48C-44FA-8570-61835EB16C3E}">
+<ds:datastoreItem xmlns:ds="http://schemas.openxmlformats.org/officeDocument/2006/customXml" ds:itemID="{BA5D3BA1-023A-4E9B-A443-48E2C1116C0C}">
   <ds:schemaRefs>
     <ds:schemaRef ds:uri="http://schemas.openxmlformats.org/officeDocument/2006/bibliography"/>
   </ds:schemaRefs>

</xml_diff>